<commit_message>
Replace beginner projects with job-ready SaaS, AI, and analytics demos on CV and portfolio.
Co-authored-by: Cursor <cursoragent@cursor.com>
</commit_message>
<xml_diff>
--- a/Nauroz_Salim_CV.docx
+++ b/Nauroz_Salim_CV.docx
@@ -5,7 +5,6 @@
     <w:tbl>
       <w:tblPr>
         <w:tblW w:type="auto" w:w="0"/>
-        <w:tblLayout w:type="autofit"/>
         <w:tblLook w:firstColumn="1" w:firstRow="1" w:lastColumn="0" w:lastRow="0" w:noHBand="0" w:noVBand="1" w:val="04A0"/>
       </w:tblPr>
       <w:tblGrid>
@@ -59,9 +58,6 @@
             <w:tcW w:type="dxa" w:w="7920"/>
           </w:tcPr>
           <w:p>
-            <w:pPr>
-              <w:spacing w:after="40"/>
-            </w:pPr>
             <w:r>
               <w:rPr>
                 <w:rFonts w:ascii="Georgia" w:hAnsi="Georgia" w:eastAsia="Georgia"/>
@@ -73,9 +69,6 @@
             </w:r>
           </w:p>
           <w:p>
-            <w:pPr>
-              <w:spacing w:before="0" w:after="40"/>
-            </w:pPr>
             <w:r>
               <w:rPr>
                 <w:rFonts w:ascii="Calibri" w:hAnsi="Calibri" w:eastAsia="Calibri"/>
@@ -87,78 +80,6 @@
             </w:r>
           </w:p>
           <w:p>
-            <w:pPr>
-              <w:spacing w:before="0" w:after="0"/>
-            </w:pPr>
-            <w:r>
-              <w:rPr>
-                <w:rFonts w:ascii="Calibri" w:hAnsi="Calibri" w:eastAsia="Calibri"/>
-                <w:b/>
-                <w:color w:val="16324F"/>
-                <w:sz w:val="20"/>
-              </w:rPr>
-              <w:t>LinkedIn</w:t>
-            </w:r>
-            <w:r>
-              <w:rPr>
-                <w:rFonts w:ascii="Calibri" w:hAnsi="Calibri" w:eastAsia="Calibri"/>
-                <w:b w:val="0"/>
-                <w:color w:val="4A5C70"/>
-                <w:sz w:val="20"/>
-              </w:rPr>
-              <w:t xml:space="preserve"> · </w:t>
-            </w:r>
-            <w:r>
-              <w:rPr>
-                <w:rFonts w:ascii="Calibri" w:hAnsi="Calibri" w:eastAsia="Calibri"/>
-                <w:b/>
-                <w:color w:val="16324F"/>
-                <w:sz w:val="20"/>
-              </w:rPr>
-              <w:t>GitHub</w:t>
-            </w:r>
-            <w:r>
-              <w:rPr>
-                <w:rFonts w:ascii="Calibri" w:hAnsi="Calibri" w:eastAsia="Calibri"/>
-                <w:b w:val="0"/>
-                <w:color w:val="4A5C70"/>
-                <w:sz w:val="20"/>
-              </w:rPr>
-              <w:t xml:space="preserve"> · </w:t>
-            </w:r>
-            <w:r>
-              <w:rPr>
-                <w:rFonts w:ascii="Calibri" w:hAnsi="Calibri" w:eastAsia="Calibri"/>
-                <w:b/>
-                <w:color w:val="16324F"/>
-                <w:sz w:val="20"/>
-              </w:rPr>
-              <w:t>Portfolio</w:t>
-            </w:r>
-            <w:r>
-              <w:rPr>
-                <w:rFonts w:ascii="Calibri" w:hAnsi="Calibri" w:eastAsia="Calibri"/>
-                <w:b w:val="0"/>
-                <w:color w:val="4A5C70"/>
-                <w:sz w:val="20"/>
-              </w:rPr>
-              <w:t xml:space="preserve"> · </w:t>
-            </w:r>
-            <w:r>
-              <w:rPr>
-                <w:rFonts w:ascii="Calibri" w:hAnsi="Calibri" w:eastAsia="Calibri"/>
-                <w:b/>
-                <w:color w:val="16324F"/>
-                <w:sz w:val="20"/>
-              </w:rPr>
-              <w:t>Online CV</w:t>
-            </w:r>
-            <w:r/>
-          </w:p>
-          <w:p>
-            <w:pPr>
-              <w:spacing w:before="40"/>
-            </w:pPr>
             <w:r>
               <w:rPr>
                 <w:rFonts w:ascii="Calibri" w:hAnsi="Calibri" w:eastAsia="Calibri"/>
@@ -190,9 +111,6 @@
       </w:r>
     </w:p>
     <w:p>
-      <w:pPr>
-        <w:spacing w:after="120"/>
-      </w:pPr>
       <w:r>
         <w:rPr>
           <w:rFonts w:ascii="Calibri" w:hAnsi="Calibri" w:eastAsia="Calibri"/>
@@ -200,7 +118,7 @@
           <w:color w:val="4A5C70"/>
           <w:sz w:val="22"/>
         </w:rPr>
-        <w:t>Computer Engineering student and aspiring web developer specializing in responsive, user-friendly web applications. Skilled in HTML, CSS, JavaScript, React, Node.js, and Python. Builds projects that solve real-world problems and is eager to contribute to professional development teams.</w:t>
+        <w:t>Computer Engineering student and aspiring web developer specializing in responsive, user-friendly web applications. Skilled in HTML, CSS, JavaScript, React, Node.js, and Python. Builds job-ready projects around SaaS workflows, AI-assisted tools, and data dashboards.</w:t>
       </w:r>
     </w:p>
     <w:p>
@@ -245,7 +163,7 @@
     </w:p>
     <w:p>
       <w:pPr>
-        <w:spacing w:before="0" w:after="0"/>
+        <w:spacing w:before="0"/>
       </w:pPr>
       <w:r>
         <w:rPr>
@@ -259,7 +177,7 @@
     </w:p>
     <w:p>
       <w:pPr>
-        <w:spacing w:before="0" w:after="40"/>
+        <w:spacing w:before="0"/>
       </w:pPr>
       <w:r>
         <w:rPr>
@@ -296,7 +214,7 @@
     </w:p>
     <w:p>
       <w:pPr>
-        <w:spacing w:before="0" w:after="0"/>
+        <w:spacing w:before="0"/>
       </w:pPr>
       <w:r>
         <w:rPr>
@@ -333,7 +251,7 @@
     </w:p>
     <w:p>
       <w:pPr>
-        <w:spacing w:before="0" w:after="0"/>
+        <w:spacing w:before="0"/>
       </w:pPr>
       <w:r>
         <w:rPr>
@@ -372,7 +290,7 @@
           <w:b/>
           <w:sz w:val="24"/>
         </w:rPr>
-        <w:t>E-Commerce Product Catalog</w:t>
+        <w:t>Job Application Tracker</w:t>
       </w:r>
       <w:r>
         <w:rPr>
@@ -382,12 +300,12 @@
           <w:sz w:val="18"/>
         </w:rPr>
         <w:tab/>
-        <w:t>HTML · CSS · JavaScript · API</w:t>
+        <w:t>JavaScript · LocalStorage · CRUD · SaaS UI</w:t>
       </w:r>
     </w:p>
     <w:p>
       <w:pPr>
-        <w:spacing w:before="20" w:after="0"/>
+        <w:spacing w:before="20"/>
       </w:pPr>
       <w:r>
         <w:rPr>
@@ -396,12 +314,12 @@
           <w:color w:val="4A5C70"/>
           <w:sz w:val="20"/>
         </w:rPr>
-        <w:t>Product catalog that loads data from an API, with search and category filtering for a smooth shopping experience.</w:t>
+        <w:t>Hiring-pipeline tracker for internships and junior roles with status workflows, KPI cards, and persistent storage.</w:t>
       </w:r>
     </w:p>
     <w:p>
       <w:pPr>
-        <w:spacing w:before="20" w:after="40"/>
+        <w:spacing w:before="20"/>
       </w:pPr>
       <w:r>
         <w:rPr>
@@ -410,7 +328,7 @@
           <w:color w:val="16324F"/>
           <w:sz w:val="18"/>
         </w:rPr>
-        <w:t>https://navrozsalim.github.io/Ecommerence-Catlog/</w:t>
+        <w:t>https://navrozsalim.github.io/Portfolio/projects/job-tracker.html</w:t>
       </w:r>
     </w:p>
     <w:p>
@@ -423,7 +341,7 @@
           <w:b/>
           <w:sz w:val="24"/>
         </w:rPr>
-        <w:t>To-Do List Web App</w:t>
+        <w:t>AI Resume Feedback Tool</w:t>
       </w:r>
       <w:r>
         <w:rPr>
@@ -433,12 +351,12 @@
           <w:sz w:val="18"/>
         </w:rPr>
         <w:tab/>
-        <w:t>HTML · CSS · JavaScript · LocalStorage</w:t>
+        <w:t>JavaScript · Keyword Intelligence · ATS coaching</w:t>
       </w:r>
     </w:p>
     <w:p>
       <w:pPr>
-        <w:spacing w:before="20" w:after="0"/>
+        <w:spacing w:before="20"/>
       </w:pPr>
       <w:r>
         <w:rPr>
@@ -447,12 +365,12 @@
           <w:color w:val="4A5C70"/>
           <w:sz w:val="20"/>
         </w:rPr>
-        <w:t>Dynamic to-do list with add, edit, and delete, and persistent data storage in the browser.</w:t>
+        <w:t>Interactive resume analyzer that scores text against target roles, flags missing ATS keywords, and suggests fixes.</w:t>
       </w:r>
     </w:p>
     <w:p>
       <w:pPr>
-        <w:spacing w:before="20" w:after="40"/>
+        <w:spacing w:before="20"/>
       </w:pPr>
       <w:r>
         <w:rPr>
@@ -461,7 +379,7 @@
           <w:color w:val="16324F"/>
           <w:sz w:val="18"/>
         </w:rPr>
-        <w:t>https://navrozsalim.github.io/Todo-list/</w:t>
+        <w:t>https://navrozsalim.github.io/Portfolio/projects/ai-resume-assistant.html</w:t>
       </w:r>
     </w:p>
     <w:p>
@@ -474,7 +392,7 @@
           <w:b/>
           <w:sz w:val="24"/>
         </w:rPr>
-        <w:t>Weather App</w:t>
+        <w:t>E-Commerce Analytics Dashboard</w:t>
       </w:r>
       <w:r>
         <w:rPr>
@@ -484,12 +402,12 @@
           <w:sz w:val="18"/>
         </w:rPr>
         <w:tab/>
-        <w:t>JavaScript · OpenWeather API</w:t>
+        <w:t>JavaScript · Chart.js · REST API · Data Viz</w:t>
       </w:r>
     </w:p>
     <w:p>
       <w:pPr>
-        <w:spacing w:before="20" w:after="0"/>
+        <w:spacing w:before="20"/>
       </w:pPr>
       <w:r>
         <w:rPr>
@@ -498,12 +416,12 @@
           <w:color w:val="4A5C70"/>
           <w:sz w:val="20"/>
         </w:rPr>
-        <w:t>Fetches and displays real-time weather for any city with responsive design and API integration.</w:t>
+        <w:t>Business dashboard with revenue trends, category charts, KPIs, and top products from a live API.</w:t>
       </w:r>
     </w:p>
     <w:p>
       <w:pPr>
-        <w:spacing w:before="20" w:after="40"/>
+        <w:spacing w:before="20"/>
       </w:pPr>
       <w:r>
         <w:rPr>
@@ -512,7 +430,7 @@
           <w:color w:val="16324F"/>
           <w:sz w:val="18"/>
         </w:rPr>
-        <w:t>https://navrozsalim.github.io/Weather-Checker/</w:t>
+        <w:t>https://navrozsalim.github.io/Portfolio/projects/analytics-dashboard.html</w:t>
       </w:r>
     </w:p>
     <w:p>
@@ -533,9 +451,6 @@
       </w:r>
     </w:p>
     <w:p>
-      <w:pPr>
-        <w:spacing w:before="80"/>
-      </w:pPr>
       <w:r>
         <w:rPr>
           <w:rFonts w:ascii="Calibri" w:hAnsi="Calibri" w:eastAsia="Calibri"/>
@@ -543,7 +458,7 @@
           <w:color w:val="0F1C2E"/>
           <w:sz w:val="22"/>
         </w:rPr>
-        <w:t>HTML, CSS, JavaScript  ·  React, Node.js  ·  Python  ·  Responsive Web Design  ·  API Integration  ·  Git &amp; GitHub</w:t>
+        <w:t>HTML, CSS, JavaScript  ·  React, Node.js  ·  Python  ·  REST APIs &amp; JSON  ·  Dashboards &amp; Chart.js  ·  Responsive Web Design  ·  Git &amp; GitHub</w:t>
       </w:r>
     </w:p>
     <w:sectPr>

</xml_diff>

<commit_message>
Sync projects: keep Catalog and Weather, drop Todo, CV descriptions only, portfolio with links.
Co-authored-by: Cursor <cursoragent@cursor.com>
</commit_message>
<xml_diff>
--- a/Nauroz_Salim_CV.docx
+++ b/Nauroz_Salim_CV.docx
@@ -300,7 +300,7 @@
           <w:sz w:val="18"/>
         </w:rPr>
         <w:tab/>
-        <w:t>JavaScript · LocalStorage · CRUD · SaaS UI</w:t>
+        <w:t>JavaScript · LocalStorage · CRUD</w:t>
       </w:r>
     </w:p>
     <w:p>
@@ -314,21 +314,7 @@
           <w:color w:val="4A5C70"/>
           <w:sz w:val="20"/>
         </w:rPr>
-        <w:t>Hiring-pipeline tracker for internships and junior roles with status workflows, KPI cards, and persistent storage.</w:t>
-      </w:r>
-    </w:p>
-    <w:p>
-      <w:pPr>
-        <w:spacing w:before="20"/>
-      </w:pPr>
-      <w:r>
-        <w:rPr>
-          <w:rFonts w:ascii="Calibri" w:hAnsi="Calibri" w:eastAsia="Calibri"/>
-          <w:b w:val="0"/>
-          <w:color w:val="16324F"/>
-          <w:sz w:val="18"/>
-        </w:rPr>
-        <w:t>https://navrozsalim.github.io/Portfolio/projects/job-tracker.html</w:t>
+        <w:t>Tracks internship and junior job applications through a status pipeline (Applied, Interview, Offer, Rejected), with KPI summaries and saved progress in the browser.</w:t>
       </w:r>
     </w:p>
     <w:p>
@@ -351,7 +337,7 @@
           <w:sz w:val="18"/>
         </w:rPr>
         <w:tab/>
-        <w:t>JavaScript · Keyword Intelligence · ATS coaching</w:t>
+        <w:t>JavaScript · ATS Keyword Analysis</w:t>
       </w:r>
     </w:p>
     <w:p>
@@ -365,21 +351,7 @@
           <w:color w:val="4A5C70"/>
           <w:sz w:val="20"/>
         </w:rPr>
-        <w:t>Interactive resume analyzer that scores text against target roles, flags missing ATS keywords, and suggests fixes.</w:t>
-      </w:r>
-    </w:p>
-    <w:p>
-      <w:pPr>
-        <w:spacing w:before="20"/>
-      </w:pPr>
-      <w:r>
-        <w:rPr>
-          <w:rFonts w:ascii="Calibri" w:hAnsi="Calibri" w:eastAsia="Calibri"/>
-          <w:b w:val="0"/>
-          <w:color w:val="16324F"/>
-          <w:sz w:val="18"/>
-        </w:rPr>
-        <w:t>https://navrozsalim.github.io/Portfolio/projects/ai-resume-assistant.html</w:t>
+        <w:t>Analyzes pasted resume text against a target role, scores keyword match strength, and suggests concrete improvements for ATS-friendly applications.</w:t>
       </w:r>
     </w:p>
     <w:p>
@@ -402,7 +374,7 @@
           <w:sz w:val="18"/>
         </w:rPr>
         <w:tab/>
-        <w:t>JavaScript · Chart.js · REST API · Data Viz</w:t>
+        <w:t>JavaScript · Chart.js · REST API</w:t>
       </w:r>
     </w:p>
     <w:p>
@@ -416,7 +388,30 @@
           <w:color w:val="4A5C70"/>
           <w:sz w:val="20"/>
         </w:rPr>
-        <w:t>Business dashboard with revenue trends, category charts, KPIs, and top products from a live API.</w:t>
+        <w:t>Shows store performance with revenue trends, category charts, KPI cards, and a top-products table powered by live product API data.</w:t>
+      </w:r>
+    </w:p>
+    <w:p>
+      <w:pPr>
+        <w:spacing w:before="160" w:after="0"/>
+      </w:pPr>
+      <w:r>
+        <w:rPr>
+          <w:rFonts w:ascii="Calibri" w:hAnsi="Calibri" w:eastAsia="Calibri"/>
+          <w:b/>
+          <w:sz w:val="24"/>
+        </w:rPr>
+        <w:t>E-Commerce Product Catalog</w:t>
+      </w:r>
+      <w:r>
+        <w:rPr>
+          <w:rFonts w:ascii="Calibri" w:hAnsi="Calibri" w:eastAsia="Calibri"/>
+          <w:b w:val="0"/>
+          <w:color w:val="4A5C70"/>
+          <w:sz w:val="18"/>
+        </w:rPr>
+        <w:tab/>
+        <w:t>HTML · CSS · JavaScript · API</w:t>
       </w:r>
     </w:p>
     <w:p>
@@ -427,10 +422,47 @@
         <w:rPr>
           <w:rFonts w:ascii="Calibri" w:hAnsi="Calibri" w:eastAsia="Calibri"/>
           <w:b w:val="0"/>
-          <w:color w:val="16324F"/>
+          <w:color w:val="4A5C70"/>
+          <w:sz w:val="20"/>
+        </w:rPr>
+        <w:t>Displays products from an API with search and category filtering so users can browse items quickly in a responsive shopping-style layout.</w:t>
+      </w:r>
+    </w:p>
+    <w:p>
+      <w:pPr>
+        <w:spacing w:before="160" w:after="0"/>
+      </w:pPr>
+      <w:r>
+        <w:rPr>
+          <w:rFonts w:ascii="Calibri" w:hAnsi="Calibri" w:eastAsia="Calibri"/>
+          <w:b/>
+          <w:sz w:val="24"/>
+        </w:rPr>
+        <w:t>Weather App</w:t>
+      </w:r>
+      <w:r>
+        <w:rPr>
+          <w:rFonts w:ascii="Calibri" w:hAnsi="Calibri" w:eastAsia="Calibri"/>
+          <w:b w:val="0"/>
+          <w:color w:val="4A5C70"/>
           <w:sz w:val="18"/>
         </w:rPr>
-        <w:t>https://navrozsalim.github.io/Portfolio/projects/analytics-dashboard.html</w:t>
+        <w:tab/>
+        <w:t>JavaScript · OpenWeather API</w:t>
+      </w:r>
+    </w:p>
+    <w:p>
+      <w:pPr>
+        <w:spacing w:before="20"/>
+      </w:pPr>
+      <w:r>
+        <w:rPr>
+          <w:rFonts w:ascii="Calibri" w:hAnsi="Calibri" w:eastAsia="Calibri"/>
+          <w:b w:val="0"/>
+          <w:color w:val="4A5C70"/>
+          <w:sz w:val="20"/>
+        </w:rPr>
+        <w:t>Fetches and displays real-time weather for any city, including conditions and temperature, with a clean responsive interface.</w:t>
       </w:r>
     </w:p>
     <w:p>

</xml_diff>

<commit_message>
Rewrite CV around real work projects and keep Digital ID Card off the portfolio.
Co-authored-by: Cursor <cursoragent@cursor.com>
</commit_message>
<xml_diff>
--- a/Nauroz_Salim_CV.docx
+++ b/Nauroz_Salim_CV.docx
@@ -8,19 +8,19 @@
         <w:tblLook w:firstColumn="1" w:firstRow="1" w:lastColumn="0" w:lastRow="0" w:noHBand="0" w:noVBand="1" w:val="04A0"/>
       </w:tblPr>
       <w:tblGrid>
-        <w:gridCol w:w="5040"/>
-        <w:gridCol w:w="5040"/>
+        <w:gridCol w:w="5112"/>
+        <w:gridCol w:w="5112"/>
       </w:tblGrid>
       <w:tr>
         <w:tc>
           <w:tcPr>
-            <w:tcW w:type="dxa" w:w="1944"/>
+            <w:tcW w:type="dxa" w:w="1872"/>
           </w:tcPr>
           <w:p>
             <w:r>
               <w:drawing>
                 <wp:inline xmlns:a="http://schemas.openxmlformats.org/drawingml/2006/main" xmlns:pic="http://schemas.openxmlformats.org/drawingml/2006/picture">
-                  <wp:extent cx="1051560" cy="1578326"/>
+                  <wp:extent cx="1005840" cy="1509704"/>
                   <wp:docPr id="1" name="Picture 1"/>
                   <wp:cNvGraphicFramePr>
                     <a:graphicFrameLocks noChangeAspect="1"/>
@@ -41,7 +41,7 @@
                         <pic:spPr>
                           <a:xfrm>
                             <a:off x="0" y="0"/>
-                            <a:ext cx="1051560" cy="1578326"/>
+                            <a:ext cx="1005840" cy="1509704"/>
                           </a:xfrm>
                           <a:prstGeom prst="rect"/>
                         </pic:spPr>
@@ -55,7 +55,7 @@
         </w:tc>
         <w:tc>
           <w:tcPr>
-            <w:tcW w:type="dxa" w:w="7920"/>
+            <w:tcW w:type="dxa" w:w="8064"/>
           </w:tcPr>
           <w:p>
             <w:r>
@@ -63,7 +63,7 @@
                 <w:rFonts w:ascii="Georgia" w:hAnsi="Georgia" w:eastAsia="Georgia"/>
                 <w:b/>
                 <w:color w:val="0F1C2E"/>
-                <w:sz w:val="52"/>
+                <w:sz w:val="48"/>
               </w:rPr>
               <w:t>Nauroz Salim</w:t>
             </w:r>
@@ -74,28 +74,76 @@
                 <w:rFonts w:ascii="Calibri" w:hAnsi="Calibri" w:eastAsia="Calibri"/>
                 <w:b/>
                 <w:color w:val="1A6B5C"/>
-                <w:sz w:val="22"/>
+                <w:sz w:val="20"/>
               </w:rPr>
-              <w:t>Web Developer Intern · Computer Engineering Student</w:t>
+              <w:t>Computer Engineering Student · Full-Stack &amp; Automation Developer</w:t>
             </w:r>
           </w:p>
           <w:p>
+            <w:pPr>
+              <w:spacing w:before="80"/>
+            </w:pPr>
+            <w:hyperlink r:id="rId10">
+              <w:r>
+                <w:rPr>
+                  <w:color w:val="16324F"/>
+                  <w:u w:val="single"/>
+                  <w:sz w:val="20"/>
+                  <w:b/>
+                  <w:rFonts w:ascii="Calibri" w:hAnsi="Calibri"/>
+                </w:rPr>
+                <w:t>LinkedIn</w:t>
+              </w:r>
+            </w:hyperlink>
             <w:r>
               <w:rPr>
                 <w:rFonts w:ascii="Calibri" w:hAnsi="Calibri" w:eastAsia="Calibri"/>
                 <w:b w:val="0"/>
                 <w:color w:val="4A5C70"/>
-                <w:sz w:val="18"/>
+                <w:sz w:val="20"/>
               </w:rPr>
-              <w:t>linkedin.com/in/navrozsalim  |  github.com/NavrozSalim  |  navrozsalim.github.io/Portfolio</w:t>
+              <w:t xml:space="preserve">  ·  </w:t>
             </w:r>
+            <w:hyperlink r:id="rId11">
+              <w:r>
+                <w:rPr>
+                  <w:color w:val="16324F"/>
+                  <w:u w:val="single"/>
+                  <w:sz w:val="20"/>
+                  <w:b/>
+                  <w:rFonts w:ascii="Calibri" w:hAnsi="Calibri"/>
+                </w:rPr>
+                <w:t>GitHub</w:t>
+              </w:r>
+            </w:hyperlink>
+            <w:r>
+              <w:rPr>
+                <w:rFonts w:ascii="Calibri" w:hAnsi="Calibri" w:eastAsia="Calibri"/>
+                <w:b w:val="0"/>
+                <w:color w:val="4A5C70"/>
+                <w:sz w:val="20"/>
+              </w:rPr>
+              <w:t xml:space="preserve">  ·  </w:t>
+            </w:r>
+            <w:hyperlink r:id="rId12">
+              <w:r>
+                <w:rPr>
+                  <w:color w:val="1A6B5C"/>
+                  <w:u w:val="single"/>
+                  <w:sz w:val="22"/>
+                  <w:b/>
+                  <w:rFonts w:ascii="Calibri" w:hAnsi="Calibri"/>
+                </w:rPr>
+                <w:t>Portfolio</w:t>
+              </w:r>
+            </w:hyperlink>
           </w:p>
         </w:tc>
       </w:tr>
     </w:tbl>
     <w:p>
       <w:pPr>
-        <w:spacing w:before="280" w:after="80"/>
+        <w:spacing w:before="240" w:after="80"/>
         <w:pBdr>
           <w:bottom w:val="single" w:sz="12" w:space="1" w:color="16324F"/>
         </w:pBdr>
@@ -116,14 +164,247 @@
           <w:rFonts w:ascii="Calibri" w:hAnsi="Calibri" w:eastAsia="Calibri"/>
           <w:b w:val="0"/>
           <w:color w:val="4A5C70"/>
-          <w:sz w:val="22"/>
+          <w:sz w:val="20"/>
         </w:rPr>
-        <w:t>Computer Engineering student and aspiring web developer specializing in responsive, user-friendly web applications. Skilled in HTML, CSS, JavaScript, React, Node.js, and Python. Builds job-ready projects around SaaS workflows, AI-assisted tools, and data dashboards.</w:t>
+        <w:t>Computer Engineering student with hands-on experience building full-stack products, marketplace automation systems, web scrapers, and SaaS-style sync tools. Comfortable with JavaScript/TypeScript stacks, Python tooling, APIs, and shipping practical solutions for e-commerce operations and AI-assisted workflows.</w:t>
       </w:r>
     </w:p>
     <w:p>
       <w:pPr>
-        <w:spacing w:before="280" w:after="80"/>
+        <w:spacing w:before="240" w:after="80"/>
+        <w:pBdr>
+          <w:bottom w:val="single" w:sz="12" w:space="1" w:color="16324F"/>
+        </w:pBdr>
+      </w:pPr>
+      <w:r>
+        <w:rPr>
+          <w:rFonts w:ascii="Calibri" w:hAnsi="Calibri" w:eastAsia="Calibri"/>
+          <w:b/>
+          <w:color w:val="16324F"/>
+          <w:sz w:val="22"/>
+        </w:rPr>
+        <w:t>SELECTED WORK &amp; PROJECTS</w:t>
+      </w:r>
+    </w:p>
+    <w:p>
+      <w:pPr>
+        <w:spacing w:before="140" w:after="0"/>
+      </w:pPr>
+      <w:r>
+        <w:rPr>
+          <w:rFonts w:ascii="Calibri" w:hAnsi="Calibri" w:eastAsia="Calibri"/>
+          <w:b/>
+          <w:sz w:val="22"/>
+        </w:rPr>
+        <w:t>LogAI — Final Year Project</w:t>
+      </w:r>
+      <w:r>
+        <w:rPr>
+          <w:rFonts w:ascii="Calibri" w:hAnsi="Calibri" w:eastAsia="Calibri"/>
+          <w:b w:val="0"/>
+          <w:color w:val="4A5C70"/>
+          <w:sz w:val="16"/>
+        </w:rPr>
+        <w:t xml:space="preserve">  |  AI · Backend · Frontend · Docker</w:t>
+      </w:r>
+    </w:p>
+    <w:p>
+      <w:pPr>
+        <w:spacing w:before="20" w:after="40"/>
+      </w:pPr>
+      <w:r>
+        <w:rPr>
+          <w:rFonts w:ascii="Calibri" w:hAnsi="Calibri" w:eastAsia="Calibri"/>
+          <w:b w:val="0"/>
+          <w:color w:val="4A5C70"/>
+          <w:sz w:val="18"/>
+        </w:rPr>
+        <w:t>Building an AI-assisted logging and operations platform with separate auth service, backend APIs, frontend app, datasets, demo shop integration, and Docker-based deployment.</w:t>
+      </w:r>
+    </w:p>
+    <w:p>
+      <w:pPr>
+        <w:spacing w:before="140" w:after="0"/>
+      </w:pPr>
+      <w:r>
+        <w:rPr>
+          <w:rFonts w:ascii="Calibri" w:hAnsi="Calibri" w:eastAsia="Calibri"/>
+          <w:b/>
+          <w:sz w:val="22"/>
+        </w:rPr>
+        <w:t>Reverb Marketplace Platform &amp; Listing Automation</w:t>
+      </w:r>
+      <w:r>
+        <w:rPr>
+          <w:rFonts w:ascii="Calibri" w:hAnsi="Calibri" w:eastAsia="Calibri"/>
+          <w:b w:val="0"/>
+          <w:color w:val="4A5C70"/>
+          <w:sz w:val="16"/>
+        </w:rPr>
+        <w:t xml:space="preserve">  |  Full-Stack · Automation · APIs</w:t>
+      </w:r>
+    </w:p>
+    <w:p>
+      <w:pPr>
+        <w:spacing w:before="20" w:after="40"/>
+      </w:pPr>
+      <w:r>
+        <w:rPr>
+          <w:rFonts w:ascii="Calibri" w:hAnsi="Calibri" w:eastAsia="Calibri"/>
+          <w:b w:val="0"/>
+          <w:color w:val="4A5C70"/>
+          <w:sz w:val="18"/>
+        </w:rPr>
+        <w:t>Developed Reverb-focused website work (frontend/backend) and listing automation flows that prepare, format, and publish product data for marketplace selling at scale.</w:t>
+      </w:r>
+    </w:p>
+    <w:p>
+      <w:pPr>
+        <w:spacing w:before="140" w:after="0"/>
+      </w:pPr>
+      <w:r>
+        <w:rPr>
+          <w:rFonts w:ascii="Calibri" w:hAnsi="Calibri" w:eastAsia="Calibri"/>
+          <w:b/>
+          <w:sz w:val="22"/>
+        </w:rPr>
+        <w:t>Multi-Marketplace Scrapers &amp; Listing Formatters</w:t>
+      </w:r>
+      <w:r>
+        <w:rPr>
+          <w:rFonts w:ascii="Calibri" w:hAnsi="Calibri" w:eastAsia="Calibri"/>
+          <w:b w:val="0"/>
+          <w:color w:val="4A5C70"/>
+          <w:sz w:val="16"/>
+        </w:rPr>
+        <w:t xml:space="preserve">  |  Python/JS · Scraping · Data Pipelines</w:t>
+      </w:r>
+    </w:p>
+    <w:p>
+      <w:pPr>
+        <w:spacing w:before="20" w:after="40"/>
+      </w:pPr>
+      <w:r>
+        <w:rPr>
+          <w:rFonts w:ascii="Calibri" w:hAnsi="Calibri" w:eastAsia="Calibri"/>
+          <w:b w:val="0"/>
+          <w:color w:val="4A5C70"/>
+          <w:sz w:val="18"/>
+        </w:rPr>
+        <w:t>Built scrapers and formatting tools across marketplaces such as Amazon, eBay, Temu, Target, Sears, Walmart, Kogan, Mydeal, HEB, Costco, and Etsy — including bulk listing formatters, description formatters, image tools, and validation utilities.</w:t>
+      </w:r>
+    </w:p>
+    <w:p>
+      <w:pPr>
+        <w:spacing w:before="140" w:after="0"/>
+      </w:pPr>
+      <w:r>
+        <w:rPr>
+          <w:rFonts w:ascii="Calibri" w:hAnsi="Calibri" w:eastAsia="Calibri"/>
+          <w:b/>
+          <w:sz w:val="22"/>
+        </w:rPr>
+        <w:t>WEsolucions — SaaS Store Sync</w:t>
+      </w:r>
+      <w:r>
+        <w:rPr>
+          <w:rFonts w:ascii="Calibri" w:hAnsi="Calibri" w:eastAsia="Calibri"/>
+          <w:b w:val="0"/>
+          <w:color w:val="4A5C70"/>
+          <w:sz w:val="16"/>
+        </w:rPr>
+        <w:t xml:space="preserve">  |  SaaS · Multi-channel Sync</w:t>
+      </w:r>
+    </w:p>
+    <w:p>
+      <w:pPr>
+        <w:spacing w:before="20" w:after="40"/>
+      </w:pPr>
+      <w:r>
+        <w:rPr>
+          <w:rFonts w:ascii="Calibri" w:hAnsi="Calibri" w:eastAsia="Calibri"/>
+          <w:b w:val="0"/>
+          <w:color w:val="4A5C70"/>
+          <w:sz w:val="18"/>
+        </w:rPr>
+        <w:t>Worked on SaaS store-sync systems that connect and synchronize store/channel data for multi-marketplace operations, helping keep product and listing workflows consistent.</w:t>
+      </w:r>
+    </w:p>
+    <w:p>
+      <w:pPr>
+        <w:spacing w:before="140" w:after="0"/>
+      </w:pPr>
+      <w:r>
+        <w:rPr>
+          <w:rFonts w:ascii="Calibri" w:hAnsi="Calibri" w:eastAsia="Calibri"/>
+          <w:b/>
+          <w:sz w:val="22"/>
+        </w:rPr>
+        <w:t>Sscomic Website &amp; Client Web Work</w:t>
+      </w:r>
+      <w:r>
+        <w:rPr>
+          <w:rFonts w:ascii="Calibri" w:hAnsi="Calibri" w:eastAsia="Calibri"/>
+          <w:b w:val="0"/>
+          <w:color w:val="4A5C70"/>
+          <w:sz w:val="16"/>
+        </w:rPr>
+        <w:t xml:space="preserve">  |  HTML/CSS/JS · Website Delivery</w:t>
+      </w:r>
+    </w:p>
+    <w:p>
+      <w:pPr>
+        <w:spacing w:before="20" w:after="40"/>
+      </w:pPr>
+      <w:r>
+        <w:rPr>
+          <w:rFonts w:ascii="Calibri" w:hAnsi="Calibri" w:eastAsia="Calibri"/>
+          <w:b w:val="0"/>
+          <w:color w:val="4A5C70"/>
+          <w:sz w:val="18"/>
+        </w:rPr>
+        <w:t>Delivered website and theme-related work for Sscomic, focusing on practical frontend implementation and client-ready presentation of products/services online.</w:t>
+      </w:r>
+    </w:p>
+    <w:p>
+      <w:pPr>
+        <w:spacing w:before="140" w:after="0"/>
+      </w:pPr>
+      <w:r>
+        <w:rPr>
+          <w:rFonts w:ascii="Calibri" w:hAnsi="Calibri" w:eastAsia="Calibri"/>
+          <w:b/>
+          <w:sz w:val="22"/>
+        </w:rPr>
+        <w:t>Apify Actors &amp; Channel Workflow Tools</w:t>
+      </w:r>
+      <w:r>
+        <w:rPr>
+          <w:rFonts w:ascii="Calibri" w:hAnsi="Calibri" w:eastAsia="Calibri"/>
+          <w:b w:val="0"/>
+          <w:color w:val="4A5C70"/>
+          <w:sz w:val="16"/>
+        </w:rPr>
+        <w:t xml:space="preserve">  |  Automation · Actors · Workflows</w:t>
+      </w:r>
+    </w:p>
+    <w:p>
+      <w:pPr>
+        <w:spacing w:before="20" w:after="40"/>
+      </w:pPr>
+      <w:r>
+        <w:rPr>
+          <w:rFonts w:ascii="Calibri" w:hAnsi="Calibri" w:eastAsia="Calibri"/>
+          <w:b w:val="0"/>
+          <w:color w:val="4A5C70"/>
+          <w:sz w:val="18"/>
+        </w:rPr>
+        <w:t>Created Apify actors and channel/workflow tooling (including Channelpilot-style workflow support and YouTube automation experiments) to automate repetitive data-collection and publishing tasks.</w:t>
+      </w:r>
+    </w:p>
+    <w:p>
+      <w:pPr>
+        <w:spacing w:before="240" w:after="80"/>
         <w:pBdr>
           <w:bottom w:val="single" w:sz="12" w:space="1" w:color="16324F"/>
         </w:pBdr>
@@ -140,13 +421,13 @@
     </w:p>
     <w:p>
       <w:pPr>
-        <w:spacing w:before="120" w:after="0"/>
+        <w:spacing w:before="100" w:after="0"/>
       </w:pPr>
       <w:r>
         <w:rPr>
           <w:rFonts w:ascii="Calibri" w:hAnsi="Calibri" w:eastAsia="Calibri"/>
           <w:b/>
-          <w:sz w:val="24"/>
+          <w:sz w:val="22"/>
         </w:rPr>
         <w:t>Bachelors in Computer Engineering</w:t>
       </w:r>
@@ -155,7 +436,7 @@
           <w:rFonts w:ascii="Calibri" w:hAnsi="Calibri" w:eastAsia="Calibri"/>
           <w:b w:val="0"/>
           <w:color w:val="4A5C70"/>
-          <w:sz w:val="20"/>
+          <w:sz w:val="18"/>
         </w:rPr>
         <w:tab/>
         <w:t>2022 – 2026</w:t>
@@ -170,7 +451,7 @@
           <w:rFonts w:ascii="Calibri" w:hAnsi="Calibri" w:eastAsia="Calibri"/>
           <w:b/>
           <w:color w:val="1A6B5C"/>
-          <w:sz w:val="20"/>
+          <w:sz w:val="18"/>
         </w:rPr>
         <w:t>Sir Syed University of Engineering and Technology</w:t>
       </w:r>
@@ -184,20 +465,20 @@
           <w:rFonts w:ascii="Calibri" w:hAnsi="Calibri" w:eastAsia="Calibri"/>
           <w:b w:val="0"/>
           <w:color w:val="4A5C70"/>
-          <w:sz w:val="20"/>
+          <w:sz w:val="18"/>
         </w:rPr>
         <w:t>In progress</w:t>
       </w:r>
     </w:p>
     <w:p>
       <w:pPr>
-        <w:spacing w:before="120" w:after="0"/>
+        <w:spacing w:before="100" w:after="0"/>
       </w:pPr>
       <w:r>
         <w:rPr>
           <w:rFonts w:ascii="Calibri" w:hAnsi="Calibri" w:eastAsia="Calibri"/>
           <w:b/>
-          <w:sz w:val="24"/>
+          <w:sz w:val="22"/>
         </w:rPr>
         <w:t>Intermediate</w:t>
       </w:r>
@@ -206,7 +487,7 @@
           <w:rFonts w:ascii="Calibri" w:hAnsi="Calibri" w:eastAsia="Calibri"/>
           <w:b w:val="0"/>
           <w:color w:val="4A5C70"/>
-          <w:sz w:val="20"/>
+          <w:sz w:val="18"/>
         </w:rPr>
         <w:tab/>
         <w:t>2022</w:t>
@@ -221,20 +502,20 @@
           <w:rFonts w:ascii="Calibri" w:hAnsi="Calibri" w:eastAsia="Calibri"/>
           <w:b/>
           <w:color w:val="1A6B5C"/>
-          <w:sz w:val="20"/>
+          <w:sz w:val="18"/>
         </w:rPr>
         <w:t>Happy Place Group of Colleges</w:t>
       </w:r>
     </w:p>
     <w:p>
       <w:pPr>
-        <w:spacing w:before="120" w:after="0"/>
+        <w:spacing w:before="100" w:after="0"/>
       </w:pPr>
       <w:r>
         <w:rPr>
           <w:rFonts w:ascii="Calibri" w:hAnsi="Calibri" w:eastAsia="Calibri"/>
           <w:b/>
-          <w:sz w:val="24"/>
+          <w:sz w:val="22"/>
         </w:rPr>
         <w:t>Matriculation</w:t>
       </w:r>
@@ -243,7 +524,7 @@
           <w:rFonts w:ascii="Calibri" w:hAnsi="Calibri" w:eastAsia="Calibri"/>
           <w:b w:val="0"/>
           <w:color w:val="4A5C70"/>
-          <w:sz w:val="20"/>
+          <w:sz w:val="18"/>
         </w:rPr>
         <w:tab/>
         <w:t>2019</w:t>
@@ -258,216 +539,14 @@
           <w:rFonts w:ascii="Calibri" w:hAnsi="Calibri" w:eastAsia="Calibri"/>
           <w:b/>
           <w:color w:val="1A6B5C"/>
-          <w:sz w:val="20"/>
+          <w:sz w:val="18"/>
         </w:rPr>
         <w:t>Metropolitan Foundation School</w:t>
       </w:r>
     </w:p>
     <w:p>
       <w:pPr>
-        <w:spacing w:before="280" w:after="80"/>
-        <w:pBdr>
-          <w:bottom w:val="single" w:sz="12" w:space="1" w:color="16324F"/>
-        </w:pBdr>
-      </w:pPr>
-      <w:r>
-        <w:rPr>
-          <w:rFonts w:ascii="Calibri" w:hAnsi="Calibri" w:eastAsia="Calibri"/>
-          <w:b/>
-          <w:color w:val="16324F"/>
-          <w:sz w:val="22"/>
-        </w:rPr>
-        <w:t>PROJECTS</w:t>
-      </w:r>
-    </w:p>
-    <w:p>
-      <w:pPr>
-        <w:spacing w:before="160" w:after="0"/>
-      </w:pPr>
-      <w:r>
-        <w:rPr>
-          <w:rFonts w:ascii="Calibri" w:hAnsi="Calibri" w:eastAsia="Calibri"/>
-          <w:b/>
-          <w:sz w:val="24"/>
-        </w:rPr>
-        <w:t>Job Application Tracker</w:t>
-      </w:r>
-      <w:r>
-        <w:rPr>
-          <w:rFonts w:ascii="Calibri" w:hAnsi="Calibri" w:eastAsia="Calibri"/>
-          <w:b w:val="0"/>
-          <w:color w:val="4A5C70"/>
-          <w:sz w:val="18"/>
-        </w:rPr>
-        <w:tab/>
-        <w:t>JavaScript · LocalStorage · CRUD</w:t>
-      </w:r>
-    </w:p>
-    <w:p>
-      <w:pPr>
-        <w:spacing w:before="20"/>
-      </w:pPr>
-      <w:r>
-        <w:rPr>
-          <w:rFonts w:ascii="Calibri" w:hAnsi="Calibri" w:eastAsia="Calibri"/>
-          <w:b w:val="0"/>
-          <w:color w:val="4A5C70"/>
-          <w:sz w:val="20"/>
-        </w:rPr>
-        <w:t>Tracks internship and junior job applications through a status pipeline (Applied, Interview, Offer, Rejected), with KPI summaries and saved progress in the browser.</w:t>
-      </w:r>
-    </w:p>
-    <w:p>
-      <w:pPr>
-        <w:spacing w:before="160" w:after="0"/>
-      </w:pPr>
-      <w:r>
-        <w:rPr>
-          <w:rFonts w:ascii="Calibri" w:hAnsi="Calibri" w:eastAsia="Calibri"/>
-          <w:b/>
-          <w:sz w:val="24"/>
-        </w:rPr>
-        <w:t>AI Resume Feedback Tool</w:t>
-      </w:r>
-      <w:r>
-        <w:rPr>
-          <w:rFonts w:ascii="Calibri" w:hAnsi="Calibri" w:eastAsia="Calibri"/>
-          <w:b w:val="0"/>
-          <w:color w:val="4A5C70"/>
-          <w:sz w:val="18"/>
-        </w:rPr>
-        <w:tab/>
-        <w:t>JavaScript · ATS Keyword Analysis</w:t>
-      </w:r>
-    </w:p>
-    <w:p>
-      <w:pPr>
-        <w:spacing w:before="20"/>
-      </w:pPr>
-      <w:r>
-        <w:rPr>
-          <w:rFonts w:ascii="Calibri" w:hAnsi="Calibri" w:eastAsia="Calibri"/>
-          <w:b w:val="0"/>
-          <w:color w:val="4A5C70"/>
-          <w:sz w:val="20"/>
-        </w:rPr>
-        <w:t>Analyzes pasted resume text against a target role, scores keyword match strength, and suggests concrete improvements for ATS-friendly applications.</w:t>
-      </w:r>
-    </w:p>
-    <w:p>
-      <w:pPr>
-        <w:spacing w:before="160" w:after="0"/>
-      </w:pPr>
-      <w:r>
-        <w:rPr>
-          <w:rFonts w:ascii="Calibri" w:hAnsi="Calibri" w:eastAsia="Calibri"/>
-          <w:b/>
-          <w:sz w:val="24"/>
-        </w:rPr>
-        <w:t>E-Commerce Analytics Dashboard</w:t>
-      </w:r>
-      <w:r>
-        <w:rPr>
-          <w:rFonts w:ascii="Calibri" w:hAnsi="Calibri" w:eastAsia="Calibri"/>
-          <w:b w:val="0"/>
-          <w:color w:val="4A5C70"/>
-          <w:sz w:val="18"/>
-        </w:rPr>
-        <w:tab/>
-        <w:t>JavaScript · Chart.js · REST API</w:t>
-      </w:r>
-    </w:p>
-    <w:p>
-      <w:pPr>
-        <w:spacing w:before="20"/>
-      </w:pPr>
-      <w:r>
-        <w:rPr>
-          <w:rFonts w:ascii="Calibri" w:hAnsi="Calibri" w:eastAsia="Calibri"/>
-          <w:b w:val="0"/>
-          <w:color w:val="4A5C70"/>
-          <w:sz w:val="20"/>
-        </w:rPr>
-        <w:t>Shows store performance with revenue trends, category charts, KPI cards, and a top-products table powered by live product API data.</w:t>
-      </w:r>
-    </w:p>
-    <w:p>
-      <w:pPr>
-        <w:spacing w:before="160" w:after="0"/>
-      </w:pPr>
-      <w:r>
-        <w:rPr>
-          <w:rFonts w:ascii="Calibri" w:hAnsi="Calibri" w:eastAsia="Calibri"/>
-          <w:b/>
-          <w:sz w:val="24"/>
-        </w:rPr>
-        <w:t>E-Commerce Product Catalog</w:t>
-      </w:r>
-      <w:r>
-        <w:rPr>
-          <w:rFonts w:ascii="Calibri" w:hAnsi="Calibri" w:eastAsia="Calibri"/>
-          <w:b w:val="0"/>
-          <w:color w:val="4A5C70"/>
-          <w:sz w:val="18"/>
-        </w:rPr>
-        <w:tab/>
-        <w:t>HTML · CSS · JavaScript · API</w:t>
-      </w:r>
-    </w:p>
-    <w:p>
-      <w:pPr>
-        <w:spacing w:before="20"/>
-      </w:pPr>
-      <w:r>
-        <w:rPr>
-          <w:rFonts w:ascii="Calibri" w:hAnsi="Calibri" w:eastAsia="Calibri"/>
-          <w:b w:val="0"/>
-          <w:color w:val="4A5C70"/>
-          <w:sz w:val="20"/>
-        </w:rPr>
-        <w:t>Displays products from an API with search and category filtering so users can browse items quickly in a responsive shopping-style layout.</w:t>
-      </w:r>
-    </w:p>
-    <w:p>
-      <w:pPr>
-        <w:spacing w:before="160" w:after="0"/>
-      </w:pPr>
-      <w:r>
-        <w:rPr>
-          <w:rFonts w:ascii="Calibri" w:hAnsi="Calibri" w:eastAsia="Calibri"/>
-          <w:b/>
-          <w:sz w:val="24"/>
-        </w:rPr>
-        <w:t>Weather App</w:t>
-      </w:r>
-      <w:r>
-        <w:rPr>
-          <w:rFonts w:ascii="Calibri" w:hAnsi="Calibri" w:eastAsia="Calibri"/>
-          <w:b w:val="0"/>
-          <w:color w:val="4A5C70"/>
-          <w:sz w:val="18"/>
-        </w:rPr>
-        <w:tab/>
-        <w:t>JavaScript · OpenWeather API</w:t>
-      </w:r>
-    </w:p>
-    <w:p>
-      <w:pPr>
-        <w:spacing w:before="20"/>
-      </w:pPr>
-      <w:r>
-        <w:rPr>
-          <w:rFonts w:ascii="Calibri" w:hAnsi="Calibri" w:eastAsia="Calibri"/>
-          <w:b w:val="0"/>
-          <w:color w:val="4A5C70"/>
-          <w:sz w:val="20"/>
-        </w:rPr>
-        <w:t>Fetches and displays real-time weather for any city, including conditions and temperature, with a clean responsive interface.</w:t>
-      </w:r>
-    </w:p>
-    <w:p>
-      <w:pPr>
-        <w:spacing w:before="280" w:after="80"/>
+        <w:spacing w:before="240" w:after="80"/>
         <w:pBdr>
           <w:bottom w:val="single" w:sz="12" w:space="1" w:color="16324F"/>
         </w:pBdr>
@@ -488,14 +567,14 @@
           <w:rFonts w:ascii="Calibri" w:hAnsi="Calibri" w:eastAsia="Calibri"/>
           <w:b w:val="0"/>
           <w:color w:val="0F1C2E"/>
-          <w:sz w:val="22"/>
+          <w:sz w:val="20"/>
         </w:rPr>
-        <w:t>HTML, CSS, JavaScript  ·  React, Node.js  ·  Python  ·  REST APIs &amp; JSON  ·  Dashboards &amp; Chart.js  ·  Responsive Web Design  ·  Git &amp; GitHub</w:t>
+        <w:t>HTML, CSS, JavaScript  ·  React, Node.js  ·  Python  ·  REST APIs &amp; JSON  ·  Web Scraping &amp; Automation  ·  Marketplace Integrations  ·  Docker &amp; Deployment basics  ·  Git &amp; GitHub</w:t>
       </w:r>
     </w:p>
     <w:sectPr>
       <w:pgSz w:w="12240" w:h="15840"/>
-      <w:pgMar w:top="1008" w:right="1080" w:bottom="1008" w:left="1080" w:header="720" w:footer="720" w:gutter="0"/>
+      <w:pgMar w:top="936" w:right="1008" w:bottom="936" w:left="1008" w:header="720" w:footer="720" w:gutter="0"/>
       <w:cols w:space="720"/>
       <w:docGrid w:linePitch="360"/>
     </w:sectPr>

</xml_diff>

<commit_message>
Remove CV photo and compress layout to fit one page.
Co-authored-by: Cursor <cursoragent@cursor.com>
</commit_message>
<xml_diff>
--- a/Nauroz_Salim_CV.docx
+++ b/Nauroz_Salim_CV.docx
@@ -2,150 +2,106 @@
 <file path=word/document.xml><?xml version="1.0" encoding="utf-8"?>
 <w:document xmlns:wpc="http://schemas.microsoft.com/office/word/2010/wordprocessingCanvas" xmlns:mo="http://schemas.microsoft.com/office/mac/office/2008/main" xmlns:mc="http://schemas.openxmlformats.org/markup-compatibility/2006" xmlns:mv="urn:schemas-microsoft-com:mac:vml" xmlns:o="urn:schemas-microsoft-com:office:office" xmlns:r="http://schemas.openxmlformats.org/officeDocument/2006/relationships" xmlns:m="http://schemas.openxmlformats.org/officeDocument/2006/math" xmlns:v="urn:schemas-microsoft-com:vml" xmlns:wp14="http://schemas.microsoft.com/office/word/2010/wordprocessingDrawing" xmlns:wp="http://schemas.openxmlformats.org/drawingml/2006/wordprocessingDrawing" xmlns:w10="urn:schemas-microsoft-com:office:word" xmlns:w="http://schemas.openxmlformats.org/wordprocessingml/2006/main" xmlns:w14="http://schemas.microsoft.com/office/word/2010/wordml" xmlns:wpg="http://schemas.microsoft.com/office/word/2010/wordprocessingGroup" xmlns:wpi="http://schemas.microsoft.com/office/word/2010/wordprocessingInk" xmlns:wne="http://schemas.microsoft.com/office/word/2006/wordml" xmlns:wps="http://schemas.microsoft.com/office/word/2010/wordprocessingShape" mc:Ignorable="w14 wp14">
   <w:body>
-    <w:tbl>
-      <w:tblPr>
-        <w:tblW w:type="auto" w:w="0"/>
-        <w:tblLook w:firstColumn="1" w:firstRow="1" w:lastColumn="0" w:lastRow="0" w:noHBand="0" w:noVBand="1" w:val="04A0"/>
-      </w:tblPr>
-      <w:tblGrid>
-        <w:gridCol w:w="5112"/>
-        <w:gridCol w:w="5112"/>
-      </w:tblGrid>
-      <w:tr>
-        <w:tc>
-          <w:tcPr>
-            <w:tcW w:type="dxa" w:w="1872"/>
-          </w:tcPr>
-          <w:p>
-            <w:r>
-              <w:drawing>
-                <wp:inline xmlns:a="http://schemas.openxmlformats.org/drawingml/2006/main" xmlns:pic="http://schemas.openxmlformats.org/drawingml/2006/picture">
-                  <wp:extent cx="1005840" cy="1509704"/>
-                  <wp:docPr id="1" name="Picture 1"/>
-                  <wp:cNvGraphicFramePr>
-                    <a:graphicFrameLocks noChangeAspect="1"/>
-                  </wp:cNvGraphicFramePr>
-                  <a:graphic>
-                    <a:graphicData uri="http://schemas.openxmlformats.org/drawingml/2006/picture">
-                      <pic:pic>
-                        <pic:nvPicPr>
-                          <pic:cNvPr id="0" name="image.jpg"/>
-                          <pic:cNvPicPr/>
-                        </pic:nvPicPr>
-                        <pic:blipFill>
-                          <a:blip r:embed="rId9"/>
-                          <a:stretch>
-                            <a:fillRect/>
-                          </a:stretch>
-                        </pic:blipFill>
-                        <pic:spPr>
-                          <a:xfrm>
-                            <a:off x="0" y="0"/>
-                            <a:ext cx="1005840" cy="1509704"/>
-                          </a:xfrm>
-                          <a:prstGeom prst="rect"/>
-                        </pic:spPr>
-                      </pic:pic>
-                    </a:graphicData>
-                  </a:graphic>
-                </wp:inline>
-              </w:drawing>
-            </w:r>
-          </w:p>
-        </w:tc>
-        <w:tc>
-          <w:tcPr>
-            <w:tcW w:type="dxa" w:w="8064"/>
-          </w:tcPr>
-          <w:p>
-            <w:r>
-              <w:rPr>
-                <w:rFonts w:ascii="Georgia" w:hAnsi="Georgia" w:eastAsia="Georgia"/>
-                <w:b/>
-                <w:color w:val="0F1C2E"/>
-                <w:sz w:val="48"/>
-              </w:rPr>
-              <w:t>Nauroz Salim</w:t>
-            </w:r>
-          </w:p>
-          <w:p>
-            <w:r>
-              <w:rPr>
-                <w:rFonts w:ascii="Calibri" w:hAnsi="Calibri" w:eastAsia="Calibri"/>
-                <w:b/>
-                <w:color w:val="1A6B5C"/>
-                <w:sz w:val="20"/>
-              </w:rPr>
-              <w:t>Computer Engineering Student · Full-Stack &amp; Automation Developer</w:t>
-            </w:r>
-          </w:p>
-          <w:p>
-            <w:pPr>
-              <w:spacing w:before="80"/>
-            </w:pPr>
-            <w:hyperlink r:id="rId10">
-              <w:r>
-                <w:rPr>
-                  <w:color w:val="16324F"/>
-                  <w:u w:val="single"/>
-                  <w:sz w:val="20"/>
-                  <w:b/>
-                  <w:rFonts w:ascii="Calibri" w:hAnsi="Calibri"/>
-                </w:rPr>
-                <w:t>LinkedIn</w:t>
-              </w:r>
-            </w:hyperlink>
-            <w:r>
-              <w:rPr>
-                <w:rFonts w:ascii="Calibri" w:hAnsi="Calibri" w:eastAsia="Calibri"/>
-                <w:b w:val="0"/>
-                <w:color w:val="4A5C70"/>
-                <w:sz w:val="20"/>
-              </w:rPr>
-              <w:t xml:space="preserve">  ·  </w:t>
-            </w:r>
-            <w:hyperlink r:id="rId11">
-              <w:r>
-                <w:rPr>
-                  <w:color w:val="16324F"/>
-                  <w:u w:val="single"/>
-                  <w:sz w:val="20"/>
-                  <w:b/>
-                  <w:rFonts w:ascii="Calibri" w:hAnsi="Calibri"/>
-                </w:rPr>
-                <w:t>GitHub</w:t>
-              </w:r>
-            </w:hyperlink>
-            <w:r>
-              <w:rPr>
-                <w:rFonts w:ascii="Calibri" w:hAnsi="Calibri" w:eastAsia="Calibri"/>
-                <w:b w:val="0"/>
-                <w:color w:val="4A5C70"/>
-                <w:sz w:val="20"/>
-              </w:rPr>
-              <w:t xml:space="preserve">  ·  </w:t>
-            </w:r>
-            <w:hyperlink r:id="rId12">
-              <w:r>
-                <w:rPr>
-                  <w:color w:val="1A6B5C"/>
-                  <w:u w:val="single"/>
-                  <w:sz w:val="22"/>
-                  <w:b/>
-                  <w:rFonts w:ascii="Calibri" w:hAnsi="Calibri"/>
-                </w:rPr>
-                <w:t>Portfolio</w:t>
-              </w:r>
-            </w:hyperlink>
-          </w:p>
-        </w:tc>
-      </w:tr>
-    </w:tbl>
     <w:p>
       <w:pPr>
-        <w:spacing w:before="240" w:after="80"/>
+        <w:spacing w:after="0"/>
+      </w:pPr>
+      <w:r>
+        <w:rPr>
+          <w:rFonts w:ascii="Georgia" w:hAnsi="Georgia" w:eastAsia="Georgia"/>
+          <w:b/>
+          <w:color w:val="0F1C2E"/>
+          <w:sz w:val="40"/>
+        </w:rPr>
+        <w:t>Nauroz Salim</w:t>
+      </w:r>
+    </w:p>
+    <w:p>
+      <w:pPr>
+        <w:spacing w:before="20" w:after="20"/>
+      </w:pPr>
+      <w:r>
+        <w:rPr>
+          <w:rFonts w:ascii="Calibri" w:hAnsi="Calibri" w:eastAsia="Calibri"/>
+          <w:b/>
+          <w:color w:val="1A6B5C"/>
+          <w:sz w:val="18"/>
+        </w:rPr>
+        <w:t>Computer Engineering Student · Full-Stack &amp; Automation Developer</w:t>
+      </w:r>
+    </w:p>
+    <w:p>
+      <w:pPr>
+        <w:spacing w:before="20" w:after="40"/>
+      </w:pPr>
+      <w:hyperlink r:id="rId9">
+        <w:r>
+          <w:rPr>
+            <w:color w:val="16324F"/>
+            <w:u w:val="single"/>
+            <w:sz w:val="18"/>
+            <w:b/>
+            <w:rFonts w:ascii="Calibri" w:hAnsi="Calibri"/>
+          </w:rPr>
+          <w:t>LinkedIn</w:t>
+        </w:r>
+      </w:hyperlink>
+      <w:r>
+        <w:rPr>
+          <w:rFonts w:ascii="Calibri" w:hAnsi="Calibri" w:eastAsia="Calibri"/>
+          <w:b w:val="0"/>
+          <w:color w:val="4A5C70"/>
+          <w:sz w:val="18"/>
+        </w:rPr>
+        <w:t xml:space="preserve">  ·  </w:t>
+      </w:r>
+      <w:hyperlink r:id="rId10">
+        <w:r>
+          <w:rPr>
+            <w:color w:val="16324F"/>
+            <w:u w:val="single"/>
+            <w:sz w:val="18"/>
+            <w:b/>
+            <w:rFonts w:ascii="Calibri" w:hAnsi="Calibri"/>
+          </w:rPr>
+          <w:t>GitHub</w:t>
+        </w:r>
+      </w:hyperlink>
+      <w:r>
+        <w:rPr>
+          <w:rFonts w:ascii="Calibri" w:hAnsi="Calibri" w:eastAsia="Calibri"/>
+          <w:b w:val="0"/>
+          <w:color w:val="4A5C70"/>
+          <w:sz w:val="18"/>
+        </w:rPr>
+        <w:t xml:space="preserve">  ·  </w:t>
+      </w:r>
+      <w:hyperlink r:id="rId11">
+        <w:r>
+          <w:rPr>
+            <w:color w:val="1A6B5C"/>
+            <w:u w:val="single"/>
+            <w:sz w:val="20"/>
+            <w:b/>
+            <w:rFonts w:ascii="Calibri" w:hAnsi="Calibri"/>
+          </w:rPr>
+          <w:t>Portfolio</w:t>
+        </w:r>
+      </w:hyperlink>
+    </w:p>
+    <w:p>
+      <w:pPr>
+        <w:spacing w:before="40" w:after="0"/>
         <w:pBdr>
-          <w:bottom w:val="single" w:sz="12" w:space="1" w:color="16324F"/>
+          <w:bottom w:val="single" w:sz="18" w:space="1" w:color="16324F"/>
+        </w:pBdr>
+      </w:pPr>
+    </w:p>
+    <w:p>
+      <w:pPr>
+        <w:spacing w:before="160" w:after="40"/>
+        <w:pBdr>
+          <w:bottom w:val="single" w:sz="10" w:space="1" w:color="16324F"/>
         </w:pBdr>
       </w:pPr>
       <w:r>
@@ -153,27 +109,30 @@
           <w:rFonts w:ascii="Calibri" w:hAnsi="Calibri" w:eastAsia="Calibri"/>
           <w:b/>
           <w:color w:val="16324F"/>
-          <w:sz w:val="22"/>
+          <w:sz w:val="20"/>
         </w:rPr>
         <w:t>PROFILE</w:t>
       </w:r>
     </w:p>
     <w:p>
+      <w:pPr>
+        <w:spacing w:after="40"/>
+      </w:pPr>
       <w:r>
         <w:rPr>
           <w:rFonts w:ascii="Calibri" w:hAnsi="Calibri" w:eastAsia="Calibri"/>
           <w:b w:val="0"/>
           <w:color w:val="4A5C70"/>
-          <w:sz w:val="20"/>
+          <w:sz w:val="18"/>
         </w:rPr>
-        <w:t>Computer Engineering student with hands-on experience building full-stack products, marketplace automation systems, web scrapers, and SaaS-style sync tools. Comfortable with JavaScript/TypeScript stacks, Python tooling, APIs, and shipping practical solutions for e-commerce operations and AI-assisted workflows.</w:t>
+        <w:t>Computer Engineering student with hands-on experience in full-stack products, marketplace automation, web scrapers, and SaaS sync tools. Skilled in JavaScript, Python, APIs, and shipping practical e-commerce and AI-assisted workflows.</w:t>
       </w:r>
     </w:p>
     <w:p>
       <w:pPr>
-        <w:spacing w:before="240" w:after="80"/>
+        <w:spacing w:before="160" w:after="40"/>
         <w:pBdr>
-          <w:bottom w:val="single" w:sz="12" w:space="1" w:color="16324F"/>
+          <w:bottom w:val="single" w:sz="10" w:space="1" w:color="16324F"/>
         </w:pBdr>
       </w:pPr>
       <w:r>
@@ -181,20 +140,20 @@
           <w:rFonts w:ascii="Calibri" w:hAnsi="Calibri" w:eastAsia="Calibri"/>
           <w:b/>
           <w:color w:val="16324F"/>
-          <w:sz w:val="22"/>
+          <w:sz w:val="20"/>
         </w:rPr>
         <w:t>SELECTED WORK &amp; PROJECTS</w:t>
       </w:r>
     </w:p>
     <w:p>
       <w:pPr>
-        <w:spacing w:before="140" w:after="0"/>
+        <w:spacing w:before="80" w:after="0"/>
       </w:pPr>
       <w:r>
         <w:rPr>
           <w:rFonts w:ascii="Calibri" w:hAnsi="Calibri" w:eastAsia="Calibri"/>
           <w:b/>
-          <w:sz w:val="22"/>
+          <w:sz w:val="20"/>
         </w:rPr>
         <w:t>LogAI — Final Year Project</w:t>
       </w:r>
@@ -210,7 +169,7 @@
     </w:p>
     <w:p>
       <w:pPr>
-        <w:spacing w:before="20" w:after="40"/>
+        <w:spacing w:before="0" w:after="20"/>
       </w:pPr>
       <w:r>
         <w:rPr>
@@ -219,18 +178,18 @@
           <w:color w:val="4A5C70"/>
           <w:sz w:val="18"/>
         </w:rPr>
-        <w:t>Building an AI-assisted logging and operations platform with separate auth service, backend APIs, frontend app, datasets, demo shop integration, and Docker-based deployment.</w:t>
+        <w:t>AI-assisted logging platform with auth service, backend APIs, frontend app, datasets, and Docker deployment.</w:t>
       </w:r>
     </w:p>
     <w:p>
       <w:pPr>
-        <w:spacing w:before="140" w:after="0"/>
+        <w:spacing w:before="80" w:after="0"/>
       </w:pPr>
       <w:r>
         <w:rPr>
           <w:rFonts w:ascii="Calibri" w:hAnsi="Calibri" w:eastAsia="Calibri"/>
           <w:b/>
-          <w:sz w:val="22"/>
+          <w:sz w:val="20"/>
         </w:rPr>
         <w:t>Reverb Marketplace Platform &amp; Listing Automation</w:t>
       </w:r>
@@ -246,7 +205,7 @@
     </w:p>
     <w:p>
       <w:pPr>
-        <w:spacing w:before="20" w:after="40"/>
+        <w:spacing w:before="0" w:after="20"/>
       </w:pPr>
       <w:r>
         <w:rPr>
@@ -255,18 +214,18 @@
           <w:color w:val="4A5C70"/>
           <w:sz w:val="18"/>
         </w:rPr>
-        <w:t>Developed Reverb-focused website work (frontend/backend) and listing automation flows that prepare, format, and publish product data for marketplace selling at scale.</w:t>
+        <w:t>Reverb website (frontend/backend) and listing automation to format and publish product data at scale.</w:t>
       </w:r>
     </w:p>
     <w:p>
       <w:pPr>
-        <w:spacing w:before="140" w:after="0"/>
+        <w:spacing w:before="80" w:after="0"/>
       </w:pPr>
       <w:r>
         <w:rPr>
           <w:rFonts w:ascii="Calibri" w:hAnsi="Calibri" w:eastAsia="Calibri"/>
           <w:b/>
-          <w:sz w:val="22"/>
+          <w:sz w:val="20"/>
         </w:rPr>
         <w:t>Multi-Marketplace Scrapers &amp; Listing Formatters</w:t>
       </w:r>
@@ -277,12 +236,12 @@
           <w:color w:val="4A5C70"/>
           <w:sz w:val="16"/>
         </w:rPr>
-        <w:t xml:space="preserve">  |  Python/JS · Scraping · Data Pipelines</w:t>
+        <w:t xml:space="preserve">  |  Python/JS · Scraping · Pipelines</w:t>
       </w:r>
     </w:p>
     <w:p>
       <w:pPr>
-        <w:spacing w:before="20" w:after="40"/>
+        <w:spacing w:before="0" w:after="20"/>
       </w:pPr>
       <w:r>
         <w:rPr>
@@ -291,18 +250,18 @@
           <w:color w:val="4A5C70"/>
           <w:sz w:val="18"/>
         </w:rPr>
-        <w:t>Built scrapers and formatting tools across marketplaces such as Amazon, eBay, Temu, Target, Sears, Walmart, Kogan, Mydeal, HEB, Costco, and Etsy — including bulk listing formatters, description formatters, image tools, and validation utilities.</w:t>
+        <w:t>Scrapers and formatters for Amazon, eBay, Temu, Target, Sears, Walmart, Kogan, Mydeal, HEB, Costco, and Etsy, plus bulk listing and image tools.</w:t>
       </w:r>
     </w:p>
     <w:p>
       <w:pPr>
-        <w:spacing w:before="140" w:after="0"/>
+        <w:spacing w:before="80" w:after="0"/>
       </w:pPr>
       <w:r>
         <w:rPr>
           <w:rFonts w:ascii="Calibri" w:hAnsi="Calibri" w:eastAsia="Calibri"/>
           <w:b/>
-          <w:sz w:val="22"/>
+          <w:sz w:val="20"/>
         </w:rPr>
         <w:t>WEsolucions — SaaS Store Sync</w:t>
       </w:r>
@@ -318,7 +277,7 @@
     </w:p>
     <w:p>
       <w:pPr>
-        <w:spacing w:before="20" w:after="40"/>
+        <w:spacing w:before="0" w:after="20"/>
       </w:pPr>
       <w:r>
         <w:rPr>
@@ -327,18 +286,18 @@
           <w:color w:val="4A5C70"/>
           <w:sz w:val="18"/>
         </w:rPr>
-        <w:t>Worked on SaaS store-sync systems that connect and synchronize store/channel data for multi-marketplace operations, helping keep product and listing workflows consistent.</w:t>
+        <w:t>SaaS store-sync systems that connect and synchronize store/channel data for multi-marketplace operations.</w:t>
       </w:r>
     </w:p>
     <w:p>
       <w:pPr>
-        <w:spacing w:before="140" w:after="0"/>
+        <w:spacing w:before="80" w:after="0"/>
       </w:pPr>
       <w:r>
         <w:rPr>
           <w:rFonts w:ascii="Calibri" w:hAnsi="Calibri" w:eastAsia="Calibri"/>
           <w:b/>
-          <w:sz w:val="22"/>
+          <w:sz w:val="20"/>
         </w:rPr>
         <w:t>Sscomic Website &amp; Client Web Work</w:t>
       </w:r>
@@ -354,7 +313,7 @@
     </w:p>
     <w:p>
       <w:pPr>
-        <w:spacing w:before="20" w:after="40"/>
+        <w:spacing w:before="0" w:after="20"/>
       </w:pPr>
       <w:r>
         <w:rPr>
@@ -363,18 +322,18 @@
           <w:color w:val="4A5C70"/>
           <w:sz w:val="18"/>
         </w:rPr>
-        <w:t>Delivered website and theme-related work for Sscomic, focusing on practical frontend implementation and client-ready presentation of products/services online.</w:t>
+        <w:t>Website and theme work for Sscomic with practical frontend delivery for client-ready online presentation.</w:t>
       </w:r>
     </w:p>
     <w:p>
       <w:pPr>
-        <w:spacing w:before="140" w:after="0"/>
+        <w:spacing w:before="80" w:after="0"/>
       </w:pPr>
       <w:r>
         <w:rPr>
           <w:rFonts w:ascii="Calibri" w:hAnsi="Calibri" w:eastAsia="Calibri"/>
           <w:b/>
-          <w:sz w:val="22"/>
+          <w:sz w:val="20"/>
         </w:rPr>
         <w:t>Apify Actors &amp; Channel Workflow Tools</w:t>
       </w:r>
@@ -390,7 +349,7 @@
     </w:p>
     <w:p>
       <w:pPr>
-        <w:spacing w:before="20" w:after="40"/>
+        <w:spacing w:before="0" w:after="20"/>
       </w:pPr>
       <w:r>
         <w:rPr>
@@ -399,14 +358,14 @@
           <w:color w:val="4A5C70"/>
           <w:sz w:val="18"/>
         </w:rPr>
-        <w:t>Created Apify actors and channel/workflow tooling (including Channelpilot-style workflow support and YouTube automation experiments) to automate repetitive data-collection and publishing tasks.</w:t>
+        <w:t>Apify actors and channel workflow tooling to automate data collection and publishing tasks.</w:t>
       </w:r>
     </w:p>
     <w:p>
       <w:pPr>
-        <w:spacing w:before="240" w:after="80"/>
+        <w:spacing w:before="160" w:after="40"/>
         <w:pBdr>
-          <w:bottom w:val="single" w:sz="12" w:space="1" w:color="16324F"/>
+          <w:bottom w:val="single" w:sz="10" w:space="1" w:color="16324F"/>
         </w:pBdr>
       </w:pPr>
       <w:r>
@@ -414,80 +373,52 @@
           <w:rFonts w:ascii="Calibri" w:hAnsi="Calibri" w:eastAsia="Calibri"/>
           <w:b/>
           <w:color w:val="16324F"/>
-          <w:sz w:val="22"/>
+          <w:sz w:val="20"/>
         </w:rPr>
         <w:t>EDUCATION</w:t>
       </w:r>
     </w:p>
     <w:p>
       <w:pPr>
-        <w:spacing w:before="100" w:after="0"/>
+        <w:spacing w:before="40" w:after="0"/>
       </w:pPr>
       <w:r>
         <w:rPr>
           <w:rFonts w:ascii="Calibri" w:hAnsi="Calibri" w:eastAsia="Calibri"/>
           <w:b/>
-          <w:sz w:val="22"/>
+          <w:sz w:val="18"/>
         </w:rPr>
-        <w:t>Bachelors in Computer Engineering</w:t>
+        <w:t>Bachelors in Computer Engineering — SSUET</w:t>
       </w:r>
       <w:r>
         <w:rPr>
           <w:rFonts w:ascii="Calibri" w:hAnsi="Calibri" w:eastAsia="Calibri"/>
           <w:b w:val="0"/>
           <w:color w:val="4A5C70"/>
-          <w:sz w:val="18"/>
+          <w:sz w:val="16"/>
         </w:rPr>
         <w:tab/>
-        <w:t>2022 – 2026</w:t>
+        <w:t>2022 – 2026 · In progress</w:t>
       </w:r>
     </w:p>
     <w:p>
       <w:pPr>
-        <w:spacing w:before="0"/>
+        <w:spacing w:before="40" w:after="0"/>
       </w:pPr>
       <w:r>
         <w:rPr>
           <w:rFonts w:ascii="Calibri" w:hAnsi="Calibri" w:eastAsia="Calibri"/>
           <w:b/>
-          <w:color w:val="1A6B5C"/>
           <w:sz w:val="18"/>
         </w:rPr>
-        <w:t>Sir Syed University of Engineering and Technology</w:t>
-      </w:r>
-    </w:p>
-    <w:p>
-      <w:pPr>
-        <w:spacing w:before="0"/>
-      </w:pPr>
-      <w:r>
-        <w:rPr>
-          <w:rFonts w:ascii="Calibri" w:hAnsi="Calibri" w:eastAsia="Calibri"/>
-          <w:b w:val="0"/>
-          <w:color w:val="4A5C70"/>
-          <w:sz w:val="18"/>
-        </w:rPr>
-        <w:t>In progress</w:t>
-      </w:r>
-    </w:p>
-    <w:p>
-      <w:pPr>
-        <w:spacing w:before="100" w:after="0"/>
-      </w:pPr>
-      <w:r>
-        <w:rPr>
-          <w:rFonts w:ascii="Calibri" w:hAnsi="Calibri" w:eastAsia="Calibri"/>
-          <w:b/>
-          <w:sz w:val="22"/>
-        </w:rPr>
-        <w:t>Intermediate</w:t>
+        <w:t>Intermediate — Happy Place Group of Colleges</w:t>
       </w:r>
       <w:r>
         <w:rPr>
           <w:rFonts w:ascii="Calibri" w:hAnsi="Calibri" w:eastAsia="Calibri"/>
           <w:b w:val="0"/>
           <w:color w:val="4A5C70"/>
-          <w:sz w:val="18"/>
+          <w:sz w:val="16"/>
         </w:rPr>
         <w:tab/>
         <w:t>2022</w:t>
@@ -495,36 +426,22 @@
     </w:p>
     <w:p>
       <w:pPr>
-        <w:spacing w:before="0"/>
+        <w:spacing w:before="40" w:after="0"/>
       </w:pPr>
       <w:r>
         <w:rPr>
           <w:rFonts w:ascii="Calibri" w:hAnsi="Calibri" w:eastAsia="Calibri"/>
           <w:b/>
-          <w:color w:val="1A6B5C"/>
           <w:sz w:val="18"/>
         </w:rPr>
-        <w:t>Happy Place Group of Colleges</w:t>
-      </w:r>
-    </w:p>
-    <w:p>
-      <w:pPr>
-        <w:spacing w:before="100" w:after="0"/>
-      </w:pPr>
-      <w:r>
-        <w:rPr>
-          <w:rFonts w:ascii="Calibri" w:hAnsi="Calibri" w:eastAsia="Calibri"/>
-          <w:b/>
-          <w:sz w:val="22"/>
-        </w:rPr>
-        <w:t>Matriculation</w:t>
+        <w:t>Matriculation — Metropolitan Foundation School</w:t>
       </w:r>
       <w:r>
         <w:rPr>
           <w:rFonts w:ascii="Calibri" w:hAnsi="Calibri" w:eastAsia="Calibri"/>
           <w:b w:val="0"/>
           <w:color w:val="4A5C70"/>
-          <w:sz w:val="18"/>
+          <w:sz w:val="16"/>
         </w:rPr>
         <w:tab/>
         <w:t>2019</w:t>
@@ -532,23 +449,9 @@
     </w:p>
     <w:p>
       <w:pPr>
-        <w:spacing w:before="0"/>
-      </w:pPr>
-      <w:r>
-        <w:rPr>
-          <w:rFonts w:ascii="Calibri" w:hAnsi="Calibri" w:eastAsia="Calibri"/>
-          <w:b/>
-          <w:color w:val="1A6B5C"/>
-          <w:sz w:val="18"/>
-        </w:rPr>
-        <w:t>Metropolitan Foundation School</w:t>
-      </w:r>
-    </w:p>
-    <w:p>
-      <w:pPr>
-        <w:spacing w:before="240" w:after="80"/>
+        <w:spacing w:before="160" w:after="40"/>
         <w:pBdr>
-          <w:bottom w:val="single" w:sz="12" w:space="1" w:color="16324F"/>
+          <w:bottom w:val="single" w:sz="10" w:space="1" w:color="16324F"/>
         </w:pBdr>
       </w:pPr>
       <w:r>
@@ -556,25 +459,28 @@
           <w:rFonts w:ascii="Calibri" w:hAnsi="Calibri" w:eastAsia="Calibri"/>
           <w:b/>
           <w:color w:val="16324F"/>
-          <w:sz w:val="22"/>
+          <w:sz w:val="20"/>
         </w:rPr>
         <w:t>SKILLS</w:t>
       </w:r>
     </w:p>
     <w:p>
+      <w:pPr>
+        <w:spacing w:before="20"/>
+      </w:pPr>
       <w:r>
         <w:rPr>
           <w:rFonts w:ascii="Calibri" w:hAnsi="Calibri" w:eastAsia="Calibri"/>
           <w:b w:val="0"/>
           <w:color w:val="0F1C2E"/>
-          <w:sz w:val="20"/>
+          <w:sz w:val="18"/>
         </w:rPr>
-        <w:t>HTML, CSS, JavaScript  ·  React, Node.js  ·  Python  ·  REST APIs &amp; JSON  ·  Web Scraping &amp; Automation  ·  Marketplace Integrations  ·  Docker &amp; Deployment basics  ·  Git &amp; GitHub</w:t>
+        <w:t>HTML, CSS, JavaScript  ·  React, Node.js  ·  Python  ·  REST APIs &amp; JSON  ·  Web Scraping &amp; Automation  ·  Marketplace Integrations  ·  Docker basics  ·  Git &amp; GitHub</w:t>
       </w:r>
     </w:p>
     <w:sectPr>
-      <w:pgSz w:w="12240" w:h="15840"/>
-      <w:pgMar w:top="936" w:right="1008" w:bottom="936" w:left="1008" w:header="720" w:footer="720" w:gutter="0"/>
+      <w:pgSz w:w="11909" w:h="16834"/>
+      <w:pgMar w:top="720" w:right="864" w:bottom="720" w:left="864" w:header="720" w:footer="720" w:gutter="0"/>
       <w:cols w:space="720"/>
       <w:docGrid w:linePitch="360"/>
     </w:sectPr>

</xml_diff>

<commit_message>
Restyle CV to match minimalist modern resume reference layout.
Co-authored-by: Cursor <cursoragent@cursor.com>
</commit_message>
<xml_diff>
--- a/Nauroz_Salim_CV.docx
+++ b/Nauroz_Salim_CV.docx
@@ -4,84 +4,88 @@
   <w:body>
     <w:p>
       <w:pPr>
-        <w:spacing w:after="0"/>
+        <w:spacing w:after="40"/>
+        <w:jc w:val="center"/>
+      </w:pPr>
+      <w:r>
+        <w:rPr>
+          <w:rFonts w:ascii="Calibri" w:hAnsi="Calibri" w:eastAsia="Calibri"/>
+          <w:b w:val="0"/>
+          <w:color w:val="4A4A4A"/>
+          <w:sz w:val="16"/>
+        </w:rPr>
+        <w:t>F U L L - S T A C K   &amp;   A U T O M A T I O N   D E V E L O P E R</w:t>
+      </w:r>
+    </w:p>
+    <w:p>
+      <w:pPr>
+        <w:spacing w:before="40" w:after="40"/>
+        <w:jc w:val="center"/>
       </w:pPr>
       <w:r>
         <w:rPr>
           <w:rFonts w:ascii="Georgia" w:hAnsi="Georgia" w:eastAsia="Georgia"/>
           <w:b/>
-          <w:color w:val="0F1C2E"/>
-          <w:sz w:val="40"/>
+          <w:color w:val="1A1A1A"/>
+          <w:sz w:val="44"/>
         </w:rPr>
-        <w:t>Nauroz Salim</w:t>
+        <w:t>NAUROZ SALIM</w:t>
       </w:r>
     </w:p>
     <w:p>
       <w:pPr>
-        <w:spacing w:before="20" w:after="20"/>
-      </w:pPr>
-      <w:r>
-        <w:rPr>
-          <w:rFonts w:ascii="Calibri" w:hAnsi="Calibri" w:eastAsia="Calibri"/>
-          <w:b/>
-          <w:color w:val="1A6B5C"/>
-          <w:sz w:val="18"/>
-        </w:rPr>
-        <w:t>Computer Engineering Student · Full-Stack &amp; Automation Developer</w:t>
-      </w:r>
-    </w:p>
-    <w:p>
-      <w:pPr>
-        <w:spacing w:before="20" w:after="40"/>
+        <w:spacing w:before="40" w:after="120"/>
+        <w:jc w:val="center"/>
+        <w:pBdr>
+          <w:bottom w:val="single" w:sz="8" w:space="1" w:color="CFCFCF"/>
+        </w:pBdr>
       </w:pPr>
       <w:hyperlink r:id="rId9">
         <w:r>
           <w:rPr>
-            <w:color w:val="16324F"/>
+            <w:color w:val="1A1A1A"/>
             <w:u w:val="single"/>
             <w:sz w:val="18"/>
-            <w:b/>
             <w:rFonts w:ascii="Calibri" w:hAnsi="Calibri"/>
           </w:rPr>
-          <w:t>LinkedIn</w:t>
+          <w:t>linkedin.com/in/navrozsalim</w:t>
         </w:r>
       </w:hyperlink>
       <w:r>
         <w:rPr>
           <w:rFonts w:ascii="Calibri" w:hAnsi="Calibri" w:eastAsia="Calibri"/>
           <w:b w:val="0"/>
-          <w:color w:val="4A5C70"/>
+          <w:color w:val="B4B4B4"/>
           <w:sz w:val="18"/>
         </w:rPr>
-        <w:t xml:space="preserve">  ·  </w:t>
+        <w:t xml:space="preserve">  |  </w:t>
       </w:r>
       <w:hyperlink r:id="rId10">
         <w:r>
           <w:rPr>
-            <w:color w:val="16324F"/>
+            <w:color w:val="1A1A1A"/>
             <w:u w:val="single"/>
             <w:sz w:val="18"/>
-            <w:b/>
             <w:rFonts w:ascii="Calibri" w:hAnsi="Calibri"/>
           </w:rPr>
-          <w:t>GitHub</w:t>
+          <w:t>github.com/NavrozSalim</w:t>
         </w:r>
       </w:hyperlink>
       <w:r>
         <w:rPr>
           <w:rFonts w:ascii="Calibri" w:hAnsi="Calibri" w:eastAsia="Calibri"/>
           <w:b w:val="0"/>
-          <w:color w:val="4A5C70"/>
+          <w:color w:val="B4B4B4"/>
           <w:sz w:val="18"/>
         </w:rPr>
-        <w:t xml:space="preserve">  ·  </w:t>
+        <w:t xml:space="preserve">  |  </w:t>
       </w:r>
       <w:hyperlink r:id="rId11">
         <w:r>
           <w:rPr>
-            <w:color w:val="1A6B5C"/>
+            <w:color w:val="1A1A1A"/>
             <w:u w:val="single"/>
-            <w:sz w:val="20"/>
+            <w:sz w:val="18"/>
             <w:b/>
             <w:rFonts w:ascii="Calibri" w:hAnsi="Calibri"/>
           </w:rPr>
@@ -91,24 +95,16 @@
     </w:p>
     <w:p>
       <w:pPr>
-        <w:spacing w:before="40" w:after="0"/>
+        <w:spacing w:before="120" w:after="60"/>
         <w:pBdr>
-          <w:bottom w:val="single" w:sz="18" w:space="1" w:color="16324F"/>
-        </w:pBdr>
-      </w:pPr>
-    </w:p>
-    <w:p>
-      <w:pPr>
-        <w:spacing w:before="160" w:after="40"/>
-        <w:pBdr>
-          <w:bottom w:val="single" w:sz="10" w:space="1" w:color="16324F"/>
+          <w:bottom w:val="single" w:sz="10" w:space="1" w:color="1A1A1A"/>
         </w:pBdr>
       </w:pPr>
       <w:r>
         <w:rPr>
           <w:rFonts w:ascii="Calibri" w:hAnsi="Calibri" w:eastAsia="Calibri"/>
           <w:b/>
-          <w:color w:val="16324F"/>
+          <w:color w:val="1A1A1A"/>
           <w:sz w:val="20"/>
         </w:rPr>
         <w:t>PROFILE</w:t>
@@ -116,371 +112,803 @@
     </w:p>
     <w:p>
       <w:pPr>
-        <w:spacing w:after="40"/>
+        <w:spacing w:after="80"/>
       </w:pPr>
       <w:r>
         <w:rPr>
           <w:rFonts w:ascii="Calibri" w:hAnsi="Calibri" w:eastAsia="Calibri"/>
           <w:b w:val="0"/>
-          <w:color w:val="4A5C70"/>
+          <w:color w:val="4A4A4A"/>
           <w:sz w:val="18"/>
         </w:rPr>
-        <w:t>Computer Engineering student with hands-on experience in full-stack products, marketplace automation, web scrapers, and SaaS sync tools. Skilled in JavaScript, Python, APIs, and shipping practical e-commerce and AI-assisted workflows.</w:t>
+        <w:t>Computer Engineering student with hands-on experience building full-stack products, marketplace automation systems, web scrapers, and SaaS sync tools. Skilled in JavaScript, Python, APIs, and shipping practical solutions for e-commerce operations and AI-assisted workflows.</w:t>
       </w:r>
     </w:p>
-    <w:p>
-      <w:pPr>
-        <w:spacing w:before="160" w:after="40"/>
-        <w:pBdr>
-          <w:bottom w:val="single" w:sz="10" w:space="1" w:color="16324F"/>
-        </w:pBdr>
-      </w:pPr>
-      <w:r>
-        <w:rPr>
-          <w:rFonts w:ascii="Calibri" w:hAnsi="Calibri" w:eastAsia="Calibri"/>
-          <w:b/>
-          <w:color w:val="16324F"/>
-          <w:sz w:val="20"/>
-        </w:rPr>
-        <w:t>SELECTED WORK &amp; PROJECTS</w:t>
-      </w:r>
-    </w:p>
-    <w:p>
-      <w:pPr>
-        <w:spacing w:before="80" w:after="0"/>
-      </w:pPr>
-      <w:r>
-        <w:rPr>
-          <w:rFonts w:ascii="Calibri" w:hAnsi="Calibri" w:eastAsia="Calibri"/>
-          <w:b/>
-          <w:sz w:val="20"/>
-        </w:rPr>
-        <w:t>LogAI — Final Year Project</w:t>
-      </w:r>
-      <w:r>
-        <w:rPr>
-          <w:rFonts w:ascii="Calibri" w:hAnsi="Calibri" w:eastAsia="Calibri"/>
-          <w:b w:val="0"/>
-          <w:color w:val="4A5C70"/>
-          <w:sz w:val="16"/>
-        </w:rPr>
-        <w:t xml:space="preserve">  |  AI · Backend · Frontend · Docker</w:t>
-      </w:r>
-    </w:p>
-    <w:p>
-      <w:pPr>
-        <w:spacing w:before="0" w:after="20"/>
-      </w:pPr>
-      <w:r>
-        <w:rPr>
-          <w:rFonts w:ascii="Calibri" w:hAnsi="Calibri" w:eastAsia="Calibri"/>
-          <w:b w:val="0"/>
-          <w:color w:val="4A5C70"/>
-          <w:sz w:val="18"/>
-        </w:rPr>
-        <w:t>AI-assisted logging platform with auth service, backend APIs, frontend app, datasets, and Docker deployment.</w:t>
-      </w:r>
-    </w:p>
-    <w:p>
-      <w:pPr>
-        <w:spacing w:before="80" w:after="0"/>
-      </w:pPr>
-      <w:r>
-        <w:rPr>
-          <w:rFonts w:ascii="Calibri" w:hAnsi="Calibri" w:eastAsia="Calibri"/>
-          <w:b/>
-          <w:sz w:val="20"/>
-        </w:rPr>
-        <w:t>Reverb Marketplace Platform &amp; Listing Automation</w:t>
-      </w:r>
-      <w:r>
-        <w:rPr>
-          <w:rFonts w:ascii="Calibri" w:hAnsi="Calibri" w:eastAsia="Calibri"/>
-          <w:b w:val="0"/>
-          <w:color w:val="4A5C70"/>
-          <w:sz w:val="16"/>
-        </w:rPr>
-        <w:t xml:space="preserve">  |  Full-Stack · Automation · APIs</w:t>
-      </w:r>
-    </w:p>
-    <w:p>
-      <w:pPr>
-        <w:spacing w:before="0" w:after="20"/>
-      </w:pPr>
-      <w:r>
-        <w:rPr>
-          <w:rFonts w:ascii="Calibri" w:hAnsi="Calibri" w:eastAsia="Calibri"/>
-          <w:b w:val="0"/>
-          <w:color w:val="4A5C70"/>
-          <w:sz w:val="18"/>
-        </w:rPr>
-        <w:t>Reverb website (frontend/backend) and listing automation to format and publish product data at scale.</w:t>
-      </w:r>
-    </w:p>
-    <w:p>
-      <w:pPr>
-        <w:spacing w:before="80" w:after="0"/>
-      </w:pPr>
-      <w:r>
-        <w:rPr>
-          <w:rFonts w:ascii="Calibri" w:hAnsi="Calibri" w:eastAsia="Calibri"/>
-          <w:b/>
-          <w:sz w:val="20"/>
-        </w:rPr>
-        <w:t>Multi-Marketplace Scrapers &amp; Listing Formatters</w:t>
-      </w:r>
-      <w:r>
-        <w:rPr>
-          <w:rFonts w:ascii="Calibri" w:hAnsi="Calibri" w:eastAsia="Calibri"/>
-          <w:b w:val="0"/>
-          <w:color w:val="4A5C70"/>
-          <w:sz w:val="16"/>
-        </w:rPr>
-        <w:t xml:space="preserve">  |  Python/JS · Scraping · Pipelines</w:t>
-      </w:r>
-    </w:p>
-    <w:p>
-      <w:pPr>
-        <w:spacing w:before="0" w:after="20"/>
-      </w:pPr>
-      <w:r>
-        <w:rPr>
-          <w:rFonts w:ascii="Calibri" w:hAnsi="Calibri" w:eastAsia="Calibri"/>
-          <w:b w:val="0"/>
-          <w:color w:val="4A5C70"/>
-          <w:sz w:val="18"/>
-        </w:rPr>
-        <w:t>Scrapers and formatters for Amazon, eBay, Temu, Target, Sears, Walmart, Kogan, Mydeal, HEB, Costco, and Etsy, plus bulk listing and image tools.</w:t>
-      </w:r>
-    </w:p>
-    <w:p>
-      <w:pPr>
-        <w:spacing w:before="80" w:after="0"/>
-      </w:pPr>
-      <w:r>
-        <w:rPr>
-          <w:rFonts w:ascii="Calibri" w:hAnsi="Calibri" w:eastAsia="Calibri"/>
-          <w:b/>
-          <w:sz w:val="20"/>
-        </w:rPr>
-        <w:t>WEsolucions — SaaS Store Sync</w:t>
-      </w:r>
-      <w:r>
-        <w:rPr>
-          <w:rFonts w:ascii="Calibri" w:hAnsi="Calibri" w:eastAsia="Calibri"/>
-          <w:b w:val="0"/>
-          <w:color w:val="4A5C70"/>
-          <w:sz w:val="16"/>
-        </w:rPr>
-        <w:t xml:space="preserve">  |  SaaS · Multi-channel Sync</w:t>
-      </w:r>
-    </w:p>
-    <w:p>
-      <w:pPr>
-        <w:spacing w:before="0" w:after="20"/>
-      </w:pPr>
-      <w:r>
-        <w:rPr>
-          <w:rFonts w:ascii="Calibri" w:hAnsi="Calibri" w:eastAsia="Calibri"/>
-          <w:b w:val="0"/>
-          <w:color w:val="4A5C70"/>
-          <w:sz w:val="18"/>
-        </w:rPr>
-        <w:t>SaaS store-sync systems that connect and synchronize store/channel data for multi-marketplace operations.</w:t>
-      </w:r>
-    </w:p>
-    <w:p>
-      <w:pPr>
-        <w:spacing w:before="80" w:after="0"/>
-      </w:pPr>
-      <w:r>
-        <w:rPr>
-          <w:rFonts w:ascii="Calibri" w:hAnsi="Calibri" w:eastAsia="Calibri"/>
-          <w:b/>
-          <w:sz w:val="20"/>
-        </w:rPr>
-        <w:t>Sscomic Website &amp; Client Web Work</w:t>
-      </w:r>
-      <w:r>
-        <w:rPr>
-          <w:rFonts w:ascii="Calibri" w:hAnsi="Calibri" w:eastAsia="Calibri"/>
-          <w:b w:val="0"/>
-          <w:color w:val="4A5C70"/>
-          <w:sz w:val="16"/>
-        </w:rPr>
-        <w:t xml:space="preserve">  |  HTML/CSS/JS · Website Delivery</w:t>
-      </w:r>
-    </w:p>
-    <w:p>
-      <w:pPr>
-        <w:spacing w:before="0" w:after="20"/>
-      </w:pPr>
-      <w:r>
-        <w:rPr>
-          <w:rFonts w:ascii="Calibri" w:hAnsi="Calibri" w:eastAsia="Calibri"/>
-          <w:b w:val="0"/>
-          <w:color w:val="4A5C70"/>
-          <w:sz w:val="18"/>
-        </w:rPr>
-        <w:t>Website and theme work for Sscomic with practical frontend delivery for client-ready online presentation.</w:t>
-      </w:r>
-    </w:p>
-    <w:p>
-      <w:pPr>
-        <w:spacing w:before="80" w:after="0"/>
-      </w:pPr>
-      <w:r>
-        <w:rPr>
-          <w:rFonts w:ascii="Calibri" w:hAnsi="Calibri" w:eastAsia="Calibri"/>
-          <w:b/>
-          <w:sz w:val="20"/>
-        </w:rPr>
-        <w:t>Apify Actors &amp; Channel Workflow Tools</w:t>
-      </w:r>
-      <w:r>
-        <w:rPr>
-          <w:rFonts w:ascii="Calibri" w:hAnsi="Calibri" w:eastAsia="Calibri"/>
-          <w:b w:val="0"/>
-          <w:color w:val="4A5C70"/>
-          <w:sz w:val="16"/>
-        </w:rPr>
-        <w:t xml:space="preserve">  |  Automation · Actors · Workflows</w:t>
-      </w:r>
-    </w:p>
-    <w:p>
-      <w:pPr>
-        <w:spacing w:before="0" w:after="20"/>
-      </w:pPr>
-      <w:r>
-        <w:rPr>
-          <w:rFonts w:ascii="Calibri" w:hAnsi="Calibri" w:eastAsia="Calibri"/>
-          <w:b w:val="0"/>
-          <w:color w:val="4A5C70"/>
-          <w:sz w:val="18"/>
-        </w:rPr>
-        <w:t>Apify actors and channel workflow tooling to automate data collection and publishing tasks.</w:t>
-      </w:r>
-    </w:p>
-    <w:p>
-      <w:pPr>
-        <w:spacing w:before="160" w:after="40"/>
-        <w:pBdr>
-          <w:bottom w:val="single" w:sz="10" w:space="1" w:color="16324F"/>
-        </w:pBdr>
-      </w:pPr>
-      <w:r>
-        <w:rPr>
-          <w:rFonts w:ascii="Calibri" w:hAnsi="Calibri" w:eastAsia="Calibri"/>
-          <w:b/>
-          <w:color w:val="16324F"/>
-          <w:sz w:val="20"/>
-        </w:rPr>
-        <w:t>EDUCATION</w:t>
-      </w:r>
-    </w:p>
-    <w:p>
-      <w:pPr>
-        <w:spacing w:before="40" w:after="0"/>
-      </w:pPr>
-      <w:r>
-        <w:rPr>
-          <w:rFonts w:ascii="Calibri" w:hAnsi="Calibri" w:eastAsia="Calibri"/>
-          <w:b/>
-          <w:sz w:val="18"/>
-        </w:rPr>
-        <w:t>Bachelors in Computer Engineering — SSUET</w:t>
-      </w:r>
-      <w:r>
-        <w:rPr>
-          <w:rFonts w:ascii="Calibri" w:hAnsi="Calibri" w:eastAsia="Calibri"/>
-          <w:b w:val="0"/>
-          <w:color w:val="4A5C70"/>
-          <w:sz w:val="16"/>
-        </w:rPr>
-        <w:tab/>
-        <w:t>2022 – 2026 · In progress</w:t>
-      </w:r>
-    </w:p>
-    <w:p>
-      <w:pPr>
-        <w:spacing w:before="40" w:after="0"/>
-      </w:pPr>
-      <w:r>
-        <w:rPr>
-          <w:rFonts w:ascii="Calibri" w:hAnsi="Calibri" w:eastAsia="Calibri"/>
-          <w:b/>
-          <w:sz w:val="18"/>
-        </w:rPr>
-        <w:t>Intermediate — Happy Place Group of Colleges</w:t>
-      </w:r>
-      <w:r>
-        <w:rPr>
-          <w:rFonts w:ascii="Calibri" w:hAnsi="Calibri" w:eastAsia="Calibri"/>
-          <w:b w:val="0"/>
-          <w:color w:val="4A5C70"/>
-          <w:sz w:val="16"/>
-        </w:rPr>
-        <w:tab/>
-        <w:t>2022</w:t>
-      </w:r>
-    </w:p>
-    <w:p>
-      <w:pPr>
-        <w:spacing w:before="40" w:after="0"/>
-      </w:pPr>
-      <w:r>
-        <w:rPr>
-          <w:rFonts w:ascii="Calibri" w:hAnsi="Calibri" w:eastAsia="Calibri"/>
-          <w:b/>
-          <w:sz w:val="18"/>
-        </w:rPr>
-        <w:t>Matriculation — Metropolitan Foundation School</w:t>
-      </w:r>
-      <w:r>
-        <w:rPr>
-          <w:rFonts w:ascii="Calibri" w:hAnsi="Calibri" w:eastAsia="Calibri"/>
-          <w:b w:val="0"/>
-          <w:color w:val="4A5C70"/>
-          <w:sz w:val="16"/>
-        </w:rPr>
-        <w:tab/>
-        <w:t>2019</w:t>
-      </w:r>
-    </w:p>
-    <w:p>
-      <w:pPr>
-        <w:spacing w:before="160" w:after="40"/>
-        <w:pBdr>
-          <w:bottom w:val="single" w:sz="10" w:space="1" w:color="16324F"/>
-        </w:pBdr>
-      </w:pPr>
-      <w:r>
-        <w:rPr>
-          <w:rFonts w:ascii="Calibri" w:hAnsi="Calibri" w:eastAsia="Calibri"/>
-          <w:b/>
-          <w:color w:val="16324F"/>
-          <w:sz w:val="20"/>
-        </w:rPr>
-        <w:t>SKILLS</w:t>
-      </w:r>
-    </w:p>
-    <w:p>
-      <w:pPr>
-        <w:spacing w:before="20"/>
-      </w:pPr>
-      <w:r>
-        <w:rPr>
-          <w:rFonts w:ascii="Calibri" w:hAnsi="Calibri" w:eastAsia="Calibri"/>
-          <w:b w:val="0"/>
-          <w:color w:val="0F1C2E"/>
-          <w:sz w:val="18"/>
-        </w:rPr>
-        <w:t>HTML, CSS, JavaScript  ·  React, Node.js  ·  Python  ·  REST APIs &amp; JSON  ·  Web Scraping &amp; Automation  ·  Marketplace Integrations  ·  Docker basics  ·  Git &amp; GitHub</w:t>
-      </w:r>
-    </w:p>
+    <w:tbl>
+      <w:tblPr>
+        <w:tblW w:type="auto" w:w="0"/>
+        <w:tblLayout w:type="fixed"/>
+        <w:tblLook w:firstColumn="1" w:firstRow="1" w:lastColumn="0" w:lastRow="0" w:noHBand="0" w:noVBand="1" w:val="04A0"/>
+      </w:tblPr>
+      <w:tblGrid>
+        <w:gridCol w:w="5018"/>
+        <w:gridCol w:w="5018"/>
+      </w:tblGrid>
+      <w:tr>
+        <w:tc>
+          <w:tcPr>
+            <w:tcW w:type="dxa" w:w="6552"/>
+            <w:tcMar>
+              <w:top w:w="0" w:type="dxa"/>
+              <w:left w:w="0" w:type="dxa"/>
+              <w:bottom w:w="0" w:type="dxa"/>
+              <w:right w:w="120" w:type="dxa"/>
+            </w:tcMar>
+          </w:tcPr>
+          <w:p>
+            <w:pPr>
+              <w:spacing w:after="60"/>
+              <w:pBdr>
+                <w:bottom w:val="single" w:sz="10" w:space="1" w:color="1A1A1A"/>
+              </w:pBdr>
+            </w:pPr>
+            <w:r>
+              <w:rPr>
+                <w:rFonts w:ascii="Calibri" w:hAnsi="Calibri" w:eastAsia="Calibri"/>
+                <w:b/>
+                <w:sz w:val="20"/>
+              </w:rPr>
+              <w:t>SELECTED WORK &amp; PROJECTS</w:t>
+            </w:r>
+          </w:p>
+          <w:p>
+            <w:pPr>
+              <w:spacing w:before="120" w:after="0"/>
+            </w:pPr>
+            <w:r>
+              <w:rPr>
+                <w:rFonts w:ascii="Calibri" w:hAnsi="Calibri" w:eastAsia="Calibri"/>
+                <w:b/>
+                <w:sz w:val="20"/>
+              </w:rPr>
+              <w:t>LogAI — Final Year Project</w:t>
+            </w:r>
+            <w:r>
+              <w:rPr>
+                <w:rFonts w:ascii="Calibri" w:hAnsi="Calibri" w:eastAsia="Calibri"/>
+                <w:b w:val="0"/>
+                <w:color w:val="4A4A4A"/>
+                <w:sz w:val="16"/>
+              </w:rPr>
+              <w:tab/>
+              <w:t>2025 – Present</w:t>
+            </w:r>
+          </w:p>
+          <w:p>
+            <w:pPr>
+              <w:spacing w:before="0" w:after="20"/>
+            </w:pPr>
+            <w:r>
+              <w:rPr>
+                <w:rFonts w:ascii="Calibri" w:hAnsi="Calibri" w:eastAsia="Calibri"/>
+                <w:b/>
+                <w:color w:val="1A1A1A"/>
+                <w:sz w:val="16"/>
+              </w:rPr>
+              <w:t>AI · BACKEND · FRONTEND · DOCKER</w:t>
+            </w:r>
+          </w:p>
+          <w:p>
+            <w:pPr>
+              <w:pStyle w:val="ListBullet"/>
+              <w:spacing w:before="0" w:after="0"/>
+            </w:pPr>
+            <w:r>
+              <w:rPr>
+                <w:rFonts w:ascii="Calibri" w:hAnsi="Calibri" w:eastAsia="Calibri"/>
+                <w:b w:val="0"/>
+                <w:color w:val="4A4A4A"/>
+                <w:sz w:val="16"/>
+              </w:rPr>
+              <w:t>Building an AI-assisted logging and operations platform</w:t>
+            </w:r>
+          </w:p>
+          <w:p>
+            <w:pPr>
+              <w:pStyle w:val="ListBullet"/>
+              <w:spacing w:before="0" w:after="0"/>
+            </w:pPr>
+            <w:r>
+              <w:rPr>
+                <w:rFonts w:ascii="Calibri" w:hAnsi="Calibri" w:eastAsia="Calibri"/>
+                <w:b w:val="0"/>
+                <w:color w:val="4A4A4A"/>
+                <w:sz w:val="16"/>
+              </w:rPr>
+              <w:t>Developed auth service, backend APIs, and frontend application</w:t>
+            </w:r>
+          </w:p>
+          <w:p>
+            <w:pPr>
+              <w:pStyle w:val="ListBullet"/>
+              <w:spacing w:before="0" w:after="0"/>
+            </w:pPr>
+            <w:r>
+              <w:rPr>
+                <w:rFonts w:ascii="Calibri" w:hAnsi="Calibri" w:eastAsia="Calibri"/>
+                <w:b w:val="0"/>
+                <w:color w:val="4A4A4A"/>
+                <w:sz w:val="16"/>
+              </w:rPr>
+              <w:t>Integrated datasets, demo shop flows, and Docker-based deployment</w:t>
+            </w:r>
+          </w:p>
+          <w:p>
+            <w:pPr>
+              <w:spacing w:before="120" w:after="0"/>
+            </w:pPr>
+            <w:r>
+              <w:rPr>
+                <w:rFonts w:ascii="Calibri" w:hAnsi="Calibri" w:eastAsia="Calibri"/>
+                <w:b/>
+                <w:sz w:val="20"/>
+              </w:rPr>
+              <w:t>Reverb Marketplace Platform</w:t>
+            </w:r>
+            <w:r>
+              <w:rPr>
+                <w:rFonts w:ascii="Calibri" w:hAnsi="Calibri" w:eastAsia="Calibri"/>
+                <w:b w:val="0"/>
+                <w:color w:val="4A4A4A"/>
+                <w:sz w:val="16"/>
+              </w:rPr>
+              <w:tab/>
+              <w:t>Full-Stack · Automation</w:t>
+            </w:r>
+          </w:p>
+          <w:p>
+            <w:pPr>
+              <w:spacing w:before="0" w:after="20"/>
+            </w:pPr>
+            <w:r>
+              <w:rPr>
+                <w:rFonts w:ascii="Calibri" w:hAnsi="Calibri" w:eastAsia="Calibri"/>
+                <w:b/>
+                <w:color w:val="1A1A1A"/>
+                <w:sz w:val="16"/>
+              </w:rPr>
+              <w:t>WEBSITE &amp; LISTING AUTOMATION</w:t>
+            </w:r>
+          </w:p>
+          <w:p>
+            <w:pPr>
+              <w:pStyle w:val="ListBullet"/>
+              <w:spacing w:before="0" w:after="0"/>
+            </w:pPr>
+            <w:r>
+              <w:rPr>
+                <w:rFonts w:ascii="Calibri" w:hAnsi="Calibri" w:eastAsia="Calibri"/>
+                <w:b w:val="0"/>
+                <w:color w:val="4A4A4A"/>
+                <w:sz w:val="16"/>
+              </w:rPr>
+              <w:t>Built Reverb-focused frontend and backend website features</w:t>
+            </w:r>
+          </w:p>
+          <w:p>
+            <w:pPr>
+              <w:pStyle w:val="ListBullet"/>
+              <w:spacing w:before="0" w:after="0"/>
+            </w:pPr>
+            <w:r>
+              <w:rPr>
+                <w:rFonts w:ascii="Calibri" w:hAnsi="Calibri" w:eastAsia="Calibri"/>
+                <w:b w:val="0"/>
+                <w:color w:val="4A4A4A"/>
+                <w:sz w:val="16"/>
+              </w:rPr>
+              <w:t>Automated listing flows to format and publish product data at scale</w:t>
+            </w:r>
+          </w:p>
+          <w:p>
+            <w:pPr>
+              <w:pStyle w:val="ListBullet"/>
+              <w:spacing w:before="0" w:after="0"/>
+            </w:pPr>
+            <w:r>
+              <w:rPr>
+                <w:rFonts w:ascii="Calibri" w:hAnsi="Calibri" w:eastAsia="Calibri"/>
+                <w:b w:val="0"/>
+                <w:color w:val="4A4A4A"/>
+                <w:sz w:val="16"/>
+              </w:rPr>
+              <w:t>Improved marketplace selling operations through reusable tooling</w:t>
+            </w:r>
+          </w:p>
+          <w:p>
+            <w:pPr>
+              <w:spacing w:before="120" w:after="0"/>
+            </w:pPr>
+            <w:r>
+              <w:rPr>
+                <w:rFonts w:ascii="Calibri" w:hAnsi="Calibri" w:eastAsia="Calibri"/>
+                <w:b/>
+                <w:sz w:val="20"/>
+              </w:rPr>
+              <w:t>Multi-Marketplace Scrapers &amp; Formatters</w:t>
+            </w:r>
+            <w:r>
+              <w:rPr>
+                <w:rFonts w:ascii="Calibri" w:hAnsi="Calibri" w:eastAsia="Calibri"/>
+                <w:b w:val="0"/>
+                <w:color w:val="4A4A4A"/>
+                <w:sz w:val="16"/>
+              </w:rPr>
+              <w:tab/>
+              <w:t>Python / JS · Pipelines</w:t>
+            </w:r>
+          </w:p>
+          <w:p>
+            <w:pPr>
+              <w:spacing w:before="0" w:after="20"/>
+            </w:pPr>
+            <w:r>
+              <w:rPr>
+                <w:rFonts w:ascii="Calibri" w:hAnsi="Calibri" w:eastAsia="Calibri"/>
+                <w:b/>
+                <w:color w:val="1A1A1A"/>
+                <w:sz w:val="16"/>
+              </w:rPr>
+              <w:t>DATA COLLECTION &amp; LISTING PREP</w:t>
+            </w:r>
+          </w:p>
+          <w:p>
+            <w:pPr>
+              <w:pStyle w:val="ListBullet"/>
+              <w:spacing w:before="0" w:after="0"/>
+            </w:pPr>
+            <w:r>
+              <w:rPr>
+                <w:rFonts w:ascii="Calibri" w:hAnsi="Calibri" w:eastAsia="Calibri"/>
+                <w:b w:val="0"/>
+                <w:color w:val="4A4A4A"/>
+                <w:sz w:val="16"/>
+              </w:rPr>
+              <w:t>Built scrapers for Amazon, eBay, Temu, Target, Sears, Walmart, Kogan, and more</w:t>
+            </w:r>
+          </w:p>
+          <w:p>
+            <w:pPr>
+              <w:pStyle w:val="ListBullet"/>
+              <w:spacing w:before="0" w:after="0"/>
+            </w:pPr>
+            <w:r>
+              <w:rPr>
+                <w:rFonts w:ascii="Calibri" w:hAnsi="Calibri" w:eastAsia="Calibri"/>
+                <w:b w:val="0"/>
+                <w:color w:val="4A4A4A"/>
+                <w:sz w:val="16"/>
+              </w:rPr>
+              <w:t>Created bulk listing formatters, description tools, and image utilities</w:t>
+            </w:r>
+          </w:p>
+          <w:p>
+            <w:pPr>
+              <w:pStyle w:val="ListBullet"/>
+              <w:spacing w:before="0" w:after="0"/>
+            </w:pPr>
+            <w:r>
+              <w:rPr>
+                <w:rFonts w:ascii="Calibri" w:hAnsi="Calibri" w:eastAsia="Calibri"/>
+                <w:b w:val="0"/>
+                <w:color w:val="4A4A4A"/>
+                <w:sz w:val="16"/>
+              </w:rPr>
+              <w:t>Supported high-volume marketplace listing and validation workflows</w:t>
+            </w:r>
+          </w:p>
+          <w:p>
+            <w:pPr>
+              <w:spacing w:before="120" w:after="0"/>
+            </w:pPr>
+            <w:r>
+              <w:rPr>
+                <w:rFonts w:ascii="Calibri" w:hAnsi="Calibri" w:eastAsia="Calibri"/>
+                <w:b/>
+                <w:sz w:val="20"/>
+              </w:rPr>
+              <w:t>WEsolucions — SaaS Store Sync</w:t>
+            </w:r>
+            <w:r>
+              <w:rPr>
+                <w:rFonts w:ascii="Calibri" w:hAnsi="Calibri" w:eastAsia="Calibri"/>
+                <w:b w:val="0"/>
+                <w:color w:val="4A4A4A"/>
+                <w:sz w:val="16"/>
+              </w:rPr>
+              <w:tab/>
+              <w:t>SaaS · Multi-channel</w:t>
+            </w:r>
+          </w:p>
+          <w:p>
+            <w:pPr>
+              <w:spacing w:before="0" w:after="20"/>
+            </w:pPr>
+            <w:r>
+              <w:rPr>
+                <w:rFonts w:ascii="Calibri" w:hAnsi="Calibri" w:eastAsia="Calibri"/>
+                <w:b/>
+                <w:color w:val="1A1A1A"/>
+                <w:sz w:val="16"/>
+              </w:rPr>
+              <w:t>STORE SYNC SYSTEMS</w:t>
+            </w:r>
+          </w:p>
+          <w:p>
+            <w:pPr>
+              <w:pStyle w:val="ListBullet"/>
+              <w:spacing w:before="0" w:after="0"/>
+            </w:pPr>
+            <w:r>
+              <w:rPr>
+                <w:rFonts w:ascii="Calibri" w:hAnsi="Calibri" w:eastAsia="Calibri"/>
+                <w:b w:val="0"/>
+                <w:color w:val="4A4A4A"/>
+                <w:sz w:val="16"/>
+              </w:rPr>
+              <w:t>Worked on SaaS systems that sync store and channel data</w:t>
+            </w:r>
+          </w:p>
+          <w:p>
+            <w:pPr>
+              <w:pStyle w:val="ListBullet"/>
+              <w:spacing w:before="0" w:after="0"/>
+            </w:pPr>
+            <w:r>
+              <w:rPr>
+                <w:rFonts w:ascii="Calibri" w:hAnsi="Calibri" w:eastAsia="Calibri"/>
+                <w:b w:val="0"/>
+                <w:color w:val="4A4A4A"/>
+                <w:sz w:val="16"/>
+              </w:rPr>
+              <w:t>Helped keep multi-marketplace product workflows consistent</w:t>
+            </w:r>
+          </w:p>
+          <w:p>
+            <w:pPr>
+              <w:spacing w:before="120" w:after="0"/>
+            </w:pPr>
+            <w:r>
+              <w:rPr>
+                <w:rFonts w:ascii="Calibri" w:hAnsi="Calibri" w:eastAsia="Calibri"/>
+                <w:b/>
+                <w:sz w:val="20"/>
+              </w:rPr>
+              <w:t>Sscomic &amp; Automation Tooling</w:t>
+            </w:r>
+            <w:r>
+              <w:rPr>
+                <w:rFonts w:ascii="Calibri" w:hAnsi="Calibri" w:eastAsia="Calibri"/>
+                <w:b w:val="0"/>
+                <w:color w:val="4A4A4A"/>
+                <w:sz w:val="16"/>
+              </w:rPr>
+              <w:tab/>
+              <w:t>Web · Apify · Workflows</w:t>
+            </w:r>
+          </w:p>
+          <w:p>
+            <w:pPr>
+              <w:spacing w:before="0" w:after="20"/>
+            </w:pPr>
+            <w:r>
+              <w:rPr>
+                <w:rFonts w:ascii="Calibri" w:hAnsi="Calibri" w:eastAsia="Calibri"/>
+                <w:b/>
+                <w:color w:val="1A1A1A"/>
+                <w:sz w:val="16"/>
+              </w:rPr>
+              <w:t>CLIENT WEB &amp; CHANNEL AUTOMATION</w:t>
+            </w:r>
+          </w:p>
+          <w:p>
+            <w:pPr>
+              <w:pStyle w:val="ListBullet"/>
+              <w:spacing w:before="0" w:after="0"/>
+            </w:pPr>
+            <w:r>
+              <w:rPr>
+                <w:rFonts w:ascii="Calibri" w:hAnsi="Calibri" w:eastAsia="Calibri"/>
+                <w:b w:val="0"/>
+                <w:color w:val="4A4A4A"/>
+                <w:sz w:val="16"/>
+              </w:rPr>
+              <w:t>Delivered Sscomic website/theme frontend work for client presentation</w:t>
+            </w:r>
+          </w:p>
+          <w:p>
+            <w:pPr>
+              <w:pStyle w:val="ListBullet"/>
+              <w:spacing w:before="0" w:after="0"/>
+            </w:pPr>
+            <w:r>
+              <w:rPr>
+                <w:rFonts w:ascii="Calibri" w:hAnsi="Calibri" w:eastAsia="Calibri"/>
+                <w:b w:val="0"/>
+                <w:color w:val="4A4A4A"/>
+                <w:sz w:val="16"/>
+              </w:rPr>
+              <w:t>Built Apify actors and channel workflow tools for automated publishing tasks</w:t>
+            </w:r>
+          </w:p>
+        </w:tc>
+        <w:tc>
+          <w:tcPr>
+            <w:tcW w:type="dxa" w:w="3672"/>
+            <w:tcMar>
+              <w:top w:w="0" w:type="dxa"/>
+              <w:left w:w="80" w:type="dxa"/>
+              <w:bottom w:w="0" w:type="dxa"/>
+              <w:right w:w="0" w:type="dxa"/>
+            </w:tcMar>
+          </w:tcPr>
+          <w:p>
+            <w:pPr>
+              <w:spacing w:after="60"/>
+              <w:pBdr>
+                <w:bottom w:val="single" w:sz="10" w:space="1" w:color="1A1A1A"/>
+              </w:pBdr>
+            </w:pPr>
+            <w:r>
+              <w:rPr>
+                <w:rFonts w:ascii="Calibri" w:hAnsi="Calibri" w:eastAsia="Calibri"/>
+                <w:b/>
+                <w:sz w:val="20"/>
+              </w:rPr>
+              <w:t>EDUCATION</w:t>
+            </w:r>
+          </w:p>
+          <w:p>
+            <w:pPr>
+              <w:spacing w:before="120" w:after="0"/>
+            </w:pPr>
+            <w:r>
+              <w:rPr>
+                <w:rFonts w:ascii="Calibri" w:hAnsi="Calibri" w:eastAsia="Calibri"/>
+                <w:b/>
+                <w:sz w:val="18"/>
+              </w:rPr>
+              <w:t>Sir Syed University of Engineering and Technology</w:t>
+            </w:r>
+          </w:p>
+          <w:p>
+            <w:pPr>
+              <w:spacing w:before="0" w:after="0"/>
+            </w:pPr>
+            <w:r>
+              <w:rPr>
+                <w:rFonts w:ascii="Calibri" w:hAnsi="Calibri" w:eastAsia="Calibri"/>
+                <w:b w:val="0"/>
+                <w:color w:val="4A4A4A"/>
+                <w:sz w:val="16"/>
+              </w:rPr>
+              <w:t>2022 – 2026</w:t>
+            </w:r>
+          </w:p>
+          <w:p>
+            <w:pPr>
+              <w:spacing w:before="0" w:after="0"/>
+            </w:pPr>
+            <w:r>
+              <w:rPr>
+                <w:rFonts w:ascii="Calibri" w:hAnsi="Calibri" w:eastAsia="Calibri"/>
+                <w:b/>
+                <w:sz w:val="16"/>
+              </w:rPr>
+              <w:t>BACHELORS IN COMPUTER ENGINEERING</w:t>
+            </w:r>
+          </w:p>
+          <w:p>
+            <w:pPr>
+              <w:spacing w:before="0"/>
+            </w:pPr>
+            <w:r>
+              <w:rPr>
+                <w:rFonts w:ascii="Calibri" w:hAnsi="Calibri" w:eastAsia="Calibri"/>
+                <w:b w:val="0"/>
+                <w:color w:val="4A4A4A"/>
+                <w:sz w:val="16"/>
+              </w:rPr>
+              <w:t>In progress</w:t>
+            </w:r>
+          </w:p>
+          <w:p>
+            <w:pPr>
+              <w:spacing w:before="120" w:after="0"/>
+            </w:pPr>
+            <w:r>
+              <w:rPr>
+                <w:rFonts w:ascii="Calibri" w:hAnsi="Calibri" w:eastAsia="Calibri"/>
+                <w:b/>
+                <w:sz w:val="18"/>
+              </w:rPr>
+              <w:t>Happy Place Group of Colleges</w:t>
+            </w:r>
+          </w:p>
+          <w:p>
+            <w:pPr>
+              <w:spacing w:before="0" w:after="0"/>
+            </w:pPr>
+            <w:r>
+              <w:rPr>
+                <w:rFonts w:ascii="Calibri" w:hAnsi="Calibri" w:eastAsia="Calibri"/>
+                <w:b w:val="0"/>
+                <w:color w:val="4A4A4A"/>
+                <w:sz w:val="16"/>
+              </w:rPr>
+              <w:t>2022</w:t>
+            </w:r>
+          </w:p>
+          <w:p>
+            <w:pPr>
+              <w:spacing w:before="0" w:after="0"/>
+            </w:pPr>
+            <w:r>
+              <w:rPr>
+                <w:rFonts w:ascii="Calibri" w:hAnsi="Calibri" w:eastAsia="Calibri"/>
+                <w:b/>
+                <w:sz w:val="16"/>
+              </w:rPr>
+              <w:t>INTERMEDIATE</w:t>
+            </w:r>
+          </w:p>
+          <w:p>
+            <w:pPr>
+              <w:spacing w:before="120" w:after="0"/>
+            </w:pPr>
+            <w:r>
+              <w:rPr>
+                <w:rFonts w:ascii="Calibri" w:hAnsi="Calibri" w:eastAsia="Calibri"/>
+                <w:b/>
+                <w:sz w:val="18"/>
+              </w:rPr>
+              <w:t>Metropolitan Foundation School</w:t>
+            </w:r>
+          </w:p>
+          <w:p>
+            <w:pPr>
+              <w:spacing w:before="0" w:after="0"/>
+            </w:pPr>
+            <w:r>
+              <w:rPr>
+                <w:rFonts w:ascii="Calibri" w:hAnsi="Calibri" w:eastAsia="Calibri"/>
+                <w:b w:val="0"/>
+                <w:color w:val="4A4A4A"/>
+                <w:sz w:val="16"/>
+              </w:rPr>
+              <w:t>2019</w:t>
+            </w:r>
+          </w:p>
+          <w:p>
+            <w:pPr>
+              <w:spacing w:before="0" w:after="0"/>
+            </w:pPr>
+            <w:r>
+              <w:rPr>
+                <w:rFonts w:ascii="Calibri" w:hAnsi="Calibri" w:eastAsia="Calibri"/>
+                <w:b/>
+                <w:sz w:val="16"/>
+              </w:rPr>
+              <w:t>MATRICULATION</w:t>
+            </w:r>
+          </w:p>
+          <w:p>
+            <w:pPr>
+              <w:spacing w:before="200" w:after="60"/>
+              <w:pBdr>
+                <w:bottom w:val="single" w:sz="10" w:space="1" w:color="1A1A1A"/>
+              </w:pBdr>
+            </w:pPr>
+            <w:r>
+              <w:rPr>
+                <w:rFonts w:ascii="Calibri" w:hAnsi="Calibri" w:eastAsia="Calibri"/>
+                <w:b/>
+                <w:sz w:val="20"/>
+              </w:rPr>
+              <w:t>SKILLS</w:t>
+            </w:r>
+          </w:p>
+          <w:p>
+            <w:pPr>
+              <w:spacing w:before="20" w:after="20"/>
+            </w:pPr>
+            <w:r>
+              <w:rPr>
+                <w:rFonts w:ascii="Calibri" w:hAnsi="Calibri" w:eastAsia="Calibri"/>
+                <w:b w:val="0"/>
+                <w:color w:val="4A4A4A"/>
+                <w:sz w:val="18"/>
+              </w:rPr>
+              <w:t>HTML, CSS, JavaScript</w:t>
+            </w:r>
+          </w:p>
+          <w:p>
+            <w:pPr>
+              <w:spacing w:before="20" w:after="20"/>
+            </w:pPr>
+            <w:r>
+              <w:rPr>
+                <w:rFonts w:ascii="Calibri" w:hAnsi="Calibri" w:eastAsia="Calibri"/>
+                <w:b w:val="0"/>
+                <w:color w:val="4A4A4A"/>
+                <w:sz w:val="18"/>
+              </w:rPr>
+              <w:t>React &amp; Node.js</w:t>
+            </w:r>
+          </w:p>
+          <w:p>
+            <w:pPr>
+              <w:spacing w:before="20" w:after="20"/>
+            </w:pPr>
+            <w:r>
+              <w:rPr>
+                <w:rFonts w:ascii="Calibri" w:hAnsi="Calibri" w:eastAsia="Calibri"/>
+                <w:b w:val="0"/>
+                <w:color w:val="4A4A4A"/>
+                <w:sz w:val="18"/>
+              </w:rPr>
+              <w:t>Python</w:t>
+            </w:r>
+          </w:p>
+          <w:p>
+            <w:pPr>
+              <w:spacing w:before="20" w:after="20"/>
+            </w:pPr>
+            <w:r>
+              <w:rPr>
+                <w:rFonts w:ascii="Calibri" w:hAnsi="Calibri" w:eastAsia="Calibri"/>
+                <w:b w:val="0"/>
+                <w:color w:val="4A4A4A"/>
+                <w:sz w:val="18"/>
+              </w:rPr>
+              <w:t>REST APIs &amp; JSON</w:t>
+            </w:r>
+          </w:p>
+          <w:p>
+            <w:pPr>
+              <w:spacing w:before="20" w:after="20"/>
+            </w:pPr>
+            <w:r>
+              <w:rPr>
+                <w:rFonts w:ascii="Calibri" w:hAnsi="Calibri" w:eastAsia="Calibri"/>
+                <w:b w:val="0"/>
+                <w:color w:val="4A4A4A"/>
+                <w:sz w:val="18"/>
+              </w:rPr>
+              <w:t>Web Scraping</w:t>
+            </w:r>
+          </w:p>
+          <w:p>
+            <w:pPr>
+              <w:spacing w:before="20" w:after="20"/>
+            </w:pPr>
+            <w:r>
+              <w:rPr>
+                <w:rFonts w:ascii="Calibri" w:hAnsi="Calibri" w:eastAsia="Calibri"/>
+                <w:b w:val="0"/>
+                <w:color w:val="4A4A4A"/>
+                <w:sz w:val="18"/>
+              </w:rPr>
+              <w:t>Marketplace Automation</w:t>
+            </w:r>
+          </w:p>
+          <w:p>
+            <w:pPr>
+              <w:spacing w:before="20" w:after="20"/>
+            </w:pPr>
+            <w:r>
+              <w:rPr>
+                <w:rFonts w:ascii="Calibri" w:hAnsi="Calibri" w:eastAsia="Calibri"/>
+                <w:b w:val="0"/>
+                <w:color w:val="4A4A4A"/>
+                <w:sz w:val="18"/>
+              </w:rPr>
+              <w:t>SaaS / Store Sync</w:t>
+            </w:r>
+          </w:p>
+          <w:p>
+            <w:pPr>
+              <w:spacing w:before="20" w:after="20"/>
+            </w:pPr>
+            <w:r>
+              <w:rPr>
+                <w:rFonts w:ascii="Calibri" w:hAnsi="Calibri" w:eastAsia="Calibri"/>
+                <w:b w:val="0"/>
+                <w:color w:val="4A4A4A"/>
+                <w:sz w:val="18"/>
+              </w:rPr>
+              <w:t>Docker basics</w:t>
+            </w:r>
+          </w:p>
+          <w:p>
+            <w:pPr>
+              <w:spacing w:before="20" w:after="20"/>
+            </w:pPr>
+            <w:r>
+              <w:rPr>
+                <w:rFonts w:ascii="Calibri" w:hAnsi="Calibri" w:eastAsia="Calibri"/>
+                <w:b w:val="0"/>
+                <w:color w:val="4A4A4A"/>
+                <w:sz w:val="18"/>
+              </w:rPr>
+              <w:t>Git &amp; GitHub</w:t>
+            </w:r>
+          </w:p>
+          <w:p>
+            <w:pPr>
+              <w:spacing w:before="200" w:after="60"/>
+              <w:pBdr>
+                <w:bottom w:val="single" w:sz="10" w:space="1" w:color="1A1A1A"/>
+              </w:pBdr>
+            </w:pPr>
+            <w:r>
+              <w:rPr>
+                <w:rFonts w:ascii="Calibri" w:hAnsi="Calibri" w:eastAsia="Calibri"/>
+                <w:b/>
+                <w:sz w:val="20"/>
+              </w:rPr>
+              <w:t>LINKS</w:t>
+            </w:r>
+          </w:p>
+          <w:p>
+            <w:pPr>
+              <w:spacing w:before="40"/>
+            </w:pPr>
+            <w:hyperlink r:id="rId11">
+              <w:r>
+                <w:rPr>
+                  <w:color w:val="1A1A1A"/>
+                  <w:u w:val="single"/>
+                  <w:sz w:val="18"/>
+                  <w:b/>
+                  <w:rFonts w:ascii="Calibri" w:hAnsi="Calibri"/>
+                </w:rPr>
+                <w:t>Portfolio</w:t>
+              </w:r>
+            </w:hyperlink>
+          </w:p>
+          <w:p>
+            <w:hyperlink r:id="rId10">
+              <w:r>
+                <w:rPr>
+                  <w:color w:val="1A1A1A"/>
+                  <w:u w:val="single"/>
+                  <w:sz w:val="18"/>
+                  <w:rFonts w:ascii="Calibri" w:hAnsi="Calibri"/>
+                </w:rPr>
+                <w:t>GitHub</w:t>
+              </w:r>
+            </w:hyperlink>
+          </w:p>
+          <w:p>
+            <w:hyperlink r:id="rId9">
+              <w:r>
+                <w:rPr>
+                  <w:color w:val="1A1A1A"/>
+                  <w:u w:val="single"/>
+                  <w:sz w:val="18"/>
+                  <w:rFonts w:ascii="Calibri" w:hAnsi="Calibri"/>
+                </w:rPr>
+                <w:t>LinkedIn</w:t>
+              </w:r>
+            </w:hyperlink>
+          </w:p>
+        </w:tc>
+      </w:tr>
+    </w:tbl>
     <w:sectPr>
       <w:pgSz w:w="11909" w:h="16834"/>
-      <w:pgMar w:top="720" w:right="864" w:bottom="720" w:left="864" w:header="720" w:footer="720" w:gutter="0"/>
+      <w:pgMar w:top="792" w:right="936" w:bottom="720" w:left="936" w:header="720" w:footer="720" w:gutter="0"/>
       <w:cols w:space="720"/>
       <w:docGrid w:linePitch="360"/>
     </w:sectPr>

</xml_diff>

<commit_message>
Use generic project titles on CV and harden page text visibility.
Co-authored-by: Cursor <cursoragent@cursor.com>
</commit_message>
<xml_diff>
--- a/Nauroz_Salim_CV.docx
+++ b/Nauroz_Salim_CV.docx
@@ -10,11 +10,11 @@
       <w:r>
         <w:rPr>
           <w:rFonts w:ascii="Calibri" w:hAnsi="Calibri" w:eastAsia="Calibri"/>
-          <w:b w:val="0"/>
+          <w:b/>
           <w:color w:val="4A4A4A"/>
-          <w:sz w:val="16"/>
+          <w:sz w:val="18"/>
         </w:rPr>
-        <w:t>F U L L - S T A C K   &amp;   A U T O M A T I O N   D E V E L O P E R</w:t>
+        <w:t>FULL-STACK &amp; AUTOMATION DEVELOPER</w:t>
       </w:r>
     </w:p>
     <w:p>
@@ -104,7 +104,6 @@
         <w:rPr>
           <w:rFonts w:ascii="Calibri" w:hAnsi="Calibri" w:eastAsia="Calibri"/>
           <w:b/>
-          <w:color w:val="1A1A1A"/>
           <w:sz w:val="20"/>
         </w:rPr>
         <w:t>PROFILE</w:t>
@@ -127,7 +126,6 @@
     <w:tbl>
       <w:tblPr>
         <w:tblW w:type="auto" w:w="0"/>
-        <w:tblLayout w:type="fixed"/>
         <w:tblLook w:firstColumn="1" w:firstRow="1" w:lastColumn="0" w:lastRow="0" w:noHBand="0" w:noVBand="1" w:val="04A0"/>
       </w:tblPr>
       <w:tblGrid>
@@ -171,7 +169,7 @@
                 <w:b/>
                 <w:sz w:val="20"/>
               </w:rPr>
-              <w:t>LogAI — Final Year Project</w:t>
+              <w:t>AI Operations Logging Platform</w:t>
             </w:r>
             <w:r>
               <w:rPr>
@@ -181,7 +179,7 @@
                 <w:sz w:val="16"/>
               </w:rPr>
               <w:tab/>
-              <w:t>2025 – Present</w:t>
+              <w:t>Final Year Project</w:t>
             </w:r>
           </w:p>
           <w:p>
@@ -210,7 +208,7 @@
                 <w:color w:val="4A4A4A"/>
                 <w:sz w:val="16"/>
               </w:rPr>
-              <w:t>Building an AI-assisted logging and operations platform</w:t>
+              <w:t>Built an AI-assisted logging and operations platform</w:t>
             </w:r>
           </w:p>
           <w:p>
@@ -240,7 +238,7 @@
                 <w:color w:val="4A4A4A"/>
                 <w:sz w:val="16"/>
               </w:rPr>
-              <w:t>Integrated datasets, demo shop flows, and Docker-based deployment</w:t>
+              <w:t>Integrated datasets, demo flows, and Docker-based deployment</w:t>
             </w:r>
           </w:p>
           <w:p>
@@ -253,7 +251,7 @@
                 <w:b/>
                 <w:sz w:val="20"/>
               </w:rPr>
-              <w:t>Reverb Marketplace Platform</w:t>
+              <w:t>Marketplace Storefront &amp; Listing Automation</w:t>
             </w:r>
             <w:r>
               <w:rPr>
@@ -277,7 +275,7 @@
                 <w:color w:val="1A1A1A"/>
                 <w:sz w:val="16"/>
               </w:rPr>
-              <w:t>WEBSITE &amp; LISTING AUTOMATION</w:t>
+              <w:t>WEBSITE &amp; LISTING PIPELINES</w:t>
             </w:r>
           </w:p>
           <w:p>
@@ -292,7 +290,7 @@
                 <w:color w:val="4A4A4A"/>
                 <w:sz w:val="16"/>
               </w:rPr>
-              <w:t>Built Reverb-focused frontend and backend website features</w:t>
+              <w:t>Built marketplace storefront frontend and backend features</w:t>
             </w:r>
           </w:p>
           <w:p>
@@ -322,7 +320,7 @@
                 <w:color w:val="4A4A4A"/>
                 <w:sz w:val="16"/>
               </w:rPr>
-              <w:t>Improved marketplace selling operations through reusable tooling</w:t>
+              <w:t>Improved selling operations through reusable tooling</w:t>
             </w:r>
           </w:p>
           <w:p>
@@ -335,7 +333,7 @@
                 <w:b/>
                 <w:sz w:val="20"/>
               </w:rPr>
-              <w:t>Multi-Marketplace Scrapers &amp; Formatters</w:t>
+              <w:t>Multi-Channel Scraping &amp; Listing Pipelines</w:t>
             </w:r>
             <w:r>
               <w:rPr>
@@ -345,7 +343,7 @@
                 <w:sz w:val="16"/>
               </w:rPr>
               <w:tab/>
-              <w:t>Python / JS · Pipelines</w:t>
+              <w:t>Python / JS · Data Pipelines</w:t>
             </w:r>
           </w:p>
           <w:p>
@@ -374,7 +372,7 @@
                 <w:color w:val="4A4A4A"/>
                 <w:sz w:val="16"/>
               </w:rPr>
-              <w:t>Built scrapers for Amazon, eBay, Temu, Target, Sears, Walmart, Kogan, and more</w:t>
+              <w:t>Built scrapers and data extractors across multiple online marketplaces</w:t>
             </w:r>
           </w:p>
           <w:p>
@@ -404,7 +402,7 @@
                 <w:color w:val="4A4A4A"/>
                 <w:sz w:val="16"/>
               </w:rPr>
-              <w:t>Supported high-volume marketplace listing and validation workflows</w:t>
+              <w:t>Supported high-volume listing preparation and validation workflows</w:t>
             </w:r>
           </w:p>
           <w:p>
@@ -417,7 +415,7 @@
                 <w:b/>
                 <w:sz w:val="20"/>
               </w:rPr>
-              <w:t>WEsolucions — SaaS Store Sync</w:t>
+              <w:t>SaaS Multi-Channel Store Sync</w:t>
             </w:r>
             <w:r>
               <w:rPr>
@@ -427,7 +425,7 @@
                 <w:sz w:val="16"/>
               </w:rPr>
               <w:tab/>
-              <w:t>SaaS · Multi-channel</w:t>
+              <w:t>SaaS · Integrations</w:t>
             </w:r>
           </w:p>
           <w:p>
@@ -471,7 +469,7 @@
                 <w:color w:val="4A4A4A"/>
                 <w:sz w:val="16"/>
               </w:rPr>
-              <w:t>Helped keep multi-marketplace product workflows consistent</w:t>
+              <w:t>Helped keep multi-channel product workflows consistent</w:t>
             </w:r>
           </w:p>
           <w:p>
@@ -484,7 +482,7 @@
                 <w:b/>
                 <w:sz w:val="20"/>
               </w:rPr>
-              <w:t>Sscomic &amp; Automation Tooling</w:t>
+              <w:t>Client Website Delivery &amp; Workflow Automation</w:t>
             </w:r>
             <w:r>
               <w:rPr>
@@ -494,7 +492,7 @@
                 <w:sz w:val="16"/>
               </w:rPr>
               <w:tab/>
-              <w:t>Web · Apify · Workflows</w:t>
+              <w:t>Web · Automation</w:t>
             </w:r>
           </w:p>
           <w:p>
@@ -508,7 +506,7 @@
                 <w:color w:val="1A1A1A"/>
                 <w:sz w:val="16"/>
               </w:rPr>
-              <w:t>CLIENT WEB &amp; CHANNEL AUTOMATION</w:t>
+              <w:t>FRONTEND &amp; CHANNEL TOOLING</w:t>
             </w:r>
           </w:p>
           <w:p>
@@ -523,7 +521,7 @@
                 <w:color w:val="4A4A4A"/>
                 <w:sz w:val="16"/>
               </w:rPr>
-              <w:t>Delivered Sscomic website/theme frontend work for client presentation</w:t>
+              <w:t>Delivered client website/theme frontend work for online presentation</w:t>
             </w:r>
           </w:p>
           <w:p>
@@ -538,7 +536,7 @@
                 <w:color w:val="4A4A4A"/>
                 <w:sz w:val="16"/>
               </w:rPr>
-              <w:t>Built Apify actors and channel workflow tools for automated publishing tasks</w:t>
+              <w:t>Built cloud automation actors and channel workflow tools for publishing tasks</w:t>
             </w:r>
           </w:p>
         </w:tc>

</xml_diff>

<commit_message>
Expand CV fonts, spacing, and content to fill a complete one-page layout.
Co-authored-by: Cursor <cursoragent@cursor.com>
</commit_message>
<xml_diff>
--- a/Nauroz_Salim_CV.docx
+++ b/Nauroz_Salim_CV.docx
@@ -4,22 +4,22 @@
   <w:body>
     <w:p>
       <w:pPr>
-        <w:spacing w:after="40"/>
+        <w:spacing w:after="80"/>
         <w:jc w:val="center"/>
       </w:pPr>
       <w:r>
         <w:rPr>
           <w:rFonts w:ascii="Calibri" w:hAnsi="Calibri" w:eastAsia="Calibri"/>
           <w:b/>
-          <w:color w:val="4A4A4A"/>
-          <w:sz w:val="18"/>
+          <w:color w:val="444444"/>
+          <w:sz w:val="20"/>
         </w:rPr>
         <w:t>FULL-STACK &amp; AUTOMATION DEVELOPER</w:t>
       </w:r>
     </w:p>
     <w:p>
       <w:pPr>
-        <w:spacing w:before="40" w:after="40"/>
+        <w:spacing w:before="40" w:after="80"/>
         <w:jc w:val="center"/>
       </w:pPr>
       <w:r>
@@ -27,17 +27,17 @@
           <w:rFonts w:ascii="Georgia" w:hAnsi="Georgia" w:eastAsia="Georgia"/>
           <w:b/>
           <w:color w:val="1A1A1A"/>
-          <w:sz w:val="44"/>
+          <w:sz w:val="52"/>
         </w:rPr>
         <w:t>NAUROZ SALIM</w:t>
       </w:r>
     </w:p>
     <w:p>
       <w:pPr>
-        <w:spacing w:before="40" w:after="120"/>
+        <w:spacing w:before="40" w:after="200"/>
         <w:jc w:val="center"/>
         <w:pBdr>
-          <w:bottom w:val="single" w:sz="8" w:space="1" w:color="CFCFCF"/>
+          <w:bottom w:val="single" w:sz="10" w:space="1" w:color="CFCFCF"/>
         </w:pBdr>
       </w:pPr>
       <w:hyperlink r:id="rId9">
@@ -45,7 +45,7 @@
           <w:rPr>
             <w:color w:val="1A1A1A"/>
             <w:u w:val="single"/>
-            <w:sz w:val="18"/>
+            <w:sz w:val="20"/>
             <w:rFonts w:ascii="Calibri" w:hAnsi="Calibri"/>
           </w:rPr>
           <w:t>linkedin.com/in/navrozsalim</w:t>
@@ -56,7 +56,7 @@
           <w:rFonts w:ascii="Calibri" w:hAnsi="Calibri" w:eastAsia="Calibri"/>
           <w:b w:val="0"/>
           <w:color w:val="B4B4B4"/>
-          <w:sz w:val="18"/>
+          <w:sz w:val="20"/>
         </w:rPr>
         <w:t xml:space="preserve">  |  </w:t>
       </w:r>
@@ -65,7 +65,7 @@
           <w:rPr>
             <w:color w:val="1A1A1A"/>
             <w:u w:val="single"/>
-            <w:sz w:val="18"/>
+            <w:sz w:val="20"/>
             <w:rFonts w:ascii="Calibri" w:hAnsi="Calibri"/>
           </w:rPr>
           <w:t>github.com/NavrozSalim</w:t>
@@ -76,7 +76,7 @@
           <w:rFonts w:ascii="Calibri" w:hAnsi="Calibri" w:eastAsia="Calibri"/>
           <w:b w:val="0"/>
           <w:color w:val="B4B4B4"/>
-          <w:sz w:val="18"/>
+          <w:sz w:val="20"/>
         </w:rPr>
         <w:t xml:space="preserve">  |  </w:t>
       </w:r>
@@ -85,7 +85,7 @@
           <w:rPr>
             <w:color w:val="1A1A1A"/>
             <w:u w:val="single"/>
-            <w:sz w:val="18"/>
+            <w:sz w:val="20"/>
             <w:b/>
             <w:rFonts w:ascii="Calibri" w:hAnsi="Calibri"/>
           </w:rPr>
@@ -95,32 +95,32 @@
     </w:p>
     <w:p>
       <w:pPr>
-        <w:spacing w:before="120" w:after="60"/>
+        <w:spacing w:before="160" w:after="80"/>
         <w:pBdr>
-          <w:bottom w:val="single" w:sz="10" w:space="1" w:color="1A1A1A"/>
+          <w:bottom w:val="single" w:sz="12" w:space="1" w:color="1A1A1A"/>
         </w:pBdr>
       </w:pPr>
       <w:r>
         <w:rPr>
           <w:rFonts w:ascii="Calibri" w:hAnsi="Calibri" w:eastAsia="Calibri"/>
           <w:b/>
-          <w:sz w:val="20"/>
+          <w:sz w:val="22"/>
         </w:rPr>
         <w:t>PROFILE</w:t>
       </w:r>
     </w:p>
     <w:p>
       <w:pPr>
-        <w:spacing w:after="80"/>
+        <w:spacing w:after="160"/>
       </w:pPr>
       <w:r>
         <w:rPr>
           <w:rFonts w:ascii="Calibri" w:hAnsi="Calibri" w:eastAsia="Calibri"/>
           <w:b w:val="0"/>
-          <w:color w:val="4A4A4A"/>
-          <w:sz w:val="18"/>
+          <w:color w:val="444444"/>
+          <w:sz w:val="20"/>
         </w:rPr>
-        <w:t>Computer Engineering student with hands-on experience building full-stack products, marketplace automation systems, web scrapers, and SaaS sync tools. Skilled in JavaScript, Python, APIs, and shipping practical solutions for e-commerce operations and AI-assisted workflows.</w:t>
+        <w:t>Computer Engineering student with hands-on experience building full-stack products, marketplace automation systems, web scrapers, and SaaS sync tools. Skilled in JavaScript, Python, APIs, and shipping practical solutions for e-commerce operations and AI-assisted workflows. Focused on reliable tooling, clean UI, and automation that saves real operational time.</w:t>
       </w:r>
     </w:p>
     <w:tbl>
@@ -129,45 +129,45 @@
         <w:tblLook w:firstColumn="1" w:firstRow="1" w:lastColumn="0" w:lastRow="0" w:noHBand="0" w:noVBand="1" w:val="04A0"/>
       </w:tblPr>
       <w:tblGrid>
-        <w:gridCol w:w="5018"/>
-        <w:gridCol w:w="5018"/>
+        <w:gridCol w:w="5090"/>
+        <w:gridCol w:w="5090"/>
       </w:tblGrid>
       <w:tr>
         <w:tc>
           <w:tcPr>
-            <w:tcW w:type="dxa" w:w="6552"/>
+            <w:tcW w:type="dxa" w:w="6624"/>
             <w:tcMar>
               <w:top w:w="0" w:type="dxa"/>
               <w:left w:w="0" w:type="dxa"/>
               <w:bottom w:w="0" w:type="dxa"/>
-              <w:right w:w="120" w:type="dxa"/>
+              <w:right w:w="140" w:type="dxa"/>
             </w:tcMar>
           </w:tcPr>
           <w:p>
             <w:pPr>
-              <w:spacing w:after="60"/>
+              <w:spacing w:after="100"/>
               <w:pBdr>
-                <w:bottom w:val="single" w:sz="10" w:space="1" w:color="1A1A1A"/>
+                <w:bottom w:val="single" w:sz="12" w:space="1" w:color="1A1A1A"/>
               </w:pBdr>
             </w:pPr>
             <w:r>
               <w:rPr>
                 <w:rFonts w:ascii="Calibri" w:hAnsi="Calibri" w:eastAsia="Calibri"/>
                 <w:b/>
-                <w:sz w:val="20"/>
+                <w:sz w:val="22"/>
               </w:rPr>
               <w:t>SELECTED WORK &amp; PROJECTS</w:t>
             </w:r>
           </w:p>
           <w:p>
             <w:pPr>
-              <w:spacing w:before="120" w:after="0"/>
+              <w:spacing w:before="180" w:after="0"/>
             </w:pPr>
             <w:r>
               <w:rPr>
                 <w:rFonts w:ascii="Calibri" w:hAnsi="Calibri" w:eastAsia="Calibri"/>
                 <w:b/>
-                <w:sz w:val="20"/>
+                <w:sz w:val="22"/>
               </w:rPr>
               <w:t>AI Operations Logging Platform</w:t>
             </w:r>
@@ -175,8 +175,8 @@
               <w:rPr>
                 <w:rFonts w:ascii="Calibri" w:hAnsi="Calibri" w:eastAsia="Calibri"/>
                 <w:b w:val="0"/>
-                <w:color w:val="4A4A4A"/>
-                <w:sz w:val="16"/>
+                <w:color w:val="444444"/>
+                <w:sz w:val="18"/>
               </w:rPr>
               <w:tab/>
               <w:t>Final Year Project</w:t>
@@ -184,13 +184,12 @@
           </w:p>
           <w:p>
             <w:pPr>
-              <w:spacing w:before="0" w:after="20"/>
+              <w:spacing w:before="20" w:after="40"/>
             </w:pPr>
             <w:r>
               <w:rPr>
                 <w:rFonts w:ascii="Calibri" w:hAnsi="Calibri" w:eastAsia="Calibri"/>
                 <w:b/>
-                <w:color w:val="1A1A1A"/>
                 <w:sz w:val="16"/>
               </w:rPr>
               <w:t>AI · BACKEND · FRONTEND · DOCKER</w:t>
@@ -199,57 +198,72 @@
           <w:p>
             <w:pPr>
               <w:pStyle w:val="ListBullet"/>
-              <w:spacing w:before="0" w:after="0"/>
+              <w:spacing w:before="20" w:after="20"/>
             </w:pPr>
             <w:r>
               <w:rPr>
                 <w:rFonts w:ascii="Calibri" w:hAnsi="Calibri" w:eastAsia="Calibri"/>
                 <w:b w:val="0"/>
-                <w:color w:val="4A4A4A"/>
-                <w:sz w:val="16"/>
+                <w:color w:val="444444"/>
+                <w:sz w:val="18"/>
               </w:rPr>
-              <w:t>Built an AI-assisted logging and operations platform</w:t>
+              <w:t>Built an AI-assisted logging and operations platform end to end</w:t>
             </w:r>
           </w:p>
           <w:p>
             <w:pPr>
               <w:pStyle w:val="ListBullet"/>
-              <w:spacing w:before="0" w:after="0"/>
+              <w:spacing w:before="20" w:after="20"/>
             </w:pPr>
             <w:r>
               <w:rPr>
                 <w:rFonts w:ascii="Calibri" w:hAnsi="Calibri" w:eastAsia="Calibri"/>
                 <w:b w:val="0"/>
-                <w:color w:val="4A4A4A"/>
-                <w:sz w:val="16"/>
+                <w:color w:val="444444"/>
+                <w:sz w:val="18"/>
               </w:rPr>
-              <w:t>Developed auth service, backend APIs, and frontend application</w:t>
+              <w:t>Developed auth service, backend APIs, and a responsive frontend app</w:t>
             </w:r>
           </w:p>
           <w:p>
             <w:pPr>
               <w:pStyle w:val="ListBullet"/>
-              <w:spacing w:before="0" w:after="0"/>
+              <w:spacing w:before="20" w:after="20"/>
             </w:pPr>
             <w:r>
               <w:rPr>
                 <w:rFonts w:ascii="Calibri" w:hAnsi="Calibri" w:eastAsia="Calibri"/>
                 <w:b w:val="0"/>
-                <w:color w:val="4A4A4A"/>
-                <w:sz w:val="16"/>
+                <w:color w:val="444444"/>
+                <w:sz w:val="18"/>
               </w:rPr>
-              <w:t>Integrated datasets, demo flows, and Docker-based deployment</w:t>
+              <w:t>Integrated datasets, demo workflows, and Docker-based deployment setup</w:t>
             </w:r>
           </w:p>
           <w:p>
             <w:pPr>
-              <w:spacing w:before="120" w:after="0"/>
+              <w:pStyle w:val="ListBullet"/>
+              <w:spacing w:before="20" w:after="20"/>
+            </w:pPr>
+            <w:r>
+              <w:rPr>
+                <w:rFonts w:ascii="Calibri" w:hAnsi="Calibri" w:eastAsia="Calibri"/>
+                <w:b w:val="0"/>
+                <w:color w:val="444444"/>
+                <w:sz w:val="18"/>
+              </w:rPr>
+              <w:t>Structured services for authentication, core APIs, and UI delivery</w:t>
+            </w:r>
+          </w:p>
+          <w:p>
+            <w:pPr>
+              <w:spacing w:before="180" w:after="0"/>
             </w:pPr>
             <w:r>
               <w:rPr>
                 <w:rFonts w:ascii="Calibri" w:hAnsi="Calibri" w:eastAsia="Calibri"/>
                 <w:b/>
-                <w:sz w:val="20"/>
+                <w:sz w:val="22"/>
               </w:rPr>
               <w:t>Marketplace Storefront &amp; Listing Automation</w:t>
             </w:r>
@@ -257,8 +271,8 @@
               <w:rPr>
                 <w:rFonts w:ascii="Calibri" w:hAnsi="Calibri" w:eastAsia="Calibri"/>
                 <w:b w:val="0"/>
-                <w:color w:val="4A4A4A"/>
-                <w:sz w:val="16"/>
+                <w:color w:val="444444"/>
+                <w:sz w:val="18"/>
               </w:rPr>
               <w:tab/>
               <w:t>Full-Stack · Automation</w:t>
@@ -266,13 +280,12 @@
           </w:p>
           <w:p>
             <w:pPr>
-              <w:spacing w:before="0" w:after="20"/>
+              <w:spacing w:before="20" w:after="40"/>
             </w:pPr>
             <w:r>
               <w:rPr>
                 <w:rFonts w:ascii="Calibri" w:hAnsi="Calibri" w:eastAsia="Calibri"/>
                 <w:b/>
-                <w:color w:val="1A1A1A"/>
                 <w:sz w:val="16"/>
               </w:rPr>
               <w:t>WEBSITE &amp; LISTING PIPELINES</w:t>
@@ -281,14 +294,14 @@
           <w:p>
             <w:pPr>
               <w:pStyle w:val="ListBullet"/>
-              <w:spacing w:before="0" w:after="0"/>
+              <w:spacing w:before="20" w:after="20"/>
             </w:pPr>
             <w:r>
               <w:rPr>
                 <w:rFonts w:ascii="Calibri" w:hAnsi="Calibri" w:eastAsia="Calibri"/>
                 <w:b w:val="0"/>
-                <w:color w:val="4A4A4A"/>
-                <w:sz w:val="16"/>
+                <w:color w:val="444444"/>
+                <w:sz w:val="18"/>
               </w:rPr>
               <w:t>Built marketplace storefront frontend and backend features</w:t>
             </w:r>
@@ -296,14 +309,14 @@
           <w:p>
             <w:pPr>
               <w:pStyle w:val="ListBullet"/>
-              <w:spacing w:before="0" w:after="0"/>
+              <w:spacing w:before="20" w:after="20"/>
             </w:pPr>
             <w:r>
               <w:rPr>
                 <w:rFonts w:ascii="Calibri" w:hAnsi="Calibri" w:eastAsia="Calibri"/>
                 <w:b w:val="0"/>
-                <w:color w:val="4A4A4A"/>
-                <w:sz w:val="16"/>
+                <w:color w:val="444444"/>
+                <w:sz w:val="18"/>
               </w:rPr>
               <w:t>Automated listing flows to format and publish product data at scale</w:t>
             </w:r>
@@ -311,27 +324,42 @@
           <w:p>
             <w:pPr>
               <w:pStyle w:val="ListBullet"/>
-              <w:spacing w:before="0" w:after="0"/>
+              <w:spacing w:before="20" w:after="20"/>
             </w:pPr>
             <w:r>
               <w:rPr>
                 <w:rFonts w:ascii="Calibri" w:hAnsi="Calibri" w:eastAsia="Calibri"/>
                 <w:b w:val="0"/>
-                <w:color w:val="4A4A4A"/>
-                <w:sz w:val="16"/>
+                <w:color w:val="444444"/>
+                <w:sz w:val="18"/>
               </w:rPr>
-              <w:t>Improved selling operations through reusable tooling</w:t>
+              <w:t>Improved selling operations through reusable formatting and publish tooling</w:t>
             </w:r>
           </w:p>
           <w:p>
             <w:pPr>
-              <w:spacing w:before="120" w:after="0"/>
+              <w:pStyle w:val="ListBullet"/>
+              <w:spacing w:before="20" w:after="20"/>
+            </w:pPr>
+            <w:r>
+              <w:rPr>
+                <w:rFonts w:ascii="Calibri" w:hAnsi="Calibri" w:eastAsia="Calibri"/>
+                <w:b w:val="0"/>
+                <w:color w:val="444444"/>
+                <w:sz w:val="18"/>
+              </w:rPr>
+              <w:t>Connected product data pipelines to reduce manual listing work</w:t>
+            </w:r>
+          </w:p>
+          <w:p>
+            <w:pPr>
+              <w:spacing w:before="180" w:after="0"/>
             </w:pPr>
             <w:r>
               <w:rPr>
                 <w:rFonts w:ascii="Calibri" w:hAnsi="Calibri" w:eastAsia="Calibri"/>
                 <w:b/>
-                <w:sz w:val="20"/>
+                <w:sz w:val="22"/>
               </w:rPr>
               <w:t>Multi-Channel Scraping &amp; Listing Pipelines</w:t>
             </w:r>
@@ -339,8 +367,8 @@
               <w:rPr>
                 <w:rFonts w:ascii="Calibri" w:hAnsi="Calibri" w:eastAsia="Calibri"/>
                 <w:b w:val="0"/>
-                <w:color w:val="4A4A4A"/>
-                <w:sz w:val="16"/>
+                <w:color w:val="444444"/>
+                <w:sz w:val="18"/>
               </w:rPr>
               <w:tab/>
               <w:t>Python / JS · Data Pipelines</w:t>
@@ -348,13 +376,12 @@
           </w:p>
           <w:p>
             <w:pPr>
-              <w:spacing w:before="0" w:after="20"/>
+              <w:spacing w:before="20" w:after="40"/>
             </w:pPr>
             <w:r>
               <w:rPr>
                 <w:rFonts w:ascii="Calibri" w:hAnsi="Calibri" w:eastAsia="Calibri"/>
                 <w:b/>
-                <w:color w:val="1A1A1A"/>
                 <w:sz w:val="16"/>
               </w:rPr>
               <w:t>DATA COLLECTION &amp; LISTING PREP</w:t>
@@ -363,14 +390,14 @@
           <w:p>
             <w:pPr>
               <w:pStyle w:val="ListBullet"/>
-              <w:spacing w:before="0" w:after="0"/>
+              <w:spacing w:before="20" w:after="20"/>
             </w:pPr>
             <w:r>
               <w:rPr>
                 <w:rFonts w:ascii="Calibri" w:hAnsi="Calibri" w:eastAsia="Calibri"/>
                 <w:b w:val="0"/>
-                <w:color w:val="4A4A4A"/>
-                <w:sz w:val="16"/>
+                <w:color w:val="444444"/>
+                <w:sz w:val="18"/>
               </w:rPr>
               <w:t>Built scrapers and data extractors across multiple online marketplaces</w:t>
             </w:r>
@@ -378,14 +405,14 @@
           <w:p>
             <w:pPr>
               <w:pStyle w:val="ListBullet"/>
-              <w:spacing w:before="0" w:after="0"/>
+              <w:spacing w:before="20" w:after="20"/>
             </w:pPr>
             <w:r>
               <w:rPr>
                 <w:rFonts w:ascii="Calibri" w:hAnsi="Calibri" w:eastAsia="Calibri"/>
                 <w:b w:val="0"/>
-                <w:color w:val="4A4A4A"/>
-                <w:sz w:val="16"/>
+                <w:color w:val="444444"/>
+                <w:sz w:val="18"/>
               </w:rPr>
               <w:t>Created bulk listing formatters, description tools, and image utilities</w:t>
             </w:r>
@@ -393,27 +420,42 @@
           <w:p>
             <w:pPr>
               <w:pStyle w:val="ListBullet"/>
-              <w:spacing w:before="0" w:after="0"/>
+              <w:spacing w:before="20" w:after="20"/>
             </w:pPr>
             <w:r>
               <w:rPr>
                 <w:rFonts w:ascii="Calibri" w:hAnsi="Calibri" w:eastAsia="Calibri"/>
                 <w:b w:val="0"/>
-                <w:color w:val="4A4A4A"/>
-                <w:sz w:val="16"/>
+                <w:color w:val="444444"/>
+                <w:sz w:val="18"/>
               </w:rPr>
               <w:t>Supported high-volume listing preparation and validation workflows</w:t>
             </w:r>
           </w:p>
           <w:p>
             <w:pPr>
-              <w:spacing w:before="120" w:after="0"/>
+              <w:pStyle w:val="ListBullet"/>
+              <w:spacing w:before="20" w:after="20"/>
+            </w:pPr>
+            <w:r>
+              <w:rPr>
+                <w:rFonts w:ascii="Calibri" w:hAnsi="Calibri" w:eastAsia="Calibri"/>
+                <w:b w:val="0"/>
+                <w:color w:val="444444"/>
+                <w:sz w:val="18"/>
+              </w:rPr>
+              <w:t>Standardized product fields for cleaner cross-channel listing output</w:t>
+            </w:r>
+          </w:p>
+          <w:p>
+            <w:pPr>
+              <w:spacing w:before="180" w:after="0"/>
             </w:pPr>
             <w:r>
               <w:rPr>
                 <w:rFonts w:ascii="Calibri" w:hAnsi="Calibri" w:eastAsia="Calibri"/>
                 <w:b/>
-                <w:sz w:val="20"/>
+                <w:sz w:val="22"/>
               </w:rPr>
               <w:t>SaaS Multi-Channel Store Sync</w:t>
             </w:r>
@@ -421,8 +463,8 @@
               <w:rPr>
                 <w:rFonts w:ascii="Calibri" w:hAnsi="Calibri" w:eastAsia="Calibri"/>
                 <w:b w:val="0"/>
-                <w:color w:val="4A4A4A"/>
-                <w:sz w:val="16"/>
+                <w:color w:val="444444"/>
+                <w:sz w:val="18"/>
               </w:rPr>
               <w:tab/>
               <w:t>SaaS · Integrations</w:t>
@@ -430,13 +472,12 @@
           </w:p>
           <w:p>
             <w:pPr>
-              <w:spacing w:before="0" w:after="20"/>
+              <w:spacing w:before="20" w:after="40"/>
             </w:pPr>
             <w:r>
               <w:rPr>
                 <w:rFonts w:ascii="Calibri" w:hAnsi="Calibri" w:eastAsia="Calibri"/>
                 <w:b/>
-                <w:color w:val="1A1A1A"/>
                 <w:sz w:val="16"/>
               </w:rPr>
               <w:t>STORE SYNC SYSTEMS</w:t>
@@ -445,14 +486,14 @@
           <w:p>
             <w:pPr>
               <w:pStyle w:val="ListBullet"/>
-              <w:spacing w:before="0" w:after="0"/>
+              <w:spacing w:before="20" w:after="20"/>
             </w:pPr>
             <w:r>
               <w:rPr>
                 <w:rFonts w:ascii="Calibri" w:hAnsi="Calibri" w:eastAsia="Calibri"/>
                 <w:b w:val="0"/>
-                <w:color w:val="4A4A4A"/>
-                <w:sz w:val="16"/>
+                <w:color w:val="444444"/>
+                <w:sz w:val="18"/>
               </w:rPr>
               <w:t>Worked on SaaS systems that sync store and channel data</w:t>
             </w:r>
@@ -460,27 +501,42 @@
           <w:p>
             <w:pPr>
               <w:pStyle w:val="ListBullet"/>
-              <w:spacing w:before="0" w:after="0"/>
+              <w:spacing w:before="20" w:after="20"/>
             </w:pPr>
             <w:r>
               <w:rPr>
                 <w:rFonts w:ascii="Calibri" w:hAnsi="Calibri" w:eastAsia="Calibri"/>
                 <w:b w:val="0"/>
-                <w:color w:val="4A4A4A"/>
-                <w:sz w:val="16"/>
+                <w:color w:val="444444"/>
+                <w:sz w:val="18"/>
               </w:rPr>
-              <w:t>Helped keep multi-channel product workflows consistent</w:t>
+              <w:t>Helped keep multi-channel product workflows consistent and up to date</w:t>
             </w:r>
           </w:p>
           <w:p>
             <w:pPr>
-              <w:spacing w:before="120" w:after="0"/>
+              <w:pStyle w:val="ListBullet"/>
+              <w:spacing w:before="20" w:after="20"/>
+            </w:pPr>
+            <w:r>
+              <w:rPr>
+                <w:rFonts w:ascii="Calibri" w:hAnsi="Calibri" w:eastAsia="Calibri"/>
+                <w:b w:val="0"/>
+                <w:color w:val="444444"/>
+                <w:sz w:val="18"/>
+              </w:rPr>
+              <w:t>Supported integration logic for catalog and listing synchronization</w:t>
+            </w:r>
+          </w:p>
+          <w:p>
+            <w:pPr>
+              <w:spacing w:before="180" w:after="0"/>
             </w:pPr>
             <w:r>
               <w:rPr>
                 <w:rFonts w:ascii="Calibri" w:hAnsi="Calibri" w:eastAsia="Calibri"/>
                 <w:b/>
-                <w:sz w:val="20"/>
+                <w:sz w:val="22"/>
               </w:rPr>
               <w:t>Client Website Delivery &amp; Workflow Automation</w:t>
             </w:r>
@@ -488,8 +544,8 @@
               <w:rPr>
                 <w:rFonts w:ascii="Calibri" w:hAnsi="Calibri" w:eastAsia="Calibri"/>
                 <w:b w:val="0"/>
-                <w:color w:val="4A4A4A"/>
-                <w:sz w:val="16"/>
+                <w:color w:val="444444"/>
+                <w:sz w:val="18"/>
               </w:rPr>
               <w:tab/>
               <w:t>Web · Automation</w:t>
@@ -497,13 +553,12 @@
           </w:p>
           <w:p>
             <w:pPr>
-              <w:spacing w:before="0" w:after="20"/>
+              <w:spacing w:before="20" w:after="40"/>
             </w:pPr>
             <w:r>
               <w:rPr>
                 <w:rFonts w:ascii="Calibri" w:hAnsi="Calibri" w:eastAsia="Calibri"/>
                 <w:b/>
-                <w:color w:val="1A1A1A"/>
                 <w:sz w:val="16"/>
               </w:rPr>
               <w:t>FRONTEND &amp; CHANNEL TOOLING</w:t>
@@ -512,31 +567,46 @@
           <w:p>
             <w:pPr>
               <w:pStyle w:val="ListBullet"/>
-              <w:spacing w:before="0" w:after="0"/>
+              <w:spacing w:before="20" w:after="20"/>
             </w:pPr>
             <w:r>
               <w:rPr>
                 <w:rFonts w:ascii="Calibri" w:hAnsi="Calibri" w:eastAsia="Calibri"/>
                 <w:b w:val="0"/>
-                <w:color w:val="4A4A4A"/>
-                <w:sz w:val="16"/>
+                <w:color w:val="444444"/>
+                <w:sz w:val="18"/>
               </w:rPr>
-              <w:t>Delivered client website/theme frontend work for online presentation</w:t>
+              <w:t>Delivered client website and theme frontend work for online presentation</w:t>
             </w:r>
           </w:p>
           <w:p>
             <w:pPr>
               <w:pStyle w:val="ListBullet"/>
-              <w:spacing w:before="0" w:after="0"/>
+              <w:spacing w:before="20" w:after="20"/>
             </w:pPr>
             <w:r>
               <w:rPr>
                 <w:rFonts w:ascii="Calibri" w:hAnsi="Calibri" w:eastAsia="Calibri"/>
                 <w:b w:val="0"/>
-                <w:color w:val="4A4A4A"/>
-                <w:sz w:val="16"/>
+                <w:color w:val="444444"/>
+                <w:sz w:val="18"/>
               </w:rPr>
               <w:t>Built cloud automation actors and channel workflow tools for publishing tasks</w:t>
+            </w:r>
+          </w:p>
+          <w:p>
+            <w:pPr>
+              <w:pStyle w:val="ListBullet"/>
+              <w:spacing w:before="20" w:after="20"/>
+            </w:pPr>
+            <w:r>
+              <w:rPr>
+                <w:rFonts w:ascii="Calibri" w:hAnsi="Calibri" w:eastAsia="Calibri"/>
+                <w:b w:val="0"/>
+                <w:color w:val="444444"/>
+                <w:sz w:val="18"/>
+              </w:rPr>
+              <w:t>Improved repeatable website and automation delivery for client needs</w:t>
             </w:r>
           </w:p>
         </w:tc>
@@ -545,17 +615,30 @@
             <w:tcW w:type="dxa" w:w="3672"/>
             <w:tcMar>
               <w:top w:w="0" w:type="dxa"/>
-              <w:left w:w="80" w:type="dxa"/>
+              <w:left w:w="90" w:type="dxa"/>
               <w:bottom w:w="0" w:type="dxa"/>
               <w:right w:w="0" w:type="dxa"/>
             </w:tcMar>
           </w:tcPr>
           <w:p>
             <w:pPr>
-              <w:spacing w:after="60"/>
+              <w:spacing w:after="100"/>
               <w:pBdr>
-                <w:bottom w:val="single" w:sz="10" w:space="1" w:color="1A1A1A"/>
+                <w:bottom w:val="single" w:sz="12" w:space="1" w:color="1A1A1A"/>
               </w:pBdr>
+            </w:pPr>
+            <w:r>
+              <w:rPr>
+                <w:rFonts w:ascii="Calibri" w:hAnsi="Calibri" w:eastAsia="Calibri"/>
+                <w:b/>
+                <w:sz w:val="22"/>
+              </w:rPr>
+              <w:t>EDUCATION</w:t>
+            </w:r>
+          </w:p>
+          <w:p>
+            <w:pPr>
+              <w:spacing w:before="160" w:after="0"/>
             </w:pPr>
             <w:r>
               <w:rPr>
@@ -563,39 +646,26 @@
                 <w:b/>
                 <w:sz w:val="20"/>
               </w:rPr>
-              <w:t>EDUCATION</w:t>
-            </w:r>
-          </w:p>
-          <w:p>
-            <w:pPr>
-              <w:spacing w:before="120" w:after="0"/>
-            </w:pPr>
-            <w:r>
-              <w:rPr>
-                <w:rFonts w:ascii="Calibri" w:hAnsi="Calibri" w:eastAsia="Calibri"/>
-                <w:b/>
-                <w:sz w:val="18"/>
-              </w:rPr>
               <w:t>Sir Syed University of Engineering and Technology</w:t>
             </w:r>
           </w:p>
           <w:p>
             <w:pPr>
-              <w:spacing w:before="0" w:after="0"/>
+              <w:spacing w:before="20" w:after="0"/>
             </w:pPr>
             <w:r>
               <w:rPr>
                 <w:rFonts w:ascii="Calibri" w:hAnsi="Calibri" w:eastAsia="Calibri"/>
                 <w:b w:val="0"/>
-                <w:color w:val="4A4A4A"/>
-                <w:sz w:val="16"/>
+                <w:color w:val="444444"/>
+                <w:sz w:val="18"/>
               </w:rPr>
               <w:t>2022 – 2026</w:t>
             </w:r>
           </w:p>
           <w:p>
             <w:pPr>
-              <w:spacing w:before="0" w:after="0"/>
+              <w:spacing w:before="20" w:after="0"/>
             </w:pPr>
             <w:r>
               <w:rPr>
@@ -608,48 +678,48 @@
           </w:p>
           <w:p>
             <w:pPr>
-              <w:spacing w:before="0"/>
+              <w:spacing w:before="20"/>
             </w:pPr>
             <w:r>
               <w:rPr>
                 <w:rFonts w:ascii="Calibri" w:hAnsi="Calibri" w:eastAsia="Calibri"/>
                 <w:b w:val="0"/>
-                <w:color w:val="4A4A4A"/>
-                <w:sz w:val="16"/>
+                <w:color w:val="444444"/>
+                <w:sz w:val="18"/>
               </w:rPr>
               <w:t>In progress</w:t>
             </w:r>
           </w:p>
           <w:p>
             <w:pPr>
-              <w:spacing w:before="120" w:after="0"/>
+              <w:spacing w:before="160" w:after="0"/>
             </w:pPr>
             <w:r>
               <w:rPr>
                 <w:rFonts w:ascii="Calibri" w:hAnsi="Calibri" w:eastAsia="Calibri"/>
                 <w:b/>
-                <w:sz w:val="18"/>
+                <w:sz w:val="20"/>
               </w:rPr>
               <w:t>Happy Place Group of Colleges</w:t>
             </w:r>
           </w:p>
           <w:p>
             <w:pPr>
-              <w:spacing w:before="0" w:after="0"/>
+              <w:spacing w:before="20" w:after="0"/>
             </w:pPr>
             <w:r>
               <w:rPr>
                 <w:rFonts w:ascii="Calibri" w:hAnsi="Calibri" w:eastAsia="Calibri"/>
                 <w:b w:val="0"/>
-                <w:color w:val="4A4A4A"/>
-                <w:sz w:val="16"/>
+                <w:color w:val="444444"/>
+                <w:sz w:val="18"/>
               </w:rPr>
               <w:t>2022</w:t>
             </w:r>
           </w:p>
           <w:p>
             <w:pPr>
-              <w:spacing w:before="0" w:after="0"/>
+              <w:spacing w:before="20" w:after="0"/>
             </w:pPr>
             <w:r>
               <w:rPr>
@@ -662,34 +732,34 @@
           </w:p>
           <w:p>
             <w:pPr>
-              <w:spacing w:before="120" w:after="0"/>
+              <w:spacing w:before="160" w:after="0"/>
             </w:pPr>
             <w:r>
               <w:rPr>
                 <w:rFonts w:ascii="Calibri" w:hAnsi="Calibri" w:eastAsia="Calibri"/>
                 <w:b/>
-                <w:sz w:val="18"/>
+                <w:sz w:val="20"/>
               </w:rPr>
               <w:t>Metropolitan Foundation School</w:t>
             </w:r>
           </w:p>
           <w:p>
             <w:pPr>
-              <w:spacing w:before="0" w:after="0"/>
+              <w:spacing w:before="20" w:after="0"/>
             </w:pPr>
             <w:r>
               <w:rPr>
                 <w:rFonts w:ascii="Calibri" w:hAnsi="Calibri" w:eastAsia="Calibri"/>
                 <w:b w:val="0"/>
-                <w:color w:val="4A4A4A"/>
-                <w:sz w:val="16"/>
+                <w:color w:val="444444"/>
+                <w:sz w:val="18"/>
               </w:rPr>
               <w:t>2019</w:t>
             </w:r>
           </w:p>
           <w:p>
             <w:pPr>
-              <w:spacing w:before="0" w:after="0"/>
+              <w:spacing w:before="20" w:after="0"/>
             </w:pPr>
             <w:r>
               <w:rPr>
@@ -702,172 +772,258 @@
           </w:p>
           <w:p>
             <w:pPr>
-              <w:spacing w:before="200" w:after="60"/>
+              <w:spacing w:before="240" w:after="100"/>
               <w:pBdr>
-                <w:bottom w:val="single" w:sz="10" w:space="1" w:color="1A1A1A"/>
+                <w:bottom w:val="single" w:sz="12" w:space="1" w:color="1A1A1A"/>
               </w:pBdr>
             </w:pPr>
             <w:r>
               <w:rPr>
                 <w:rFonts w:ascii="Calibri" w:hAnsi="Calibri" w:eastAsia="Calibri"/>
                 <w:b/>
-                <w:sz w:val="20"/>
+                <w:sz w:val="22"/>
               </w:rPr>
               <w:t>SKILLS</w:t>
             </w:r>
           </w:p>
           <w:p>
             <w:pPr>
-              <w:spacing w:before="20" w:after="20"/>
+              <w:spacing w:before="60" w:after="60"/>
             </w:pPr>
             <w:r>
               <w:rPr>
                 <w:rFonts w:ascii="Calibri" w:hAnsi="Calibri" w:eastAsia="Calibri"/>
                 <w:b w:val="0"/>
-                <w:color w:val="4A4A4A"/>
-                <w:sz w:val="18"/>
+                <w:color w:val="444444"/>
+                <w:sz w:val="20"/>
               </w:rPr>
               <w:t>HTML, CSS, JavaScript</w:t>
             </w:r>
           </w:p>
           <w:p>
             <w:pPr>
-              <w:spacing w:before="20" w:after="20"/>
+              <w:spacing w:before="60" w:after="60"/>
             </w:pPr>
             <w:r>
               <w:rPr>
                 <w:rFonts w:ascii="Calibri" w:hAnsi="Calibri" w:eastAsia="Calibri"/>
                 <w:b w:val="0"/>
-                <w:color w:val="4A4A4A"/>
-                <w:sz w:val="18"/>
+                <w:color w:val="444444"/>
+                <w:sz w:val="20"/>
               </w:rPr>
               <w:t>React &amp; Node.js</w:t>
             </w:r>
           </w:p>
           <w:p>
             <w:pPr>
-              <w:spacing w:before="20" w:after="20"/>
+              <w:spacing w:before="60" w:after="60"/>
             </w:pPr>
             <w:r>
               <w:rPr>
                 <w:rFonts w:ascii="Calibri" w:hAnsi="Calibri" w:eastAsia="Calibri"/>
                 <w:b w:val="0"/>
-                <w:color w:val="4A4A4A"/>
-                <w:sz w:val="18"/>
+                <w:color w:val="444444"/>
+                <w:sz w:val="20"/>
               </w:rPr>
               <w:t>Python</w:t>
             </w:r>
           </w:p>
           <w:p>
             <w:pPr>
-              <w:spacing w:before="20" w:after="20"/>
+              <w:spacing w:before="60" w:after="60"/>
             </w:pPr>
             <w:r>
               <w:rPr>
                 <w:rFonts w:ascii="Calibri" w:hAnsi="Calibri" w:eastAsia="Calibri"/>
                 <w:b w:val="0"/>
-                <w:color w:val="4A4A4A"/>
-                <w:sz w:val="18"/>
+                <w:color w:val="444444"/>
+                <w:sz w:val="20"/>
               </w:rPr>
               <w:t>REST APIs &amp; JSON</w:t>
             </w:r>
           </w:p>
           <w:p>
             <w:pPr>
-              <w:spacing w:before="20" w:after="20"/>
+              <w:spacing w:before="60" w:after="60"/>
             </w:pPr>
             <w:r>
               <w:rPr>
                 <w:rFonts w:ascii="Calibri" w:hAnsi="Calibri" w:eastAsia="Calibri"/>
                 <w:b w:val="0"/>
-                <w:color w:val="4A4A4A"/>
-                <w:sz w:val="18"/>
+                <w:color w:val="444444"/>
+                <w:sz w:val="20"/>
               </w:rPr>
               <w:t>Web Scraping</w:t>
             </w:r>
           </w:p>
           <w:p>
             <w:pPr>
-              <w:spacing w:before="20" w:after="20"/>
+              <w:spacing w:before="60" w:after="60"/>
             </w:pPr>
             <w:r>
               <w:rPr>
                 <w:rFonts w:ascii="Calibri" w:hAnsi="Calibri" w:eastAsia="Calibri"/>
                 <w:b w:val="0"/>
-                <w:color w:val="4A4A4A"/>
-                <w:sz w:val="18"/>
+                <w:color w:val="444444"/>
+                <w:sz w:val="20"/>
               </w:rPr>
               <w:t>Marketplace Automation</w:t>
             </w:r>
           </w:p>
           <w:p>
             <w:pPr>
-              <w:spacing w:before="20" w:after="20"/>
+              <w:spacing w:before="60" w:after="60"/>
             </w:pPr>
             <w:r>
               <w:rPr>
                 <w:rFonts w:ascii="Calibri" w:hAnsi="Calibri" w:eastAsia="Calibri"/>
                 <w:b w:val="0"/>
-                <w:color w:val="4A4A4A"/>
-                <w:sz w:val="18"/>
+                <w:color w:val="444444"/>
+                <w:sz w:val="20"/>
               </w:rPr>
               <w:t>SaaS / Store Sync</w:t>
             </w:r>
           </w:p>
           <w:p>
             <w:pPr>
-              <w:spacing w:before="20" w:after="20"/>
+              <w:spacing w:before="60" w:after="60"/>
             </w:pPr>
             <w:r>
               <w:rPr>
                 <w:rFonts w:ascii="Calibri" w:hAnsi="Calibri" w:eastAsia="Calibri"/>
                 <w:b w:val="0"/>
-                <w:color w:val="4A4A4A"/>
-                <w:sz w:val="18"/>
+                <w:color w:val="444444"/>
+                <w:sz w:val="20"/>
               </w:rPr>
               <w:t>Docker basics</w:t>
             </w:r>
           </w:p>
           <w:p>
             <w:pPr>
-              <w:spacing w:before="20" w:after="20"/>
+              <w:spacing w:before="60" w:after="60"/>
             </w:pPr>
             <w:r>
               <w:rPr>
                 <w:rFonts w:ascii="Calibri" w:hAnsi="Calibri" w:eastAsia="Calibri"/>
                 <w:b w:val="0"/>
-                <w:color w:val="4A4A4A"/>
-                <w:sz w:val="18"/>
+                <w:color w:val="444444"/>
+                <w:sz w:val="20"/>
               </w:rPr>
               <w:t>Git &amp; GitHub</w:t>
             </w:r>
           </w:p>
           <w:p>
             <w:pPr>
-              <w:spacing w:before="200" w:after="60"/>
+              <w:spacing w:before="240" w:after="100"/>
               <w:pBdr>
-                <w:bottom w:val="single" w:sz="10" w:space="1" w:color="1A1A1A"/>
+                <w:bottom w:val="single" w:sz="12" w:space="1" w:color="1A1A1A"/>
               </w:pBdr>
             </w:pPr>
             <w:r>
               <w:rPr>
                 <w:rFonts w:ascii="Calibri" w:hAnsi="Calibri" w:eastAsia="Calibri"/>
                 <w:b/>
+                <w:sz w:val="22"/>
+              </w:rPr>
+              <w:t>STRENGTHS</w:t>
+            </w:r>
+          </w:p>
+          <w:p>
+            <w:pPr>
+              <w:spacing w:before="60" w:after="60"/>
+            </w:pPr>
+            <w:r>
+              <w:rPr>
+                <w:rFonts w:ascii="Calibri" w:hAnsi="Calibri" w:eastAsia="Calibri"/>
+                <w:b w:val="0"/>
+                <w:color w:val="444444"/>
                 <w:sz w:val="20"/>
+              </w:rPr>
+              <w:t>Full-stack feature delivery</w:t>
+            </w:r>
+          </w:p>
+          <w:p>
+            <w:pPr>
+              <w:spacing w:before="60" w:after="60"/>
+            </w:pPr>
+            <w:r>
+              <w:rPr>
+                <w:rFonts w:ascii="Calibri" w:hAnsi="Calibri" w:eastAsia="Calibri"/>
+                <w:b w:val="0"/>
+                <w:color w:val="444444"/>
+                <w:sz w:val="20"/>
+              </w:rPr>
+              <w:t>Automation-first problem solving</w:t>
+            </w:r>
+          </w:p>
+          <w:p>
+            <w:pPr>
+              <w:spacing w:before="60" w:after="60"/>
+            </w:pPr>
+            <w:r>
+              <w:rPr>
+                <w:rFonts w:ascii="Calibri" w:hAnsi="Calibri" w:eastAsia="Calibri"/>
+                <w:b w:val="0"/>
+                <w:color w:val="444444"/>
+                <w:sz w:val="20"/>
+              </w:rPr>
+              <w:t>API integration &amp; data pipelines</w:t>
+            </w:r>
+          </w:p>
+          <w:p>
+            <w:pPr>
+              <w:spacing w:before="60" w:after="60"/>
+            </w:pPr>
+            <w:r>
+              <w:rPr>
+                <w:rFonts w:ascii="Calibri" w:hAnsi="Calibri" w:eastAsia="Calibri"/>
+                <w:b w:val="0"/>
+                <w:color w:val="444444"/>
+                <w:sz w:val="20"/>
+              </w:rPr>
+              <w:t>Clean UI for operational tools</w:t>
+            </w:r>
+          </w:p>
+          <w:p>
+            <w:pPr>
+              <w:spacing w:before="60" w:after="60"/>
+            </w:pPr>
+            <w:r>
+              <w:rPr>
+                <w:rFonts w:ascii="Calibri" w:hAnsi="Calibri" w:eastAsia="Calibri"/>
+                <w:b w:val="0"/>
+                <w:color w:val="444444"/>
+                <w:sz w:val="20"/>
+              </w:rPr>
+              <w:t>Fast iteration and debugging</w:t>
+            </w:r>
+          </w:p>
+          <w:p>
+            <w:pPr>
+              <w:spacing w:before="240" w:after="100"/>
+              <w:pBdr>
+                <w:bottom w:val="single" w:sz="12" w:space="1" w:color="1A1A1A"/>
+              </w:pBdr>
+            </w:pPr>
+            <w:r>
+              <w:rPr>
+                <w:rFonts w:ascii="Calibri" w:hAnsi="Calibri" w:eastAsia="Calibri"/>
+                <w:b/>
+                <w:sz w:val="22"/>
               </w:rPr>
               <w:t>LINKS</w:t>
             </w:r>
           </w:p>
           <w:p>
             <w:pPr>
-              <w:spacing w:before="40"/>
+              <w:spacing w:before="80"/>
             </w:pPr>
             <w:hyperlink r:id="rId11">
               <w:r>
                 <w:rPr>
                   <w:color w:val="1A1A1A"/>
                   <w:u w:val="single"/>
-                  <w:sz w:val="18"/>
+                  <w:sz w:val="20"/>
                   <w:b/>
                   <w:rFonts w:ascii="Calibri" w:hAnsi="Calibri"/>
                 </w:rPr>
@@ -876,12 +1032,15 @@
             </w:hyperlink>
           </w:p>
           <w:p>
+            <w:pPr>
+              <w:spacing w:before="80"/>
+            </w:pPr>
             <w:hyperlink r:id="rId10">
               <w:r>
                 <w:rPr>
                   <w:color w:val="1A1A1A"/>
                   <w:u w:val="single"/>
-                  <w:sz w:val="18"/>
+                  <w:sz w:val="20"/>
                   <w:rFonts w:ascii="Calibri" w:hAnsi="Calibri"/>
                 </w:rPr>
                 <w:t>GitHub</w:t>
@@ -889,12 +1048,15 @@
             </w:hyperlink>
           </w:p>
           <w:p>
+            <w:pPr>
+              <w:spacing w:before="80"/>
+            </w:pPr>
             <w:hyperlink r:id="rId9">
               <w:r>
                 <w:rPr>
                   <w:color w:val="1A1A1A"/>
                   <w:u w:val="single"/>
-                  <w:sz w:val="18"/>
+                  <w:sz w:val="20"/>
                   <w:rFonts w:ascii="Calibri" w:hAnsi="Calibri"/>
                 </w:rPr>
                 <w:t>LinkedIn</w:t>
@@ -906,7 +1068,7 @@
     </w:tbl>
     <w:sectPr>
       <w:pgSz w:w="11909" w:h="16834"/>
-      <w:pgMar w:top="792" w:right="936" w:bottom="720" w:left="936" w:header="720" w:footer="720" w:gutter="0"/>
+      <w:pgMar w:top="720" w:right="864" w:bottom="648" w:left="864" w:header="720" w:footer="720" w:gutter="0"/>
       <w:cols w:space="720"/>
       <w:docGrid w:linePitch="360"/>
     </w:sectPr>

</xml_diff>

<commit_message>
Add sixth project so the one-page CV columns fill and align evenly.
Co-authored-by: Cursor <cursoragent@cursor.com>
</commit_message>
<xml_diff>
--- a/Nauroz_Salim_CV.docx
+++ b/Nauroz_Salim_CV.docx
@@ -4,7 +4,7 @@
   <w:body>
     <w:p>
       <w:pPr>
-        <w:spacing w:after="80"/>
+        <w:spacing w:after="60"/>
         <w:jc w:val="center"/>
       </w:pPr>
       <w:r>
@@ -19,7 +19,7 @@
     </w:p>
     <w:p>
       <w:pPr>
-        <w:spacing w:before="40" w:after="80"/>
+        <w:spacing w:before="20" w:after="60"/>
         <w:jc w:val="center"/>
       </w:pPr>
       <w:r>
@@ -27,14 +27,14 @@
           <w:rFonts w:ascii="Georgia" w:hAnsi="Georgia" w:eastAsia="Georgia"/>
           <w:b/>
           <w:color w:val="1A1A1A"/>
-          <w:sz w:val="52"/>
+          <w:sz w:val="48"/>
         </w:rPr>
         <w:t>NAUROZ SALIM</w:t>
       </w:r>
     </w:p>
     <w:p>
       <w:pPr>
-        <w:spacing w:before="40" w:after="200"/>
+        <w:spacing w:before="20" w:after="160"/>
         <w:jc w:val="center"/>
         <w:pBdr>
           <w:bottom w:val="single" w:sz="10" w:space="1" w:color="CFCFCF"/>
@@ -95,7 +95,7 @@
     </w:p>
     <w:p>
       <w:pPr>
-        <w:spacing w:before="160" w:after="80"/>
+        <w:spacing w:before="120" w:after="60"/>
         <w:pBdr>
           <w:bottom w:val="single" w:sz="12" w:space="1" w:color="1A1A1A"/>
         </w:pBdr>
@@ -111,7 +111,7 @@
     </w:p>
     <w:p>
       <w:pPr>
-        <w:spacing w:after="160"/>
+        <w:spacing w:after="120"/>
       </w:pPr>
       <w:r>
         <w:rPr>
@@ -129,8 +129,8 @@
         <w:tblLook w:firstColumn="1" w:firstRow="1" w:lastColumn="0" w:lastRow="0" w:noHBand="0" w:noVBand="1" w:val="04A0"/>
       </w:tblPr>
       <w:tblGrid>
-        <w:gridCol w:w="5090"/>
-        <w:gridCol w:w="5090"/>
+        <w:gridCol w:w="5119"/>
+        <w:gridCol w:w="5119"/>
       </w:tblGrid>
       <w:tr>
         <w:tc>
@@ -145,7 +145,7 @@
           </w:tcPr>
           <w:p>
             <w:pPr>
-              <w:spacing w:after="100"/>
+              <w:spacing w:after="80"/>
               <w:pBdr>
                 <w:bottom w:val="single" w:sz="12" w:space="1" w:color="1A1A1A"/>
               </w:pBdr>
@@ -161,13 +161,13 @@
           </w:p>
           <w:p>
             <w:pPr>
-              <w:spacing w:before="180" w:after="0"/>
+              <w:spacing w:before="140" w:after="0"/>
             </w:pPr>
             <w:r>
               <w:rPr>
                 <w:rFonts w:ascii="Calibri" w:hAnsi="Calibri" w:eastAsia="Calibri"/>
                 <w:b/>
-                <w:sz w:val="22"/>
+                <w:sz w:val="20"/>
               </w:rPr>
               <w:t>AI Operations Logging Platform</w:t>
             </w:r>
@@ -176,7 +176,7 @@
                 <w:rFonts w:ascii="Calibri" w:hAnsi="Calibri" w:eastAsia="Calibri"/>
                 <w:b w:val="0"/>
                 <w:color w:val="444444"/>
-                <w:sz w:val="18"/>
+                <w:sz w:val="16"/>
               </w:rPr>
               <w:tab/>
               <w:t>Final Year Project</w:t>
@@ -184,7 +184,7 @@
           </w:p>
           <w:p>
             <w:pPr>
-              <w:spacing w:before="20" w:after="40"/>
+              <w:spacing w:before="20" w:after="20"/>
             </w:pPr>
             <w:r>
               <w:rPr>
@@ -198,7 +198,7 @@
           <w:p>
             <w:pPr>
               <w:pStyle w:val="ListBullet"/>
-              <w:spacing w:before="20" w:after="20"/>
+              <w:spacing w:before="0" w:after="20"/>
             </w:pPr>
             <w:r>
               <w:rPr>
@@ -213,7 +213,7 @@
           <w:p>
             <w:pPr>
               <w:pStyle w:val="ListBullet"/>
-              <w:spacing w:before="20" w:after="20"/>
+              <w:spacing w:before="0" w:after="20"/>
             </w:pPr>
             <w:r>
               <w:rPr>
@@ -228,7 +228,7 @@
           <w:p>
             <w:pPr>
               <w:pStyle w:val="ListBullet"/>
-              <w:spacing w:before="20" w:after="20"/>
+              <w:spacing w:before="0" w:after="20"/>
             </w:pPr>
             <w:r>
               <w:rPr>
@@ -243,7 +243,7 @@
           <w:p>
             <w:pPr>
               <w:pStyle w:val="ListBullet"/>
-              <w:spacing w:before="20" w:after="20"/>
+              <w:spacing w:before="0" w:after="20"/>
             </w:pPr>
             <w:r>
               <w:rPr>
@@ -257,13 +257,13 @@
           </w:p>
           <w:p>
             <w:pPr>
-              <w:spacing w:before="180" w:after="0"/>
+              <w:spacing w:before="140" w:after="0"/>
             </w:pPr>
             <w:r>
               <w:rPr>
                 <w:rFonts w:ascii="Calibri" w:hAnsi="Calibri" w:eastAsia="Calibri"/>
                 <w:b/>
-                <w:sz w:val="22"/>
+                <w:sz w:val="20"/>
               </w:rPr>
               <w:t>Marketplace Storefront &amp; Listing Automation</w:t>
             </w:r>
@@ -272,7 +272,7 @@
                 <w:rFonts w:ascii="Calibri" w:hAnsi="Calibri" w:eastAsia="Calibri"/>
                 <w:b w:val="0"/>
                 <w:color w:val="444444"/>
-                <w:sz w:val="18"/>
+                <w:sz w:val="16"/>
               </w:rPr>
               <w:tab/>
               <w:t>Full-Stack · Automation</w:t>
@@ -280,7 +280,7 @@
           </w:p>
           <w:p>
             <w:pPr>
-              <w:spacing w:before="20" w:after="40"/>
+              <w:spacing w:before="20" w:after="20"/>
             </w:pPr>
             <w:r>
               <w:rPr>
@@ -294,7 +294,7 @@
           <w:p>
             <w:pPr>
               <w:pStyle w:val="ListBullet"/>
-              <w:spacing w:before="20" w:after="20"/>
+              <w:spacing w:before="0" w:after="20"/>
             </w:pPr>
             <w:r>
               <w:rPr>
@@ -309,7 +309,7 @@
           <w:p>
             <w:pPr>
               <w:pStyle w:val="ListBullet"/>
-              <w:spacing w:before="20" w:after="20"/>
+              <w:spacing w:before="0" w:after="20"/>
             </w:pPr>
             <w:r>
               <w:rPr>
@@ -324,7 +324,7 @@
           <w:p>
             <w:pPr>
               <w:pStyle w:val="ListBullet"/>
-              <w:spacing w:before="20" w:after="20"/>
+              <w:spacing w:before="0" w:after="20"/>
             </w:pPr>
             <w:r>
               <w:rPr>
@@ -339,7 +339,7 @@
           <w:p>
             <w:pPr>
               <w:pStyle w:val="ListBullet"/>
-              <w:spacing w:before="20" w:after="20"/>
+              <w:spacing w:before="0" w:after="20"/>
             </w:pPr>
             <w:r>
               <w:rPr>
@@ -353,13 +353,13 @@
           </w:p>
           <w:p>
             <w:pPr>
-              <w:spacing w:before="180" w:after="0"/>
+              <w:spacing w:before="140" w:after="0"/>
             </w:pPr>
             <w:r>
               <w:rPr>
                 <w:rFonts w:ascii="Calibri" w:hAnsi="Calibri" w:eastAsia="Calibri"/>
                 <w:b/>
-                <w:sz w:val="22"/>
+                <w:sz w:val="20"/>
               </w:rPr>
               <w:t>Multi-Channel Scraping &amp; Listing Pipelines</w:t>
             </w:r>
@@ -368,7 +368,7 @@
                 <w:rFonts w:ascii="Calibri" w:hAnsi="Calibri" w:eastAsia="Calibri"/>
                 <w:b w:val="0"/>
                 <w:color w:val="444444"/>
-                <w:sz w:val="18"/>
+                <w:sz w:val="16"/>
               </w:rPr>
               <w:tab/>
               <w:t>Python / JS · Data Pipelines</w:t>
@@ -376,7 +376,7 @@
           </w:p>
           <w:p>
             <w:pPr>
-              <w:spacing w:before="20" w:after="40"/>
+              <w:spacing w:before="20" w:after="20"/>
             </w:pPr>
             <w:r>
               <w:rPr>
@@ -390,7 +390,7 @@
           <w:p>
             <w:pPr>
               <w:pStyle w:val="ListBullet"/>
-              <w:spacing w:before="20" w:after="20"/>
+              <w:spacing w:before="0" w:after="20"/>
             </w:pPr>
             <w:r>
               <w:rPr>
@@ -405,7 +405,7 @@
           <w:p>
             <w:pPr>
               <w:pStyle w:val="ListBullet"/>
-              <w:spacing w:before="20" w:after="20"/>
+              <w:spacing w:before="0" w:after="20"/>
             </w:pPr>
             <w:r>
               <w:rPr>
@@ -420,7 +420,7 @@
           <w:p>
             <w:pPr>
               <w:pStyle w:val="ListBullet"/>
-              <w:spacing w:before="20" w:after="20"/>
+              <w:spacing w:before="0" w:after="20"/>
             </w:pPr>
             <w:r>
               <w:rPr>
@@ -435,7 +435,7 @@
           <w:p>
             <w:pPr>
               <w:pStyle w:val="ListBullet"/>
-              <w:spacing w:before="20" w:after="20"/>
+              <w:spacing w:before="0" w:after="20"/>
             </w:pPr>
             <w:r>
               <w:rPr>
@@ -449,13 +449,13 @@
           </w:p>
           <w:p>
             <w:pPr>
-              <w:spacing w:before="180" w:after="0"/>
+              <w:spacing w:before="140" w:after="0"/>
             </w:pPr>
             <w:r>
               <w:rPr>
                 <w:rFonts w:ascii="Calibri" w:hAnsi="Calibri" w:eastAsia="Calibri"/>
                 <w:b/>
-                <w:sz w:val="22"/>
+                <w:sz w:val="20"/>
               </w:rPr>
               <w:t>SaaS Multi-Channel Store Sync</w:t>
             </w:r>
@@ -464,7 +464,7 @@
                 <w:rFonts w:ascii="Calibri" w:hAnsi="Calibri" w:eastAsia="Calibri"/>
                 <w:b w:val="0"/>
                 <w:color w:val="444444"/>
-                <w:sz w:val="18"/>
+                <w:sz w:val="16"/>
               </w:rPr>
               <w:tab/>
               <w:t>SaaS · Integrations</w:t>
@@ -472,7 +472,7 @@
           </w:p>
           <w:p>
             <w:pPr>
-              <w:spacing w:before="20" w:after="40"/>
+              <w:spacing w:before="20" w:after="20"/>
             </w:pPr>
             <w:r>
               <w:rPr>
@@ -486,7 +486,7 @@
           <w:p>
             <w:pPr>
               <w:pStyle w:val="ListBullet"/>
-              <w:spacing w:before="20" w:after="20"/>
+              <w:spacing w:before="0" w:after="20"/>
             </w:pPr>
             <w:r>
               <w:rPr>
@@ -501,7 +501,7 @@
           <w:p>
             <w:pPr>
               <w:pStyle w:val="ListBullet"/>
-              <w:spacing w:before="20" w:after="20"/>
+              <w:spacing w:before="0" w:after="20"/>
             </w:pPr>
             <w:r>
               <w:rPr>
@@ -516,7 +516,7 @@
           <w:p>
             <w:pPr>
               <w:pStyle w:val="ListBullet"/>
-              <w:spacing w:before="20" w:after="20"/>
+              <w:spacing w:before="0" w:after="20"/>
             </w:pPr>
             <w:r>
               <w:rPr>
@@ -530,13 +530,13 @@
           </w:p>
           <w:p>
             <w:pPr>
-              <w:spacing w:before="180" w:after="0"/>
+              <w:spacing w:before="140" w:after="0"/>
             </w:pPr>
             <w:r>
               <w:rPr>
                 <w:rFonts w:ascii="Calibri" w:hAnsi="Calibri" w:eastAsia="Calibri"/>
                 <w:b/>
-                <w:sz w:val="22"/>
+                <w:sz w:val="20"/>
               </w:rPr>
               <w:t>Client Website Delivery &amp; Workflow Automation</w:t>
             </w:r>
@@ -545,7 +545,7 @@
                 <w:rFonts w:ascii="Calibri" w:hAnsi="Calibri" w:eastAsia="Calibri"/>
                 <w:b w:val="0"/>
                 <w:color w:val="444444"/>
-                <w:sz w:val="18"/>
+                <w:sz w:val="16"/>
               </w:rPr>
               <w:tab/>
               <w:t>Web · Automation</w:t>
@@ -553,7 +553,7 @@
           </w:p>
           <w:p>
             <w:pPr>
-              <w:spacing w:before="20" w:after="40"/>
+              <w:spacing w:before="20" w:after="20"/>
             </w:pPr>
             <w:r>
               <w:rPr>
@@ -567,7 +567,7 @@
           <w:p>
             <w:pPr>
               <w:pStyle w:val="ListBullet"/>
-              <w:spacing w:before="20" w:after="20"/>
+              <w:spacing w:before="0" w:after="20"/>
             </w:pPr>
             <w:r>
               <w:rPr>
@@ -582,7 +582,7 @@
           <w:p>
             <w:pPr>
               <w:pStyle w:val="ListBullet"/>
-              <w:spacing w:before="20" w:after="20"/>
+              <w:spacing w:before="0" w:after="20"/>
             </w:pPr>
             <w:r>
               <w:rPr>
@@ -597,7 +597,7 @@
           <w:p>
             <w:pPr>
               <w:pStyle w:val="ListBullet"/>
-              <w:spacing w:before="20" w:after="20"/>
+              <w:spacing w:before="0" w:after="20"/>
             </w:pPr>
             <w:r>
               <w:rPr>
@@ -607,6 +607,87 @@
                 <w:sz w:val="18"/>
               </w:rPr>
               <w:t>Improved repeatable website and automation delivery for client needs</w:t>
+            </w:r>
+          </w:p>
+          <w:p>
+            <w:pPr>
+              <w:spacing w:before="140" w:after="0"/>
+            </w:pPr>
+            <w:r>
+              <w:rPr>
+                <w:rFonts w:ascii="Calibri" w:hAnsi="Calibri" w:eastAsia="Calibri"/>
+                <w:b/>
+                <w:sz w:val="20"/>
+              </w:rPr>
+              <w:t>Bulk Product Content &amp; Image Processing Tools</w:t>
+            </w:r>
+            <w:r>
+              <w:rPr>
+                <w:rFonts w:ascii="Calibri" w:hAnsi="Calibri" w:eastAsia="Calibri"/>
+                <w:b w:val="0"/>
+                <w:color w:val="444444"/>
+                <w:sz w:val="16"/>
+              </w:rPr>
+              <w:tab/>
+              <w:t>Python / JS · Utilities</w:t>
+            </w:r>
+          </w:p>
+          <w:p>
+            <w:pPr>
+              <w:spacing w:before="20" w:after="20"/>
+            </w:pPr>
+            <w:r>
+              <w:rPr>
+                <w:rFonts w:ascii="Calibri" w:hAnsi="Calibri" w:eastAsia="Calibri"/>
+                <w:b/>
+                <w:sz w:val="16"/>
+              </w:rPr>
+              <w:t>CONTENT FORMATTING &amp; MEDIA PREP</w:t>
+            </w:r>
+          </w:p>
+          <w:p>
+            <w:pPr>
+              <w:pStyle w:val="ListBullet"/>
+              <w:spacing w:before="0" w:after="20"/>
+            </w:pPr>
+            <w:r>
+              <w:rPr>
+                <w:rFonts w:ascii="Calibri" w:hAnsi="Calibri" w:eastAsia="Calibri"/>
+                <w:b w:val="0"/>
+                <w:color w:val="444444"/>
+                <w:sz w:val="18"/>
+              </w:rPr>
+              <w:t>Built tools to clean, format, and standardize product titles and descriptions</w:t>
+            </w:r>
+          </w:p>
+          <w:p>
+            <w:pPr>
+              <w:pStyle w:val="ListBullet"/>
+              <w:spacing w:before="0" w:after="20"/>
+            </w:pPr>
+            <w:r>
+              <w:rPr>
+                <w:rFonts w:ascii="Calibri" w:hAnsi="Calibri" w:eastAsia="Calibri"/>
+                <w:b w:val="0"/>
+                <w:color w:val="444444"/>
+                <w:sz w:val="18"/>
+              </w:rPr>
+              <w:t>Created image download and conversion helpers for listing-ready media packs</w:t>
+            </w:r>
+          </w:p>
+          <w:p>
+            <w:pPr>
+              <w:pStyle w:val="ListBullet"/>
+              <w:spacing w:before="0" w:after="20"/>
+            </w:pPr>
+            <w:r>
+              <w:rPr>
+                <w:rFonts w:ascii="Calibri" w:hAnsi="Calibri" w:eastAsia="Calibri"/>
+                <w:b w:val="0"/>
+                <w:color w:val="444444"/>
+                <w:sz w:val="18"/>
+              </w:rPr>
+              <w:t>Reduced repetitive catalog prep work through reusable batch processing scripts</w:t>
             </w:r>
           </w:p>
         </w:tc>
@@ -622,7 +703,7 @@
           </w:tcPr>
           <w:p>
             <w:pPr>
-              <w:spacing w:after="100"/>
+              <w:spacing w:after="80"/>
               <w:pBdr>
                 <w:bottom w:val="single" w:sz="12" w:space="1" w:color="1A1A1A"/>
               </w:pBdr>
@@ -638,7 +719,7 @@
           </w:p>
           <w:p>
             <w:pPr>
-              <w:spacing w:before="160" w:after="0"/>
+              <w:spacing w:before="140" w:after="0"/>
             </w:pPr>
             <w:r>
               <w:rPr>
@@ -692,7 +773,7 @@
           </w:p>
           <w:p>
             <w:pPr>
-              <w:spacing w:before="160" w:after="0"/>
+              <w:spacing w:before="140" w:after="0"/>
             </w:pPr>
             <w:r>
               <w:rPr>
@@ -732,7 +813,7 @@
           </w:p>
           <w:p>
             <w:pPr>
-              <w:spacing w:before="160" w:after="0"/>
+              <w:spacing w:before="140" w:after="0"/>
             </w:pPr>
             <w:r>
               <w:rPr>
@@ -772,7 +853,7 @@
           </w:p>
           <w:p>
             <w:pPr>
-              <w:spacing w:before="240" w:after="100"/>
+              <w:spacing w:before="200" w:after="80"/>
               <w:pBdr>
                 <w:bottom w:val="single" w:sz="12" w:space="1" w:color="1A1A1A"/>
               </w:pBdr>
@@ -914,7 +995,7 @@
           </w:p>
           <w:p>
             <w:pPr>
-              <w:spacing w:before="240" w:after="100"/>
+              <w:spacing w:before="200" w:after="80"/>
               <w:pBdr>
                 <w:bottom w:val="single" w:sz="12" w:space="1" w:color="1A1A1A"/>
               </w:pBdr>
@@ -1000,7 +1081,7 @@
           </w:p>
           <w:p>
             <w:pPr>
-              <w:spacing w:before="240" w:after="100"/>
+              <w:spacing w:before="200" w:after="80"/>
               <w:pBdr>
                 <w:bottom w:val="single" w:sz="12" w:space="1" w:color="1A1A1A"/>
               </w:pBdr>
@@ -1068,7 +1149,7 @@
     </w:tbl>
     <w:sectPr>
       <w:pgSz w:w="11909" w:h="16834"/>
-      <w:pgMar w:top="720" w:right="864" w:bottom="648" w:left="864" w:header="720" w:footer="720" w:gutter="0"/>
+      <w:pgMar w:top="691" w:right="835" w:bottom="605" w:left="835" w:header="720" w:footer="720" w:gutter="0"/>
       <w:cols w:space="720"/>
       <w:docGrid w:linePitch="360"/>
     </w:sectPr>

</xml_diff>